<commit_message>
Revise executive summary layout and content clarity
</commit_message>
<xml_diff>
--- a/2026-06-14_Oristar_Vietnam_Sales_Analysis_SUMMARY.docx
+++ b/2026-06-14_Oristar_Vietnam_Sales_Analysis_SUMMARY.docx
@@ -30,7 +30,7 @@
           <w:sz w:val="20"/>
           <w:szCs w:val="20"/>
         </w:rPr>
-        <w:t xml:space="preserve">2026-06-14~16 방문 | 데이터 기준: 2020~2026 H1 | DSR 대리점: ORISTAR</w:t>
+        <w:t xml:space="preserve">방문: 2026-06-14~16  |  데이터: 2020~2026 H1  |  대리점: ORISTAR (하노이)</w:t>
       </w:r>
     </w:p>
     <w:p>
@@ -48,7 +48,7 @@
           <w:sz w:val="22"/>
           <w:szCs w:val="22"/>
         </w:rPr>
-        <w:t xml:space="preserve">1. 매출 현황 (ORISTAR향 DSR 납품)</w:t>
+        <w:t xml:space="preserve">1. 매출 현황 — ORISTAR향 DSR 납품 (단위: 톤)</w:t>
       </w:r>
     </w:p>
     <w:tbl>
@@ -64,16 +64,16 @@
         </w:tblBorders>
       </w:tblPr>
       <w:tblGrid>
-        <w:gridCol w:w="1600"/>
-        <w:gridCol w:w="1600"/>
-        <w:gridCol w:w="1600"/>
-        <w:gridCol w:w="1600"/>
-        <w:gridCol w:w="2960"/>
+        <w:gridCol w:w="1560"/>
+        <w:gridCol w:w="1560"/>
+        <w:gridCol w:w="1560"/>
+        <w:gridCol w:w="1560"/>
+        <w:gridCol w:w="3120"/>
       </w:tblGrid>
       <w:tr>
         <w:tc>
           <w:tcPr>
-            <w:tcW w:type="dxa" w:w="1600"/>
+            <w:tcW w:type="dxa" w:w="1560"/>
             <w:tcBorders>
               <w:top w:val="single" w:color="AAAAAA" w:sz="1"/>
               <w:left w:val="single" w:color="AAAAAA" w:sz="1"/>
@@ -103,7 +103,7 @@
         </w:tc>
         <w:tc>
           <w:tcPr>
-            <w:tcW w:type="dxa" w:w="1600"/>
+            <w:tcW w:type="dxa" w:w="1560"/>
             <w:tcBorders>
               <w:top w:val="single" w:color="AAAAAA" w:sz="1"/>
               <w:left w:val="single" w:color="AAAAAA" w:sz="1"/>
@@ -133,7 +133,7 @@
         </w:tc>
         <w:tc>
           <w:tcPr>
-            <w:tcW w:type="dxa" w:w="1600"/>
+            <w:tcW w:type="dxa" w:w="1560"/>
             <w:tcBorders>
               <w:top w:val="single" w:color="AAAAAA" w:sz="1"/>
               <w:left w:val="single" w:color="AAAAAA" w:sz="1"/>
@@ -163,7 +163,7 @@
         </w:tc>
         <w:tc>
           <w:tcPr>
-            <w:tcW w:type="dxa" w:w="1600"/>
+            <w:tcW w:type="dxa" w:w="1560"/>
             <w:tcBorders>
               <w:top w:val="single" w:color="AAAAAA" w:sz="1"/>
               <w:left w:val="single" w:color="AAAAAA" w:sz="1"/>
@@ -193,7 +193,7 @@
         </w:tc>
         <w:tc>
           <w:tcPr>
-            <w:tcW w:type="dxa" w:w="2960"/>
+            <w:tcW w:type="dxa" w:w="3120"/>
             <w:tcBorders>
               <w:top w:val="single" w:color="AAAAAA" w:sz="1"/>
               <w:left w:val="single" w:color="AAAAAA" w:sz="1"/>
@@ -217,7 +217,7 @@
                 <w:sz w:val="18"/>
                 <w:szCs w:val="18"/>
               </w:rPr>
-              <w:t xml:space="preserve">2026 H1 (연환산)</w:t>
+              <w:t xml:space="preserve">2026 H1 → 연환산</w:t>
             </w:r>
           </w:p>
         </w:tc>
@@ -225,7 +225,7 @@
       <w:tr>
         <w:tc>
           <w:tcPr>
-            <w:tcW w:type="dxa" w:w="1600"/>
+            <w:tcW w:type="dxa" w:w="1560"/>
             <w:tcBorders>
               <w:top w:val="single" w:color="AAAAAA" w:sz="1"/>
               <w:left w:val="single" w:color="AAAAAA" w:sz="1"/>
@@ -247,115 +247,115 @@
                 <w:sz w:val="18"/>
                 <w:szCs w:val="18"/>
               </w:rPr>
-              <w:t xml:space="preserve">307톤</w:t>
-            </w:r>
-          </w:p>
-        </w:tc>
-        <w:tc>
-          <w:tcPr>
-            <w:tcW w:type="dxa" w:w="1600"/>
-            <w:tcBorders>
-              <w:top w:val="single" w:color="AAAAAA" w:sz="1"/>
-              <w:left w:val="single" w:color="AAAAAA" w:sz="1"/>
-              <w:bottom w:val="single" w:color="AAAAAA" w:sz="1"/>
-              <w:right w:val="single" w:color="AAAAAA" w:sz="1"/>
-            </w:tcBorders>
-            <w:tcMar>
-              <w:top w:type="dxa" w:w="60"/>
-              <w:left w:type="dxa" w:w="100"/>
-              <w:bottom w:type="dxa" w:w="60"/>
-              <w:right w:type="dxa" w:w="100"/>
-            </w:tcMar>
-          </w:tcPr>
-          <w:p>
-            <w:r>
-              <w:rPr>
-                <w:rFonts w:ascii="맑은 고딕" w:cs="맑은 고딕" w:eastAsia="맑은 고딕" w:hAnsi="맑은 고딕"/>
-                <w:sz w:val="18"/>
-                <w:szCs w:val="18"/>
-              </w:rPr>
-              <w:t xml:space="preserve">282톤</w:t>
-            </w:r>
-          </w:p>
-        </w:tc>
-        <w:tc>
-          <w:tcPr>
-            <w:tcW w:type="dxa" w:w="1600"/>
-            <w:tcBorders>
-              <w:top w:val="single" w:color="AAAAAA" w:sz="1"/>
-              <w:left w:val="single" w:color="AAAAAA" w:sz="1"/>
-              <w:bottom w:val="single" w:color="AAAAAA" w:sz="1"/>
-              <w:right w:val="single" w:color="AAAAAA" w:sz="1"/>
-            </w:tcBorders>
-            <w:tcMar>
-              <w:top w:type="dxa" w:w="60"/>
-              <w:left w:type="dxa" w:w="100"/>
-              <w:bottom w:type="dxa" w:w="60"/>
-              <w:right w:type="dxa" w:w="100"/>
-            </w:tcMar>
-          </w:tcPr>
-          <w:p>
-            <w:r>
-              <w:rPr>
-                <w:rFonts w:ascii="맑은 고딕" w:cs="맑은 고딕" w:eastAsia="맑은 고딕" w:hAnsi="맑은 고딕"/>
-                <w:sz w:val="18"/>
-                <w:szCs w:val="18"/>
-              </w:rPr>
-              <w:t xml:space="preserve">351톤</w:t>
-            </w:r>
-          </w:p>
-        </w:tc>
-        <w:tc>
-          <w:tcPr>
-            <w:tcW w:type="dxa" w:w="1600"/>
-            <w:tcBorders>
-              <w:top w:val="single" w:color="AAAAAA" w:sz="1"/>
-              <w:left w:val="single" w:color="AAAAAA" w:sz="1"/>
-              <w:bottom w:val="single" w:color="AAAAAA" w:sz="1"/>
-              <w:right w:val="single" w:color="AAAAAA" w:sz="1"/>
-            </w:tcBorders>
-            <w:tcMar>
-              <w:top w:type="dxa" w:w="60"/>
-              <w:left w:type="dxa" w:w="100"/>
-              <w:bottom w:type="dxa" w:w="60"/>
-              <w:right w:type="dxa" w:w="100"/>
-            </w:tcMar>
-          </w:tcPr>
-          <w:p>
-            <w:r>
-              <w:rPr>
-                <w:rFonts w:ascii="맑은 고딕" w:cs="맑은 고딕" w:eastAsia="맑은 고딕" w:hAnsi="맑은 고딕"/>
-                <w:sz w:val="18"/>
-                <w:szCs w:val="18"/>
-              </w:rPr>
-              <w:t xml:space="preserve">443톤</w:t>
-            </w:r>
-          </w:p>
-        </w:tc>
-        <w:tc>
-          <w:tcPr>
-            <w:tcW w:type="dxa" w:w="2960"/>
-            <w:tcBorders>
-              <w:top w:val="single" w:color="AAAAAA" w:sz="1"/>
-              <w:left w:val="single" w:color="AAAAAA" w:sz="1"/>
-              <w:bottom w:val="single" w:color="AAAAAA" w:sz="1"/>
-              <w:right w:val="single" w:color="AAAAAA" w:sz="1"/>
-            </w:tcBorders>
-            <w:tcMar>
-              <w:top w:type="dxa" w:w="60"/>
-              <w:left w:type="dxa" w:w="100"/>
-              <w:bottom w:type="dxa" w:w="60"/>
-              <w:right w:type="dxa" w:w="100"/>
-            </w:tcMar>
-          </w:tcPr>
-          <w:p>
-            <w:r>
-              <w:rPr>
-                <w:rFonts w:ascii="맑은 고딕" w:cs="맑은 고딕" w:eastAsia="맑은 고딕" w:hAnsi="맑은 고딕"/>
-                <w:sz w:val="18"/>
-                <w:szCs w:val="18"/>
-              </w:rPr>
-              <w:t xml:space="preserve">289톤 → 약 578톤 예상</w:t>
+              <w:t xml:space="preserve">307</w:t>
+            </w:r>
+          </w:p>
+        </w:tc>
+        <w:tc>
+          <w:tcPr>
+            <w:tcW w:type="dxa" w:w="1560"/>
+            <w:tcBorders>
+              <w:top w:val="single" w:color="AAAAAA" w:sz="1"/>
+              <w:left w:val="single" w:color="AAAAAA" w:sz="1"/>
+              <w:bottom w:val="single" w:color="AAAAAA" w:sz="1"/>
+              <w:right w:val="single" w:color="AAAAAA" w:sz="1"/>
+            </w:tcBorders>
+            <w:tcMar>
+              <w:top w:type="dxa" w:w="60"/>
+              <w:left w:type="dxa" w:w="100"/>
+              <w:bottom w:type="dxa" w:w="60"/>
+              <w:right w:type="dxa" w:w="100"/>
+            </w:tcMar>
+          </w:tcPr>
+          <w:p>
+            <w:r>
+              <w:rPr>
+                <w:rFonts w:ascii="맑은 고딕" w:cs="맑은 고딕" w:eastAsia="맑은 고딕" w:hAnsi="맑은 고딕"/>
+                <w:sz w:val="18"/>
+                <w:szCs w:val="18"/>
+              </w:rPr>
+              <w:t xml:space="preserve">282</w:t>
+            </w:r>
+          </w:p>
+        </w:tc>
+        <w:tc>
+          <w:tcPr>
+            <w:tcW w:type="dxa" w:w="1560"/>
+            <w:tcBorders>
+              <w:top w:val="single" w:color="AAAAAA" w:sz="1"/>
+              <w:left w:val="single" w:color="AAAAAA" w:sz="1"/>
+              <w:bottom w:val="single" w:color="AAAAAA" w:sz="1"/>
+              <w:right w:val="single" w:color="AAAAAA" w:sz="1"/>
+            </w:tcBorders>
+            <w:tcMar>
+              <w:top w:type="dxa" w:w="60"/>
+              <w:left w:type="dxa" w:w="100"/>
+              <w:bottom w:type="dxa" w:w="60"/>
+              <w:right w:type="dxa" w:w="100"/>
+            </w:tcMar>
+          </w:tcPr>
+          <w:p>
+            <w:r>
+              <w:rPr>
+                <w:rFonts w:ascii="맑은 고딕" w:cs="맑은 고딕" w:eastAsia="맑은 고딕" w:hAnsi="맑은 고딕"/>
+                <w:sz w:val="18"/>
+                <w:szCs w:val="18"/>
+              </w:rPr>
+              <w:t xml:space="preserve">351</w:t>
+            </w:r>
+          </w:p>
+        </w:tc>
+        <w:tc>
+          <w:tcPr>
+            <w:tcW w:type="dxa" w:w="1560"/>
+            <w:tcBorders>
+              <w:top w:val="single" w:color="AAAAAA" w:sz="1"/>
+              <w:left w:val="single" w:color="AAAAAA" w:sz="1"/>
+              <w:bottom w:val="single" w:color="AAAAAA" w:sz="1"/>
+              <w:right w:val="single" w:color="AAAAAA" w:sz="1"/>
+            </w:tcBorders>
+            <w:tcMar>
+              <w:top w:type="dxa" w:w="60"/>
+              <w:left w:type="dxa" w:w="100"/>
+              <w:bottom w:type="dxa" w:w="60"/>
+              <w:right w:type="dxa" w:w="100"/>
+            </w:tcMar>
+          </w:tcPr>
+          <w:p>
+            <w:r>
+              <w:rPr>
+                <w:rFonts w:ascii="맑은 고딕" w:cs="맑은 고딕" w:eastAsia="맑은 고딕" w:hAnsi="맑은 고딕"/>
+                <w:sz w:val="18"/>
+                <w:szCs w:val="18"/>
+              </w:rPr>
+              <w:t xml:space="preserve">443</w:t>
+            </w:r>
+          </w:p>
+        </w:tc>
+        <w:tc>
+          <w:tcPr>
+            <w:tcW w:type="dxa" w:w="3120"/>
+            <w:tcBorders>
+              <w:top w:val="single" w:color="AAAAAA" w:sz="1"/>
+              <w:left w:val="single" w:color="AAAAAA" w:sz="1"/>
+              <w:bottom w:val="single" w:color="AAAAAA" w:sz="1"/>
+              <w:right w:val="single" w:color="AAAAAA" w:sz="1"/>
+            </w:tcBorders>
+            <w:tcMar>
+              <w:top w:type="dxa" w:w="60"/>
+              <w:left w:type="dxa" w:w="100"/>
+              <w:bottom w:type="dxa" w:w="60"/>
+              <w:right w:type="dxa" w:w="100"/>
+            </w:tcMar>
+          </w:tcPr>
+          <w:p>
+            <w:r>
+              <w:rPr>
+                <w:rFonts w:ascii="맑은 고딕" w:cs="맑은 고딕" w:eastAsia="맑은 고딕" w:hAnsi="맑은 고딕"/>
+                <w:sz w:val="18"/>
+                <w:szCs w:val="18"/>
+              </w:rPr>
+              <w:t xml:space="preserve">289 → 약 578 (역대 최고 예상)</w:t>
             </w:r>
           </w:p>
         </w:tc>
@@ -376,66 +376,368 @@
         <w:t xml:space="preserve"/>
       </w:r>
     </w:p>
-    <w:p>
-      <w:pPr>
-        <w:pStyle w:val="ListParagraph"/>
-        <w:numPr>
-          <w:ilvl w:val="0"/>
-          <w:numId w:val="1"/>
-        </w:numPr>
-        <w:spacing w:after="0" w:before="0"/>
-      </w:pPr>
-      <w:r>
-        <w:rPr>
-          <w:rFonts w:ascii="맑은 고딕" w:cs="맑은 고딕" w:eastAsia="맑은 고딕" w:hAnsi="맑은 고딕"/>
-          <w:b/>
-          <w:bCs/>
-          <w:sz w:val="19"/>
-          <w:szCs w:val="19"/>
-        </w:rPr>
-        <w:t xml:space="preserve">PIANO WIRE 급증: 2026 H1(182톤)이 이미 2025 연간(137톤) 초과 — YANGMIN 대경 WIRE 대량 발주가 주도</w:t>
-      </w:r>
-    </w:p>
-    <w:p>
-      <w:pPr>
-        <w:pStyle w:val="ListParagraph"/>
-        <w:numPr>
-          <w:ilvl w:val="0"/>
-          <w:numId w:val="1"/>
-        </w:numPr>
-        <w:spacing w:after="0" w:before="0"/>
-      </w:pPr>
-      <w:r>
-        <w:rPr>
-          <w:rFonts w:ascii="맑은 고딕" w:cs="맑은 고딕" w:eastAsia="맑은 고딕" w:hAnsi="맑은 고딕"/>
-          <w:b w:val="false"/>
-          <w:bCs w:val="false"/>
-          <w:sz w:val="19"/>
-          <w:szCs w:val="19"/>
-        </w:rPr>
-        <w:t xml:space="preserve">SWOSC-B: 2025년 회복 후 2026 H1 다소 둔화 — 원인 확인 필요</w:t>
-      </w:r>
-    </w:p>
-    <w:p>
-      <w:pPr>
-        <w:pStyle w:val="ListParagraph"/>
-        <w:numPr>
-          <w:ilvl w:val="0"/>
-          <w:numId w:val="1"/>
-        </w:numPr>
-        <w:spacing w:after="0" w:before="0"/>
-      </w:pPr>
-      <w:r>
-        <w:rPr>
-          <w:rFonts w:ascii="맑은 고딕" w:cs="맑은 고딕" w:eastAsia="맑은 고딕" w:hAnsi="맑은 고딕"/>
-          <w:b w:val="false"/>
-          <w:bCs w:val="false"/>
-          <w:sz w:val="19"/>
-          <w:szCs w:val="19"/>
-        </w:rPr>
-        <w:t xml:space="preserve">HW WIRE: 구조적 감소세 지속</w:t>
-      </w:r>
-    </w:p>
+    <w:tbl>
+      <w:tblPr>
+        <w:tblW w:type="dxa" w:w="9360"/>
+        <w:tblBorders>
+          <w:top w:val="single" w:color="auto" w:sz="4"/>
+          <w:left w:val="single" w:color="auto" w:sz="4"/>
+          <w:bottom w:val="single" w:color="auto" w:sz="4"/>
+          <w:right w:val="single" w:color="auto" w:sz="4"/>
+          <w:insideH w:val="single" w:color="auto" w:sz="4"/>
+          <w:insideV w:val="single" w:color="auto" w:sz="4"/>
+        </w:tblBorders>
+      </w:tblPr>
+      <w:tblGrid>
+        <w:gridCol w:w="2800"/>
+        <w:gridCol w:w="1400"/>
+        <w:gridCol w:w="5160"/>
+      </w:tblGrid>
+      <w:tr>
+        <w:tc>
+          <w:tcPr>
+            <w:tcW w:type="dxa" w:w="2800"/>
+            <w:tcBorders>
+              <w:top w:val="single" w:color="AAAAAA" w:sz="1"/>
+              <w:left w:val="single" w:color="AAAAAA" w:sz="1"/>
+              <w:bottom w:val="single" w:color="AAAAAA" w:sz="1"/>
+              <w:right w:val="single" w:color="AAAAAA" w:sz="1"/>
+            </w:tcBorders>
+            <w:shd w:fill="DEDEDE" w:val="clear"/>
+            <w:tcMar>
+              <w:top w:type="dxa" w:w="60"/>
+              <w:left w:type="dxa" w:w="100"/>
+              <w:bottom w:type="dxa" w:w="60"/>
+              <w:right w:type="dxa" w:w="100"/>
+            </w:tcMar>
+          </w:tcPr>
+          <w:p>
+            <w:r>
+              <w:rPr>
+                <w:rFonts w:ascii="맑은 고딕" w:cs="맑은 고딕" w:eastAsia="맑은 고딕" w:hAnsi="맑은 고딕"/>
+                <w:b/>
+                <w:bCs/>
+                <w:sz w:val="18"/>
+                <w:szCs w:val="18"/>
+              </w:rPr>
+              <w:t xml:space="preserve">품목</w:t>
+            </w:r>
+          </w:p>
+        </w:tc>
+        <w:tc>
+          <w:tcPr>
+            <w:tcW w:type="dxa" w:w="1400"/>
+            <w:tcBorders>
+              <w:top w:val="single" w:color="AAAAAA" w:sz="1"/>
+              <w:left w:val="single" w:color="AAAAAA" w:sz="1"/>
+              <w:bottom w:val="single" w:color="AAAAAA" w:sz="1"/>
+              <w:right w:val="single" w:color="AAAAAA" w:sz="1"/>
+            </w:tcBorders>
+            <w:shd w:fill="DEDEDE" w:val="clear"/>
+            <w:tcMar>
+              <w:top w:type="dxa" w:w="60"/>
+              <w:left w:type="dxa" w:w="100"/>
+              <w:bottom w:type="dxa" w:w="60"/>
+              <w:right w:type="dxa" w:w="100"/>
+            </w:tcMar>
+          </w:tcPr>
+          <w:p>
+            <w:r>
+              <w:rPr>
+                <w:rFonts w:ascii="맑은 고딕" w:cs="맑은 고딕" w:eastAsia="맑은 고딕" w:hAnsi="맑은 고딕"/>
+                <w:b/>
+                <w:bCs/>
+                <w:sz w:val="18"/>
+                <w:szCs w:val="18"/>
+              </w:rPr>
+              <w:t xml:space="preserve">2026 H1</w:t>
+            </w:r>
+          </w:p>
+        </w:tc>
+        <w:tc>
+          <w:tcPr>
+            <w:tcW w:type="dxa" w:w="5160"/>
+            <w:tcBorders>
+              <w:top w:val="single" w:color="AAAAAA" w:sz="1"/>
+              <w:left w:val="single" w:color="AAAAAA" w:sz="1"/>
+              <w:bottom w:val="single" w:color="AAAAAA" w:sz="1"/>
+              <w:right w:val="single" w:color="AAAAAA" w:sz="1"/>
+            </w:tcBorders>
+            <w:shd w:fill="DEDEDE" w:val="clear"/>
+            <w:tcMar>
+              <w:top w:type="dxa" w:w="60"/>
+              <w:left w:type="dxa" w:w="100"/>
+              <w:bottom w:type="dxa" w:w="60"/>
+              <w:right w:type="dxa" w:w="100"/>
+            </w:tcMar>
+          </w:tcPr>
+          <w:p>
+            <w:r>
+              <w:rPr>
+                <w:rFonts w:ascii="맑은 고딕" w:cs="맑은 고딕" w:eastAsia="맑은 고딕" w:hAnsi="맑은 고딕"/>
+                <w:b/>
+                <w:bCs/>
+                <w:sz w:val="18"/>
+                <w:szCs w:val="18"/>
+              </w:rPr>
+              <w:t xml:space="preserve">동향</w:t>
+            </w:r>
+          </w:p>
+        </w:tc>
+      </w:tr>
+      <w:tr>
+        <w:tc>
+          <w:tcPr>
+            <w:tcW w:type="dxa" w:w="2800"/>
+            <w:tcBorders>
+              <w:top w:val="single" w:color="AAAAAA" w:sz="1"/>
+              <w:left w:val="single" w:color="AAAAAA" w:sz="1"/>
+              <w:bottom w:val="single" w:color="AAAAAA" w:sz="1"/>
+              <w:right w:val="single" w:color="AAAAAA" w:sz="1"/>
+            </w:tcBorders>
+            <w:shd w:fill="F2F2F2" w:val="clear"/>
+            <w:tcMar>
+              <w:top w:type="dxa" w:w="60"/>
+              <w:left w:type="dxa" w:w="100"/>
+              <w:bottom w:type="dxa" w:w="60"/>
+              <w:right w:type="dxa" w:w="100"/>
+            </w:tcMar>
+          </w:tcPr>
+          <w:p>
+            <w:r>
+              <w:rPr>
+                <w:rFonts w:ascii="맑은 고딕" w:cs="맑은 고딕" w:eastAsia="맑은 고딕" w:hAnsi="맑은 고딕"/>
+                <w:sz w:val="18"/>
+                <w:szCs w:val="18"/>
+              </w:rPr>
+              <w:t xml:space="preserve">PIANO WIRE (SWP-A/B)</w:t>
+            </w:r>
+          </w:p>
+        </w:tc>
+        <w:tc>
+          <w:tcPr>
+            <w:tcW w:type="dxa" w:w="1400"/>
+            <w:tcBorders>
+              <w:top w:val="single" w:color="AAAAAA" w:sz="1"/>
+              <w:left w:val="single" w:color="AAAAAA" w:sz="1"/>
+              <w:bottom w:val="single" w:color="AAAAAA" w:sz="1"/>
+              <w:right w:val="single" w:color="AAAAAA" w:sz="1"/>
+            </w:tcBorders>
+            <w:tcMar>
+              <w:top w:type="dxa" w:w="60"/>
+              <w:left w:type="dxa" w:w="100"/>
+              <w:bottom w:type="dxa" w:w="60"/>
+              <w:right w:type="dxa" w:w="100"/>
+            </w:tcMar>
+          </w:tcPr>
+          <w:p>
+            <w:r>
+              <w:rPr>
+                <w:rFonts w:ascii="맑은 고딕" w:cs="맑은 고딕" w:eastAsia="맑은 고딕" w:hAnsi="맑은 고딕"/>
+                <w:sz w:val="18"/>
+                <w:szCs w:val="18"/>
+              </w:rPr>
+              <w:t xml:space="preserve">182톤</w:t>
+            </w:r>
+          </w:p>
+        </w:tc>
+        <w:tc>
+          <w:tcPr>
+            <w:tcW w:type="dxa" w:w="5160"/>
+            <w:tcBorders>
+              <w:top w:val="single" w:color="AAAAAA" w:sz="1"/>
+              <w:left w:val="single" w:color="AAAAAA" w:sz="1"/>
+              <w:bottom w:val="single" w:color="AAAAAA" w:sz="1"/>
+              <w:right w:val="single" w:color="AAAAAA" w:sz="1"/>
+            </w:tcBorders>
+            <w:tcMar>
+              <w:top w:type="dxa" w:w="60"/>
+              <w:left w:type="dxa" w:w="100"/>
+              <w:bottom w:type="dxa" w:w="60"/>
+              <w:right w:type="dxa" w:w="100"/>
+            </w:tcMar>
+          </w:tcPr>
+          <w:p>
+            <w:r>
+              <w:rPr>
+                <w:rFonts w:ascii="맑은 고딕" w:cs="맑은 고딕" w:eastAsia="맑은 고딕" w:hAnsi="맑은 고딕"/>
+                <w:sz w:val="18"/>
+                <w:szCs w:val="18"/>
+              </w:rPr>
+              <w:t xml:space="preserve">2025 연간(137톤) 이미 초과. YANGMIN 대경 WIRE 대량 발주가 주도 — 연환산 400톤 페이스</w:t>
+            </w:r>
+          </w:p>
+        </w:tc>
+      </w:tr>
+      <w:tr>
+        <w:tc>
+          <w:tcPr>
+            <w:tcW w:type="dxa" w:w="2800"/>
+            <w:tcBorders>
+              <w:top w:val="single" w:color="AAAAAA" w:sz="1"/>
+              <w:left w:val="single" w:color="AAAAAA" w:sz="1"/>
+              <w:bottom w:val="single" w:color="AAAAAA" w:sz="1"/>
+              <w:right w:val="single" w:color="AAAAAA" w:sz="1"/>
+            </w:tcBorders>
+            <w:shd w:fill="F2F2F2" w:val="clear"/>
+            <w:tcMar>
+              <w:top w:type="dxa" w:w="60"/>
+              <w:left w:type="dxa" w:w="100"/>
+              <w:bottom w:type="dxa" w:w="60"/>
+              <w:right w:type="dxa" w:w="100"/>
+            </w:tcMar>
+          </w:tcPr>
+          <w:p>
+            <w:r>
+              <w:rPr>
+                <w:rFonts w:ascii="맑은 고딕" w:cs="맑은 고딕" w:eastAsia="맑은 고딕" w:hAnsi="맑은 고딕"/>
+                <w:sz w:val="18"/>
+                <w:szCs w:val="18"/>
+              </w:rPr>
+              <w:t xml:space="preserve">CR-SI OT WIRE (SWOSC-B)</w:t>
+            </w:r>
+          </w:p>
+        </w:tc>
+        <w:tc>
+          <w:tcPr>
+            <w:tcW w:type="dxa" w:w="1400"/>
+            <w:tcBorders>
+              <w:top w:val="single" w:color="AAAAAA" w:sz="1"/>
+              <w:left w:val="single" w:color="AAAAAA" w:sz="1"/>
+              <w:bottom w:val="single" w:color="AAAAAA" w:sz="1"/>
+              <w:right w:val="single" w:color="AAAAAA" w:sz="1"/>
+            </w:tcBorders>
+            <w:tcMar>
+              <w:top w:type="dxa" w:w="60"/>
+              <w:left w:type="dxa" w:w="100"/>
+              <w:bottom w:type="dxa" w:w="60"/>
+              <w:right w:type="dxa" w:w="100"/>
+            </w:tcMar>
+          </w:tcPr>
+          <w:p>
+            <w:r>
+              <w:rPr>
+                <w:rFonts w:ascii="맑은 고딕" w:cs="맑은 고딕" w:eastAsia="맑은 고딕" w:hAnsi="맑은 고딕"/>
+                <w:sz w:val="18"/>
+                <w:szCs w:val="18"/>
+              </w:rPr>
+              <w:t xml:space="preserve">57톤</w:t>
+            </w:r>
+          </w:p>
+        </w:tc>
+        <w:tc>
+          <w:tcPr>
+            <w:tcW w:type="dxa" w:w="5160"/>
+            <w:tcBorders>
+              <w:top w:val="single" w:color="AAAAAA" w:sz="1"/>
+              <w:left w:val="single" w:color="AAAAAA" w:sz="1"/>
+              <w:bottom w:val="single" w:color="AAAAAA" w:sz="1"/>
+              <w:right w:val="single" w:color="AAAAAA" w:sz="1"/>
+            </w:tcBorders>
+            <w:tcMar>
+              <w:top w:type="dxa" w:w="60"/>
+              <w:left w:type="dxa" w:w="100"/>
+              <w:bottom w:type="dxa" w:w="60"/>
+              <w:right w:type="dxa" w:w="100"/>
+            </w:tcMar>
+          </w:tcPr>
+          <w:p>
+            <w:r>
+              <w:rPr>
+                <w:rFonts w:ascii="맑은 고딕" w:cs="맑은 고딕" w:eastAsia="맑은 고딕" w:hAnsi="맑은 고딕"/>
+                <w:sz w:val="18"/>
+                <w:szCs w:val="18"/>
+              </w:rPr>
+              <w:t xml:space="preserve">2025 회복 후 소폭 둔화. YANGMIN 4.20MM 수요 동향 확인 필요</w:t>
+            </w:r>
+          </w:p>
+        </w:tc>
+      </w:tr>
+      <w:tr>
+        <w:tc>
+          <w:tcPr>
+            <w:tcW w:type="dxa" w:w="2800"/>
+            <w:tcBorders>
+              <w:top w:val="single" w:color="AAAAAA" w:sz="1"/>
+              <w:left w:val="single" w:color="AAAAAA" w:sz="1"/>
+              <w:bottom w:val="single" w:color="AAAAAA" w:sz="1"/>
+              <w:right w:val="single" w:color="AAAAAA" w:sz="1"/>
+            </w:tcBorders>
+            <w:shd w:fill="F2F2F2" w:val="clear"/>
+            <w:tcMar>
+              <w:top w:type="dxa" w:w="60"/>
+              <w:left w:type="dxa" w:w="100"/>
+              <w:bottom w:type="dxa" w:w="60"/>
+              <w:right w:type="dxa" w:w="100"/>
+            </w:tcMar>
+          </w:tcPr>
+          <w:p>
+            <w:r>
+              <w:rPr>
+                <w:rFonts w:ascii="맑은 고딕" w:cs="맑은 고딕" w:eastAsia="맑은 고딕" w:hAnsi="맑은 고딕"/>
+                <w:sz w:val="18"/>
+                <w:szCs w:val="18"/>
+              </w:rPr>
+              <w:t xml:space="preserve">HW WIRE (SWC/SWB)</w:t>
+            </w:r>
+          </w:p>
+        </w:tc>
+        <w:tc>
+          <w:tcPr>
+            <w:tcW w:type="dxa" w:w="1400"/>
+            <w:tcBorders>
+              <w:top w:val="single" w:color="AAAAAA" w:sz="1"/>
+              <w:left w:val="single" w:color="AAAAAA" w:sz="1"/>
+              <w:bottom w:val="single" w:color="AAAAAA" w:sz="1"/>
+              <w:right w:val="single" w:color="AAAAAA" w:sz="1"/>
+            </w:tcBorders>
+            <w:tcMar>
+              <w:top w:type="dxa" w:w="60"/>
+              <w:left w:type="dxa" w:w="100"/>
+              <w:bottom w:type="dxa" w:w="60"/>
+              <w:right w:type="dxa" w:w="100"/>
+            </w:tcMar>
+          </w:tcPr>
+          <w:p>
+            <w:r>
+              <w:rPr>
+                <w:rFonts w:ascii="맑은 고딕" w:cs="맑은 고딕" w:eastAsia="맑은 고딕" w:hAnsi="맑은 고딕"/>
+                <w:sz w:val="18"/>
+                <w:szCs w:val="18"/>
+              </w:rPr>
+              <w:t xml:space="preserve">4톤</w:t>
+            </w:r>
+          </w:p>
+        </w:tc>
+        <w:tc>
+          <w:tcPr>
+            <w:tcW w:type="dxa" w:w="5160"/>
+            <w:tcBorders>
+              <w:top w:val="single" w:color="AAAAAA" w:sz="1"/>
+              <w:left w:val="single" w:color="AAAAAA" w:sz="1"/>
+              <w:bottom w:val="single" w:color="AAAAAA" w:sz="1"/>
+              <w:right w:val="single" w:color="AAAAAA" w:sz="1"/>
+            </w:tcBorders>
+            <w:tcMar>
+              <w:top w:type="dxa" w:w="60"/>
+              <w:left w:type="dxa" w:w="100"/>
+              <w:bottom w:type="dxa" w:w="60"/>
+              <w:right w:type="dxa" w:w="100"/>
+            </w:tcMar>
+          </w:tcPr>
+          <w:p>
+            <w:r>
+              <w:rPr>
+                <w:rFonts w:ascii="맑은 고딕" w:cs="맑은 고딕" w:eastAsia="맑은 고딕" w:hAnsi="맑은 고딕"/>
+                <w:sz w:val="18"/>
+                <w:szCs w:val="18"/>
+              </w:rPr>
+              <w:t xml:space="preserve">구조적 감소 지속. 고객 이탈 원인 파악 필요</w:t>
+            </w:r>
+          </w:p>
+        </w:tc>
+      </w:tr>
+    </w:tbl>
     <w:p>
       <w:pPr>
         <w:pBdr>
@@ -467,14 +769,15 @@
         </w:tblBorders>
       </w:tblPr>
       <w:tblGrid>
-        <w:gridCol w:w="1800"/>
-        <w:gridCol w:w="1400"/>
-        <w:gridCol w:w="5160"/>
+        <w:gridCol w:w="1700"/>
+        <w:gridCol w:w="900"/>
+        <w:gridCol w:w="2200"/>
+        <w:gridCol w:w="4560"/>
       </w:tblGrid>
       <w:tr>
         <w:tc>
           <w:tcPr>
-            <w:tcW w:type="dxa" w:w="1800"/>
+            <w:tcW w:type="dxa" w:w="1700"/>
             <w:tcBorders>
               <w:top w:val="single" w:color="AAAAAA" w:sz="1"/>
               <w:left w:val="single" w:color="AAAAAA" w:sz="1"/>
@@ -504,7 +807,7 @@
         </w:tc>
         <w:tc>
           <w:tcPr>
-            <w:tcW w:type="dxa" w:w="1400"/>
+            <w:tcW w:type="dxa" w:w="900"/>
             <w:tcBorders>
               <w:top w:val="single" w:color="AAAAAA" w:sz="1"/>
               <w:left w:val="single" w:color="AAAAAA" w:sz="1"/>
@@ -528,13 +831,13 @@
                 <w:sz w:val="18"/>
                 <w:szCs w:val="18"/>
               </w:rPr>
-              <w:t xml:space="preserve">상태</w:t>
-            </w:r>
-          </w:p>
-        </w:tc>
-        <w:tc>
-          <w:tcPr>
-            <w:tcW w:type="dxa" w:w="5160"/>
+              <w:t xml:space="preserve">규모</w:t>
+            </w:r>
+          </w:p>
+        </w:tc>
+        <w:tc>
+          <w:tcPr>
+            <w:tcW w:type="dxa" w:w="2200"/>
             <w:tcBorders>
               <w:top w:val="single" w:color="AAAAAA" w:sz="1"/>
               <w:left w:val="single" w:color="AAAAAA" w:sz="1"/>
@@ -558,7 +861,37 @@
                 <w:sz w:val="18"/>
                 <w:szCs w:val="18"/>
               </w:rPr>
-              <w:t xml:space="preserve">핵심 내용</w:t>
+              <w:t xml:space="preserve">상태</w:t>
+            </w:r>
+          </w:p>
+        </w:tc>
+        <w:tc>
+          <w:tcPr>
+            <w:tcW w:type="dxa" w:w="4560"/>
+            <w:tcBorders>
+              <w:top w:val="single" w:color="AAAAAA" w:sz="1"/>
+              <w:left w:val="single" w:color="AAAAAA" w:sz="1"/>
+              <w:bottom w:val="single" w:color="AAAAAA" w:sz="1"/>
+              <w:right w:val="single" w:color="AAAAAA" w:sz="1"/>
+            </w:tcBorders>
+            <w:shd w:fill="DEDEDE" w:val="clear"/>
+            <w:tcMar>
+              <w:top w:type="dxa" w:w="60"/>
+              <w:left w:type="dxa" w:w="100"/>
+              <w:bottom w:type="dxa" w:w="60"/>
+              <w:right w:type="dxa" w:w="100"/>
+            </w:tcMar>
+          </w:tcPr>
+          <w:p>
+            <w:r>
+              <w:rPr>
+                <w:rFonts w:ascii="맑은 고딕" w:cs="맑은 고딕" w:eastAsia="맑은 고딕" w:hAnsi="맑은 고딕"/>
+                <w:b/>
+                <w:bCs/>
+                <w:sz w:val="18"/>
+                <w:szCs w:val="18"/>
+              </w:rPr>
+              <w:t xml:space="preserve">핵심 이슈 / 기회</w:t>
             </w:r>
           </w:p>
         </w:tc>
@@ -566,7 +899,7 @@
       <w:tr>
         <w:tc>
           <w:tcPr>
-            <w:tcW w:type="dxa" w:w="1800"/>
+            <w:tcW w:type="dxa" w:w="1700"/>
             <w:tcBorders>
               <w:top w:val="single" w:color="AAAAAA" w:sz="1"/>
               <w:left w:val="single" w:color="AAAAAA" w:sz="1"/>
@@ -594,7 +927,34 @@
         </w:tc>
         <w:tc>
           <w:tcPr>
-            <w:tcW w:type="dxa" w:w="1400"/>
+            <w:tcW w:type="dxa" w:w="900"/>
+            <w:tcBorders>
+              <w:top w:val="single" w:color="AAAAAA" w:sz="1"/>
+              <w:left w:val="single" w:color="AAAAAA" w:sz="1"/>
+              <w:bottom w:val="single" w:color="AAAAAA" w:sz="1"/>
+              <w:right w:val="single" w:color="AAAAAA" w:sz="1"/>
+            </w:tcBorders>
+            <w:tcMar>
+              <w:top w:type="dxa" w:w="60"/>
+              <w:left w:type="dxa" w:w="100"/>
+              <w:bottom w:type="dxa" w:w="60"/>
+              <w:right w:type="dxa" w:w="100"/>
+            </w:tcMar>
+          </w:tcPr>
+          <w:p>
+            <w:r>
+              <w:rPr>
+                <w:rFonts w:ascii="맑은 고딕" w:cs="맑은 고딕" w:eastAsia="맑은 고딕" w:hAnsi="맑은 고딕"/>
+                <w:sz w:val="18"/>
+                <w:szCs w:val="18"/>
+              </w:rPr>
+              <w:t xml:space="preserve">연 ~590톤</w:t>
+            </w:r>
+          </w:p>
+        </w:tc>
+        <w:tc>
+          <w:tcPr>
+            <w:tcW w:type="dxa" w:w="2200"/>
             <w:tcBorders>
               <w:top w:val="single" w:color="AAAAAA" w:sz="1"/>
               <w:left w:val="single" w:color="AAAAAA" w:sz="1"/>
@@ -621,28 +981,28 @@
         </w:tc>
         <w:tc>
           <w:tcPr>
-            <w:tcW w:type="dxa" w:w="5160"/>
-            <w:tcBorders>
-              <w:top w:val="single" w:color="AAAAAA" w:sz="1"/>
-              <w:left w:val="single" w:color="AAAAAA" w:sz="1"/>
-              <w:bottom w:val="single" w:color="AAAAAA" w:sz="1"/>
-              <w:right w:val="single" w:color="AAAAAA" w:sz="1"/>
-            </w:tcBorders>
-            <w:tcMar>
-              <w:top w:type="dxa" w:w="60"/>
-              <w:left w:type="dxa" w:w="100"/>
-              <w:bottom w:type="dxa" w:w="60"/>
-              <w:right w:type="dxa" w:w="100"/>
-            </w:tcMar>
-          </w:tcPr>
-          <w:p>
-            <w:r>
-              <w:rPr>
-                <w:rFonts w:ascii="맑은 고딕" w:cs="맑은 고딕" w:eastAsia="맑은 고딕" w:hAnsi="맑은 고딕"/>
-                <w:sz w:val="18"/>
-                <w:szCs w:val="18"/>
-              </w:rPr>
-              <w:t xml:space="preserve">SWOSC-B 4.20MM (연환산 192톤) + PIANO WIRE (연환산 400톤). DSR 베트남 최대 거래처. TH1524 품질 이슈 해소 여부 확인 필요</w:t>
+            <w:tcW w:type="dxa" w:w="4560"/>
+            <w:tcBorders>
+              <w:top w:val="single" w:color="AAAAAA" w:sz="1"/>
+              <w:left w:val="single" w:color="AAAAAA" w:sz="1"/>
+              <w:bottom w:val="single" w:color="AAAAAA" w:sz="1"/>
+              <w:right w:val="single" w:color="AAAAAA" w:sz="1"/>
+            </w:tcBorders>
+            <w:tcMar>
+              <w:top w:type="dxa" w:w="60"/>
+              <w:left w:type="dxa" w:w="100"/>
+              <w:bottom w:type="dxa" w:w="60"/>
+              <w:right w:type="dxa" w:w="100"/>
+            </w:tcMar>
+          </w:tcPr>
+          <w:p>
+            <w:r>
+              <w:rPr>
+                <w:rFonts w:ascii="맑은 고딕" w:cs="맑은 고딕" w:eastAsia="맑은 고딕" w:hAnsi="맑은 고딕"/>
+                <w:sz w:val="18"/>
+                <w:szCs w:val="18"/>
+              </w:rPr>
+              <w:t xml:space="preserve">SWOSC-B 192톤 + PIANO WIRE 400톤 (연환산). TH1524 품질 이슈 해소 여부 미확인</w:t>
             </w:r>
           </w:p>
         </w:tc>
@@ -650,7 +1010,7 @@
       <w:tr>
         <w:tc>
           <w:tcPr>
-            <w:tcW w:type="dxa" w:w="1800"/>
+            <w:tcW w:type="dxa" w:w="1700"/>
             <w:tcBorders>
               <w:top w:val="single" w:color="AAAAAA" w:sz="1"/>
               <w:left w:val="single" w:color="AAAAAA" w:sz="1"/>
@@ -678,55 +1038,82 @@
         </w:tc>
         <w:tc>
           <w:tcPr>
-            <w:tcW w:type="dxa" w:w="1400"/>
-            <w:tcBorders>
-              <w:top w:val="single" w:color="AAAAAA" w:sz="1"/>
-              <w:left w:val="single" w:color="AAAAAA" w:sz="1"/>
-              <w:bottom w:val="single" w:color="AAAAAA" w:sz="1"/>
-              <w:right w:val="single" w:color="AAAAAA" w:sz="1"/>
-            </w:tcBorders>
-            <w:tcMar>
-              <w:top w:type="dxa" w:w="60"/>
-              <w:left w:type="dxa" w:w="100"/>
-              <w:bottom w:type="dxa" w:w="60"/>
-              <w:right w:type="dxa" w:w="100"/>
-            </w:tcMar>
-          </w:tcPr>
-          <w:p>
-            <w:r>
-              <w:rPr>
-                <w:rFonts w:ascii="맑은 고딕" w:cs="맑은 고딕" w:eastAsia="맑은 고딕" w:hAnsi="맑은 고딕"/>
-                <w:sz w:val="18"/>
-                <w:szCs w:val="18"/>
-              </w:rPr>
-              <w:t xml:space="preserve">관계 회복 중</w:t>
-            </w:r>
-          </w:p>
-        </w:tc>
-        <w:tc>
-          <w:tcPr>
-            <w:tcW w:type="dxa" w:w="5160"/>
-            <w:tcBorders>
-              <w:top w:val="single" w:color="AAAAAA" w:sz="1"/>
-              <w:left w:val="single" w:color="AAAAAA" w:sz="1"/>
-              <w:bottom w:val="single" w:color="AAAAAA" w:sz="1"/>
-              <w:right w:val="single" w:color="AAAAAA" w:sz="1"/>
-            </w:tcBorders>
-            <w:tcMar>
-              <w:top w:type="dxa" w:w="60"/>
-              <w:left w:type="dxa" w:w="100"/>
-              <w:bottom w:type="dxa" w:w="60"/>
-              <w:right w:type="dxa" w:w="100"/>
-            </w:tcMar>
-          </w:tcPr>
-          <w:p>
-            <w:r>
-              <w:rPr>
-                <w:rFonts w:ascii="맑은 고딕" w:cs="맑은 고딕" w:eastAsia="맑은 고딕" w:hAnsi="맑은 고딕"/>
-                <w:sz w:val="18"/>
-                <w:szCs w:val="18"/>
-              </w:rPr>
-              <w:t xml:space="preserve">SWC 2.30MM 오더 재증량. GENERAL DIRECTOR 미팅 긍정적. FLAT WIRE CORNER RADIUS 확인 [긴급]. MEDICAL 부문 30%+ 성장 중</w:t>
+            <w:tcW w:type="dxa" w:w="900"/>
+            <w:tcBorders>
+              <w:top w:val="single" w:color="AAAAAA" w:sz="1"/>
+              <w:left w:val="single" w:color="AAAAAA" w:sz="1"/>
+              <w:bottom w:val="single" w:color="AAAAAA" w:sz="1"/>
+              <w:right w:val="single" w:color="AAAAAA" w:sz="1"/>
+            </w:tcBorders>
+            <w:tcMar>
+              <w:top w:type="dxa" w:w="60"/>
+              <w:left w:type="dxa" w:w="100"/>
+              <w:bottom w:type="dxa" w:w="60"/>
+              <w:right w:type="dxa" w:w="100"/>
+            </w:tcMar>
+          </w:tcPr>
+          <w:p>
+            <w:r>
+              <w:rPr>
+                <w:rFonts w:ascii="맑은 고딕" w:cs="맑은 고딕" w:eastAsia="맑은 고딕" w:hAnsi="맑은 고딕"/>
+                <w:sz w:val="18"/>
+                <w:szCs w:val="18"/>
+              </w:rPr>
+              <w:t xml:space="preserve">월 10톤+</w:t>
+            </w:r>
+          </w:p>
+        </w:tc>
+        <w:tc>
+          <w:tcPr>
+            <w:tcW w:type="dxa" w:w="2200"/>
+            <w:tcBorders>
+              <w:top w:val="single" w:color="AAAAAA" w:sz="1"/>
+              <w:left w:val="single" w:color="AAAAAA" w:sz="1"/>
+              <w:bottom w:val="single" w:color="AAAAAA" w:sz="1"/>
+              <w:right w:val="single" w:color="AAAAAA" w:sz="1"/>
+            </w:tcBorders>
+            <w:tcMar>
+              <w:top w:type="dxa" w:w="60"/>
+              <w:left w:type="dxa" w:w="100"/>
+              <w:bottom w:type="dxa" w:w="60"/>
+              <w:right w:type="dxa" w:w="100"/>
+            </w:tcMar>
+          </w:tcPr>
+          <w:p>
+            <w:r>
+              <w:rPr>
+                <w:rFonts w:ascii="맑은 고딕" w:cs="맑은 고딕" w:eastAsia="맑은 고딕" w:hAnsi="맑은 고딕"/>
+                <w:sz w:val="18"/>
+                <w:szCs w:val="18"/>
+              </w:rPr>
+              <w:t xml:space="preserve">관계 회복</w:t>
+            </w:r>
+          </w:p>
+        </w:tc>
+        <w:tc>
+          <w:tcPr>
+            <w:tcW w:type="dxa" w:w="4560"/>
+            <w:tcBorders>
+              <w:top w:val="single" w:color="AAAAAA" w:sz="1"/>
+              <w:left w:val="single" w:color="AAAAAA" w:sz="1"/>
+              <w:bottom w:val="single" w:color="AAAAAA" w:sz="1"/>
+              <w:right w:val="single" w:color="AAAAAA" w:sz="1"/>
+            </w:tcBorders>
+            <w:tcMar>
+              <w:top w:type="dxa" w:w="60"/>
+              <w:left w:type="dxa" w:w="100"/>
+              <w:bottom w:type="dxa" w:w="60"/>
+              <w:right w:type="dxa" w:w="100"/>
+            </w:tcMar>
+          </w:tcPr>
+          <w:p>
+            <w:r>
+              <w:rPr>
+                <w:rFonts w:ascii="맑은 고딕" w:cs="맑은 고딕" w:eastAsia="맑은 고딕" w:hAnsi="맑은 고딕"/>
+                <w:sz w:val="18"/>
+                <w:szCs w:val="18"/>
+              </w:rPr>
+              <w:t xml:space="preserve">SWC 2.30MM 증량 중. MEDICAL 30%+ 급성장. FLAT WIRE C.R. 수치 공유 [즉시]</w:t>
             </w:r>
           </w:p>
         </w:tc>
@@ -734,7 +1121,7 @@
       <w:tr>
         <w:tc>
           <w:tcPr>
-            <w:tcW w:type="dxa" w:w="1800"/>
+            <w:tcW w:type="dxa" w:w="1700"/>
             <w:tcBorders>
               <w:top w:val="single" w:color="AAAAAA" w:sz="1"/>
               <w:left w:val="single" w:color="AAAAAA" w:sz="1"/>
@@ -762,55 +1149,82 @@
         </w:tc>
         <w:tc>
           <w:tcPr>
-            <w:tcW w:type="dxa" w:w="1400"/>
-            <w:tcBorders>
-              <w:top w:val="single" w:color="AAAAAA" w:sz="1"/>
-              <w:left w:val="single" w:color="AAAAAA" w:sz="1"/>
-              <w:bottom w:val="single" w:color="AAAAAA" w:sz="1"/>
-              <w:right w:val="single" w:color="AAAAAA" w:sz="1"/>
-            </w:tcBorders>
-            <w:tcMar>
-              <w:top w:type="dxa" w:w="60"/>
-              <w:left w:type="dxa" w:w="100"/>
-              <w:bottom w:type="dxa" w:w="60"/>
-              <w:right w:type="dxa" w:w="100"/>
-            </w:tcMar>
-          </w:tcPr>
-          <w:p>
-            <w:r>
-              <w:rPr>
-                <w:rFonts w:ascii="맑은 고딕" w:cs="맑은 고딕" w:eastAsia="맑은 고딕" w:hAnsi="맑은 고딕"/>
-                <w:sz w:val="18"/>
-                <w:szCs w:val="18"/>
-              </w:rPr>
-              <w:t xml:space="preserve">성장 잠재력</w:t>
-            </w:r>
-          </w:p>
-        </w:tc>
-        <w:tc>
-          <w:tcPr>
-            <w:tcW w:type="dxa" w:w="5160"/>
-            <w:tcBorders>
-              <w:top w:val="single" w:color="AAAAAA" w:sz="1"/>
-              <w:left w:val="single" w:color="AAAAAA" w:sz="1"/>
-              <w:bottom w:val="single" w:color="AAAAAA" w:sz="1"/>
-              <w:right w:val="single" w:color="AAAAAA" w:sz="1"/>
-            </w:tcBorders>
-            <w:tcMar>
-              <w:top w:type="dxa" w:w="60"/>
-              <w:left w:type="dxa" w:w="100"/>
-              <w:bottom w:type="dxa" w:w="60"/>
-              <w:right w:type="dxa" w:w="100"/>
-            </w:tcMar>
-          </w:tcPr>
-          <w:p>
-            <w:r>
-              <w:rPr>
-                <w:rFonts w:ascii="맑은 고딕" w:cs="맑은 고딕" w:eastAsia="맑은 고딕" w:hAnsi="맑은 고딕"/>
-                <w:sz w:val="18"/>
-                <w:szCs w:val="18"/>
-              </w:rPr>
-              <w:t xml:space="preserve">월 1,200톤 규모. SUS304 신규 INQUIRY 월 20톤. SWP-B TRIAL ORDER 진행 중. FORECAST 없어 재고 구조 수립 필요</w:t>
+            <w:tcW w:type="dxa" w:w="900"/>
+            <w:tcBorders>
+              <w:top w:val="single" w:color="AAAAAA" w:sz="1"/>
+              <w:left w:val="single" w:color="AAAAAA" w:sz="1"/>
+              <w:bottom w:val="single" w:color="AAAAAA" w:sz="1"/>
+              <w:right w:val="single" w:color="AAAAAA" w:sz="1"/>
+            </w:tcBorders>
+            <w:tcMar>
+              <w:top w:type="dxa" w:w="60"/>
+              <w:left w:type="dxa" w:w="100"/>
+              <w:bottom w:type="dxa" w:w="60"/>
+              <w:right w:type="dxa" w:w="100"/>
+            </w:tcMar>
+          </w:tcPr>
+          <w:p>
+            <w:r>
+              <w:rPr>
+                <w:rFonts w:ascii="맑은 고딕" w:cs="맑은 고딕" w:eastAsia="맑은 고딕" w:hAnsi="맑은 고딕"/>
+                <w:sz w:val="18"/>
+                <w:szCs w:val="18"/>
+              </w:rPr>
+              <w:t xml:space="preserve">월 1,200톤</w:t>
+            </w:r>
+          </w:p>
+        </w:tc>
+        <w:tc>
+          <w:tcPr>
+            <w:tcW w:type="dxa" w:w="2200"/>
+            <w:tcBorders>
+              <w:top w:val="single" w:color="AAAAAA" w:sz="1"/>
+              <w:left w:val="single" w:color="AAAAAA" w:sz="1"/>
+              <w:bottom w:val="single" w:color="AAAAAA" w:sz="1"/>
+              <w:right w:val="single" w:color="AAAAAA" w:sz="1"/>
+            </w:tcBorders>
+            <w:tcMar>
+              <w:top w:type="dxa" w:w="60"/>
+              <w:left w:type="dxa" w:w="100"/>
+              <w:bottom w:type="dxa" w:w="60"/>
+              <w:right w:type="dxa" w:w="100"/>
+            </w:tcMar>
+          </w:tcPr>
+          <w:p>
+            <w:r>
+              <w:rPr>
+                <w:rFonts w:ascii="맑은 고딕" w:cs="맑은 고딕" w:eastAsia="맑은 고딕" w:hAnsi="맑은 고딕"/>
+                <w:sz w:val="18"/>
+                <w:szCs w:val="18"/>
+              </w:rPr>
+              <w:t xml:space="preserve">확대 추진</w:t>
+            </w:r>
+          </w:p>
+        </w:tc>
+        <w:tc>
+          <w:tcPr>
+            <w:tcW w:type="dxa" w:w="4560"/>
+            <w:tcBorders>
+              <w:top w:val="single" w:color="AAAAAA" w:sz="1"/>
+              <w:left w:val="single" w:color="AAAAAA" w:sz="1"/>
+              <w:bottom w:val="single" w:color="AAAAAA" w:sz="1"/>
+              <w:right w:val="single" w:color="AAAAAA" w:sz="1"/>
+            </w:tcBorders>
+            <w:tcMar>
+              <w:top w:type="dxa" w:w="60"/>
+              <w:left w:type="dxa" w:w="100"/>
+              <w:bottom w:type="dxa" w:w="60"/>
+              <w:right w:type="dxa" w:w="100"/>
+            </w:tcMar>
+          </w:tcPr>
+          <w:p>
+            <w:r>
+              <w:rPr>
+                <w:rFonts w:ascii="맑은 고딕" w:cs="맑은 고딕" w:eastAsia="맑은 고딕" w:hAnsi="맑은 고딕"/>
+                <w:sz w:val="18"/>
+                <w:szCs w:val="18"/>
+              </w:rPr>
+              <w:t xml:space="preserve">SUS304 BRIGHT WIRE 월 20톤 신규 INQUIRY. TRIAL ORDER 진행 중</w:t>
             </w:r>
           </w:p>
         </w:tc>
@@ -818,7 +1232,7 @@
       <w:tr>
         <w:tc>
           <w:tcPr>
-            <w:tcW w:type="dxa" w:w="1800"/>
+            <w:tcW w:type="dxa" w:w="1700"/>
             <w:tcBorders>
               <w:top w:val="single" w:color="AAAAAA" w:sz="1"/>
               <w:left w:val="single" w:color="AAAAAA" w:sz="1"/>
@@ -846,55 +1260,82 @@
         </w:tc>
         <w:tc>
           <w:tcPr>
-            <w:tcW w:type="dxa" w:w="1400"/>
-            <w:tcBorders>
-              <w:top w:val="single" w:color="AAAAAA" w:sz="1"/>
-              <w:left w:val="single" w:color="AAAAAA" w:sz="1"/>
-              <w:bottom w:val="single" w:color="AAAAAA" w:sz="1"/>
-              <w:right w:val="single" w:color="AAAAAA" w:sz="1"/>
-            </w:tcBorders>
-            <w:tcMar>
-              <w:top w:type="dxa" w:w="60"/>
-              <w:left w:type="dxa" w:w="100"/>
-              <w:bottom w:type="dxa" w:w="60"/>
-              <w:right w:type="dxa" w:w="100"/>
-            </w:tcMar>
-          </w:tcPr>
-          <w:p>
-            <w:r>
-              <w:rPr>
-                <w:rFonts w:ascii="맑은 고딕" w:cs="맑은 고딕" w:eastAsia="맑은 고딕" w:hAnsi="맑은 고딕"/>
-                <w:sz w:val="18"/>
-                <w:szCs w:val="18"/>
-              </w:rPr>
-              <w:t xml:space="preserve">안정적</w:t>
-            </w:r>
-          </w:p>
-        </w:tc>
-        <w:tc>
-          <w:tcPr>
-            <w:tcW w:type="dxa" w:w="5160"/>
-            <w:tcBorders>
-              <w:top w:val="single" w:color="AAAAAA" w:sz="1"/>
-              <w:left w:val="single" w:color="AAAAAA" w:sz="1"/>
-              <w:bottom w:val="single" w:color="AAAAAA" w:sz="1"/>
-              <w:right w:val="single" w:color="AAAAAA" w:sz="1"/>
-            </w:tcBorders>
-            <w:tcMar>
-              <w:top w:type="dxa" w:w="60"/>
-              <w:left w:type="dxa" w:w="100"/>
-              <w:bottom w:type="dxa" w:w="60"/>
-              <w:right w:type="dxa" w:w="100"/>
-            </w:tcMar>
-          </w:tcPr>
-          <w:p>
-            <w:r>
-              <w:rPr>
-                <w:rFonts w:ascii="맑은 고딕" w:cs="맑은 고딕" w:eastAsia="맑은 고딕" w:hAnsi="맑은 고딕"/>
-                <w:sz w:val="18"/>
-                <w:szCs w:val="18"/>
-              </w:rPr>
-              <w:t xml:space="preserve">DSR 100% 전환·4M 등록 완료. 신규 INQUIRY 4건 접수. 경쟁사 진입 실질 차단</w:t>
+            <w:tcW w:type="dxa" w:w="900"/>
+            <w:tcBorders>
+              <w:top w:val="single" w:color="AAAAAA" w:sz="1"/>
+              <w:left w:val="single" w:color="AAAAAA" w:sz="1"/>
+              <w:bottom w:val="single" w:color="AAAAAA" w:sz="1"/>
+              <w:right w:val="single" w:color="AAAAAA" w:sz="1"/>
+            </w:tcBorders>
+            <w:tcMar>
+              <w:top w:type="dxa" w:w="60"/>
+              <w:left w:type="dxa" w:w="100"/>
+              <w:bottom w:type="dxa" w:w="60"/>
+              <w:right w:type="dxa" w:w="100"/>
+            </w:tcMar>
+          </w:tcPr>
+          <w:p>
+            <w:r>
+              <w:rPr>
+                <w:rFonts w:ascii="맑은 고딕" w:cs="맑은 고딕" w:eastAsia="맑은 고딕" w:hAnsi="맑은 고딕"/>
+                <w:sz w:val="18"/>
+                <w:szCs w:val="18"/>
+              </w:rPr>
+              <w:t xml:space="preserve">월 2톤</w:t>
+            </w:r>
+          </w:p>
+        </w:tc>
+        <w:tc>
+          <w:tcPr>
+            <w:tcW w:type="dxa" w:w="2200"/>
+            <w:tcBorders>
+              <w:top w:val="single" w:color="AAAAAA" w:sz="1"/>
+              <w:left w:val="single" w:color="AAAAAA" w:sz="1"/>
+              <w:bottom w:val="single" w:color="AAAAAA" w:sz="1"/>
+              <w:right w:val="single" w:color="AAAAAA" w:sz="1"/>
+            </w:tcBorders>
+            <w:tcMar>
+              <w:top w:type="dxa" w:w="60"/>
+              <w:left w:type="dxa" w:w="100"/>
+              <w:bottom w:type="dxa" w:w="60"/>
+              <w:right w:type="dxa" w:w="100"/>
+            </w:tcMar>
+          </w:tcPr>
+          <w:p>
+            <w:r>
+              <w:rPr>
+                <w:rFonts w:ascii="맑은 고딕" w:cs="맑은 고딕" w:eastAsia="맑은 고딕" w:hAnsi="맑은 고딕"/>
+                <w:sz w:val="18"/>
+                <w:szCs w:val="18"/>
+              </w:rPr>
+              <w:t xml:space="preserve">안정</w:t>
+            </w:r>
+          </w:p>
+        </w:tc>
+        <w:tc>
+          <w:tcPr>
+            <w:tcW w:type="dxa" w:w="4560"/>
+            <w:tcBorders>
+              <w:top w:val="single" w:color="AAAAAA" w:sz="1"/>
+              <w:left w:val="single" w:color="AAAAAA" w:sz="1"/>
+              <w:bottom w:val="single" w:color="AAAAAA" w:sz="1"/>
+              <w:right w:val="single" w:color="AAAAAA" w:sz="1"/>
+            </w:tcBorders>
+            <w:tcMar>
+              <w:top w:type="dxa" w:w="60"/>
+              <w:left w:type="dxa" w:w="100"/>
+              <w:bottom w:type="dxa" w:w="60"/>
+              <w:right w:type="dxa" w:w="100"/>
+            </w:tcMar>
+          </w:tcPr>
+          <w:p>
+            <w:r>
+              <w:rPr>
+                <w:rFonts w:ascii="맑은 고딕" w:cs="맑은 고딕" w:eastAsia="맑은 고딕" w:hAnsi="맑은 고딕"/>
+                <w:sz w:val="18"/>
+                <w:szCs w:val="18"/>
+              </w:rPr>
+              <w:t xml:space="preserve">DSR 100% 전환·4M 등록 완료. 신규 INQUIRY 4건. 경쟁사 진입 차단</w:t>
             </w:r>
           </w:p>
         </w:tc>
@@ -902,7 +1343,7 @@
       <w:tr>
         <w:tc>
           <w:tcPr>
-            <w:tcW w:type="dxa" w:w="1800"/>
+            <w:tcW w:type="dxa" w:w="1700"/>
             <w:tcBorders>
               <w:top w:val="single" w:color="AAAAAA" w:sz="1"/>
               <w:left w:val="single" w:color="AAAAAA" w:sz="1"/>
@@ -930,55 +1371,82 @@
         </w:tc>
         <w:tc>
           <w:tcPr>
-            <w:tcW w:type="dxa" w:w="1400"/>
-            <w:tcBorders>
-              <w:top w:val="single" w:color="AAAAAA" w:sz="1"/>
-              <w:left w:val="single" w:color="AAAAAA" w:sz="1"/>
-              <w:bottom w:val="single" w:color="AAAAAA" w:sz="1"/>
-              <w:right w:val="single" w:color="AAAAAA" w:sz="1"/>
-            </w:tcBorders>
-            <w:tcMar>
-              <w:top w:type="dxa" w:w="60"/>
-              <w:left w:type="dxa" w:w="100"/>
-              <w:bottom w:type="dxa" w:w="60"/>
-              <w:right w:type="dxa" w:w="100"/>
-            </w:tcMar>
-          </w:tcPr>
-          <w:p>
-            <w:r>
-              <w:rPr>
-                <w:rFonts w:ascii="맑은 고딕" w:cs="맑은 고딕" w:eastAsia="맑은 고딕" w:hAnsi="맑은 고딕"/>
-                <w:sz w:val="18"/>
-                <w:szCs w:val="18"/>
-              </w:rPr>
-              <w:t xml:space="preserve">개척 중</w:t>
-            </w:r>
-          </w:p>
-        </w:tc>
-        <w:tc>
-          <w:tcPr>
-            <w:tcW w:type="dxa" w:w="5160"/>
-            <w:tcBorders>
-              <w:top w:val="single" w:color="AAAAAA" w:sz="1"/>
-              <w:left w:val="single" w:color="AAAAAA" w:sz="1"/>
-              <w:bottom w:val="single" w:color="AAAAAA" w:sz="1"/>
-              <w:right w:val="single" w:color="AAAAAA" w:sz="1"/>
-            </w:tcBorders>
-            <w:tcMar>
-              <w:top w:type="dxa" w:w="60"/>
-              <w:left w:type="dxa" w:w="100"/>
-              <w:bottom w:type="dxa" w:w="60"/>
-              <w:right w:type="dxa" w:w="100"/>
-            </w:tcMar>
-          </w:tcPr>
-          <w:p>
-            <w:r>
-              <w:rPr>
-                <w:rFonts w:ascii="맑은 고딕" w:cs="맑은 고딕" w:eastAsia="맑은 고딕" w:hAnsi="맑은 고딕"/>
-                <w:sz w:val="18"/>
-                <w:szCs w:val="18"/>
-              </w:rPr>
-              <w:t xml:space="preserve">신규 거래처. JINTU(중국) 직접 영업 [긴급 대응 필요]. DSR JAPAN 본사 컨택 연계 필요</w:t>
+            <w:tcW w:type="dxa" w:w="900"/>
+            <w:tcBorders>
+              <w:top w:val="single" w:color="AAAAAA" w:sz="1"/>
+              <w:left w:val="single" w:color="AAAAAA" w:sz="1"/>
+              <w:bottom w:val="single" w:color="AAAAAA" w:sz="1"/>
+              <w:right w:val="single" w:color="AAAAAA" w:sz="1"/>
+            </w:tcBorders>
+            <w:tcMar>
+              <w:top w:type="dxa" w:w="60"/>
+              <w:left w:type="dxa" w:w="100"/>
+              <w:bottom w:type="dxa" w:w="60"/>
+              <w:right w:type="dxa" w:w="100"/>
+            </w:tcMar>
+          </w:tcPr>
+          <w:p>
+            <w:r>
+              <w:rPr>
+                <w:rFonts w:ascii="맑은 고딕" w:cs="맑은 고딕" w:eastAsia="맑은 고딕" w:hAnsi="맑은 고딕"/>
+                <w:sz w:val="18"/>
+                <w:szCs w:val="18"/>
+              </w:rPr>
+              <w:t xml:space="preserve">월 25톤</w:t>
+            </w:r>
+          </w:p>
+        </w:tc>
+        <w:tc>
+          <w:tcPr>
+            <w:tcW w:type="dxa" w:w="2200"/>
+            <w:tcBorders>
+              <w:top w:val="single" w:color="AAAAAA" w:sz="1"/>
+              <w:left w:val="single" w:color="AAAAAA" w:sz="1"/>
+              <w:bottom w:val="single" w:color="AAAAAA" w:sz="1"/>
+              <w:right w:val="single" w:color="AAAAAA" w:sz="1"/>
+            </w:tcBorders>
+            <w:tcMar>
+              <w:top w:type="dxa" w:w="60"/>
+              <w:left w:type="dxa" w:w="100"/>
+              <w:bottom w:type="dxa" w:w="60"/>
+              <w:right w:type="dxa" w:w="100"/>
+            </w:tcMar>
+          </w:tcPr>
+          <w:p>
+            <w:r>
+              <w:rPr>
+                <w:rFonts w:ascii="맑은 고딕" w:cs="맑은 고딕" w:eastAsia="맑은 고딕" w:hAnsi="맑은 고딕"/>
+                <w:sz w:val="18"/>
+                <w:szCs w:val="18"/>
+              </w:rPr>
+              <w:t xml:space="preserve">신규 개척</w:t>
+            </w:r>
+          </w:p>
+        </w:tc>
+        <w:tc>
+          <w:tcPr>
+            <w:tcW w:type="dxa" w:w="4560"/>
+            <w:tcBorders>
+              <w:top w:val="single" w:color="AAAAAA" w:sz="1"/>
+              <w:left w:val="single" w:color="AAAAAA" w:sz="1"/>
+              <w:bottom w:val="single" w:color="AAAAAA" w:sz="1"/>
+              <w:right w:val="single" w:color="AAAAAA" w:sz="1"/>
+            </w:tcBorders>
+            <w:tcMar>
+              <w:top w:type="dxa" w:w="60"/>
+              <w:left w:type="dxa" w:w="100"/>
+              <w:bottom w:type="dxa" w:w="60"/>
+              <w:right w:type="dxa" w:w="100"/>
+            </w:tcMar>
+          </w:tcPr>
+          <w:p>
+            <w:r>
+              <w:rPr>
+                <w:rFonts w:ascii="맑은 고딕" w:cs="맑은 고딕" w:eastAsia="맑은 고딕" w:hAnsi="맑은 고딕"/>
+                <w:sz w:val="18"/>
+                <w:szCs w:val="18"/>
+              </w:rPr>
+              <w:t xml:space="preserve">JINTU(중국계) 직접 영업 침투 — DSR 중국 담당자 통해 즉시 제약 필요</w:t>
             </w:r>
           </w:p>
         </w:tc>
@@ -986,7 +1454,7 @@
       <w:tr>
         <w:tc>
           <w:tcPr>
-            <w:tcW w:type="dxa" w:w="1800"/>
+            <w:tcW w:type="dxa" w:w="1700"/>
             <w:tcBorders>
               <w:top w:val="single" w:color="AAAAAA" w:sz="1"/>
               <w:left w:val="single" w:color="AAAAAA" w:sz="1"/>
@@ -1014,7 +1482,34 @@
         </w:tc>
         <w:tc>
           <w:tcPr>
-            <w:tcW w:type="dxa" w:w="1400"/>
+            <w:tcW w:type="dxa" w:w="900"/>
+            <w:tcBorders>
+              <w:top w:val="single" w:color="AAAAAA" w:sz="1"/>
+              <w:left w:val="single" w:color="AAAAAA" w:sz="1"/>
+              <w:bottom w:val="single" w:color="AAAAAA" w:sz="1"/>
+              <w:right w:val="single" w:color="AAAAAA" w:sz="1"/>
+            </w:tcBorders>
+            <w:tcMar>
+              <w:top w:type="dxa" w:w="60"/>
+              <w:left w:type="dxa" w:w="100"/>
+              <w:bottom w:type="dxa" w:w="60"/>
+              <w:right w:type="dxa" w:w="100"/>
+            </w:tcMar>
+          </w:tcPr>
+          <w:p>
+            <w:r>
+              <w:rPr>
+                <w:rFonts w:ascii="맑은 고딕" w:cs="맑은 고딕" w:eastAsia="맑은 고딕" w:hAnsi="맑은 고딕"/>
+                <w:sz w:val="18"/>
+                <w:szCs w:val="18"/>
+              </w:rPr>
+              <w:t xml:space="preserve">연 40톤</w:t>
+            </w:r>
+          </w:p>
+        </w:tc>
+        <w:tc>
+          <w:tcPr>
+            <w:tcW w:type="dxa" w:w="2200"/>
             <w:tcBorders>
               <w:top w:val="single" w:color="AAAAAA" w:sz="1"/>
               <w:left w:val="single" w:color="AAAAAA" w:sz="1"/>
@@ -1041,28 +1536,28 @@
         </w:tc>
         <w:tc>
           <w:tcPr>
-            <w:tcW w:type="dxa" w:w="5160"/>
-            <w:tcBorders>
-              <w:top w:val="single" w:color="AAAAAA" w:sz="1"/>
-              <w:left w:val="single" w:color="AAAAAA" w:sz="1"/>
-              <w:bottom w:val="single" w:color="AAAAAA" w:sz="1"/>
-              <w:right w:val="single" w:color="AAAAAA" w:sz="1"/>
-            </w:tcBorders>
-            <w:tcMar>
-              <w:top w:type="dxa" w:w="60"/>
-              <w:left w:type="dxa" w:w="100"/>
-              <w:bottom w:type="dxa" w:w="60"/>
-              <w:right w:type="dxa" w:w="100"/>
-            </w:tcMar>
-          </w:tcPr>
-          <w:p>
-            <w:r>
-              <w:rPr>
-                <w:rFonts w:ascii="맑은 고딕" w:cs="맑은 고딕" w:eastAsia="맑은 고딕" w:hAnsi="맑은 고딕"/>
-                <w:sz w:val="18"/>
-                <w:szCs w:val="18"/>
-              </w:rPr>
-              <w:t xml:space="preserve">SWC G. 공급 중. 필리핀 INATEC(코일링 98대) 별도 공략 가능</w:t>
+            <w:tcW w:type="dxa" w:w="4560"/>
+            <w:tcBorders>
+              <w:top w:val="single" w:color="AAAAAA" w:sz="1"/>
+              <w:left w:val="single" w:color="AAAAAA" w:sz="1"/>
+              <w:bottom w:val="single" w:color="AAAAAA" w:sz="1"/>
+              <w:right w:val="single" w:color="AAAAAA" w:sz="1"/>
+            </w:tcBorders>
+            <w:tcMar>
+              <w:top w:type="dxa" w:w="60"/>
+              <w:left w:type="dxa" w:w="100"/>
+              <w:bottom w:type="dxa" w:w="60"/>
+              <w:right w:type="dxa" w:w="100"/>
+            </w:tcMar>
+          </w:tcPr>
+          <w:p>
+            <w:r>
+              <w:rPr>
+                <w:rFonts w:ascii="맑은 고딕" w:cs="맑은 고딕" w:eastAsia="맑은 고딕" w:hAnsi="맑은 고딕"/>
+                <w:sz w:val="18"/>
+                <w:szCs w:val="18"/>
+              </w:rPr>
+              <w:t xml:space="preserve">품질 안정화. 필리핀 INATEC(코일링 98대) 별도 공략 가능</w:t>
             </w:r>
           </w:p>
         </w:tc>
@@ -1083,7 +1578,7 @@
           <w:sz w:val="22"/>
           <w:szCs w:val="22"/>
         </w:rPr>
-        <w:t xml:space="preserve">3. 귀국 후 즉시 조치 사항</w:t>
+        <w:t xml:space="preserve">3. 귀국 후 즉시 조치 (우선순위 순)</w:t>
       </w:r>
     </w:p>
     <w:tbl>
@@ -1099,14 +1594,14 @@
         </w:tblBorders>
       </w:tblPr>
       <w:tblGrid>
-        <w:gridCol w:w="800"/>
-        <w:gridCol w:w="2400"/>
-        <w:gridCol w:w="6160"/>
+        <w:gridCol w:w="500"/>
+        <w:gridCol w:w="1800"/>
+        <w:gridCol w:w="7060"/>
       </w:tblGrid>
       <w:tr>
         <w:tc>
           <w:tcPr>
-            <w:tcW w:type="dxa" w:w="800"/>
+            <w:tcW w:type="dxa" w:w="500"/>
             <w:tcBorders>
               <w:top w:val="single" w:color="AAAAAA" w:sz="1"/>
               <w:left w:val="single" w:color="AAAAAA" w:sz="1"/>
@@ -1130,13 +1625,13 @@
                 <w:sz w:val="18"/>
                 <w:szCs w:val="18"/>
               </w:rPr>
-              <w:t xml:space="preserve">순위</w:t>
-            </w:r>
-          </w:p>
-        </w:tc>
-        <w:tc>
-          <w:tcPr>
-            <w:tcW w:type="dxa" w:w="2400"/>
+              <w:t xml:space="preserve">#</w:t>
+            </w:r>
+          </w:p>
+        </w:tc>
+        <w:tc>
+          <w:tcPr>
+            <w:tcW w:type="dxa" w:w="1800"/>
             <w:tcBorders>
               <w:top w:val="single" w:color="AAAAAA" w:sz="1"/>
               <w:left w:val="single" w:color="AAAAAA" w:sz="1"/>
@@ -1166,7 +1661,7 @@
         </w:tc>
         <w:tc>
           <w:tcPr>
-            <w:tcW w:type="dxa" w:w="6160"/>
+            <w:tcW w:type="dxa" w:w="7060"/>
             <w:tcBorders>
               <w:top w:val="single" w:color="AAAAAA" w:sz="1"/>
               <w:left w:val="single" w:color="AAAAAA" w:sz="1"/>
@@ -1198,7 +1693,7 @@
       <w:tr>
         <w:tc>
           <w:tcPr>
-            <w:tcW w:type="dxa" w:w="800"/>
+            <w:tcW w:type="dxa" w:w="500"/>
             <w:tcBorders>
               <w:top w:val="single" w:color="AAAAAA" w:sz="1"/>
               <w:left w:val="single" w:color="AAAAAA" w:sz="1"/>
@@ -1226,7 +1721,7 @@
         </w:tc>
         <w:tc>
           <w:tcPr>
-            <w:tcW w:type="dxa" w:w="2400"/>
+            <w:tcW w:type="dxa" w:w="1800"/>
             <w:tcBorders>
               <w:top w:val="single" w:color="AAAAAA" w:sz="1"/>
               <w:left w:val="single" w:color="AAAAAA" w:sz="1"/>
@@ -1253,28 +1748,28 @@
         </w:tc>
         <w:tc>
           <w:tcPr>
-            <w:tcW w:type="dxa" w:w="6160"/>
-            <w:tcBorders>
-              <w:top w:val="single" w:color="AAAAAA" w:sz="1"/>
-              <w:left w:val="single" w:color="AAAAAA" w:sz="1"/>
-              <w:bottom w:val="single" w:color="AAAAAA" w:sz="1"/>
-              <w:right w:val="single" w:color="AAAAAA" w:sz="1"/>
-            </w:tcBorders>
-            <w:tcMar>
-              <w:top w:type="dxa" w:w="60"/>
-              <w:left w:type="dxa" w:w="100"/>
-              <w:bottom w:type="dxa" w:w="60"/>
-              <w:right w:type="dxa" w:w="100"/>
-            </w:tcMar>
-          </w:tcPr>
-          <w:p>
-            <w:r>
-              <w:rPr>
-                <w:rFonts w:ascii="맑은 고딕" w:cs="맑은 고딕" w:eastAsia="맑은 고딕" w:hAnsi="맑은 고딕"/>
-                <w:sz w:val="18"/>
-                <w:szCs w:val="18"/>
-              </w:rPr>
-              <w:t xml:space="preserve">FLAT WIRE CORNER RADIUS 수치 확인 → ADVANEX 공유 (직접 요청 사항)</w:t>
+            <w:tcW w:type="dxa" w:w="7060"/>
+            <w:tcBorders>
+              <w:top w:val="single" w:color="AAAAAA" w:sz="1"/>
+              <w:left w:val="single" w:color="AAAAAA" w:sz="1"/>
+              <w:bottom w:val="single" w:color="AAAAAA" w:sz="1"/>
+              <w:right w:val="single" w:color="AAAAAA" w:sz="1"/>
+            </w:tcBorders>
+            <w:tcMar>
+              <w:top w:type="dxa" w:w="60"/>
+              <w:left w:type="dxa" w:w="100"/>
+              <w:bottom w:type="dxa" w:w="60"/>
+              <w:right w:type="dxa" w:w="100"/>
+            </w:tcMar>
+          </w:tcPr>
+          <w:p>
+            <w:r>
+              <w:rPr>
+                <w:rFonts w:ascii="맑은 고딕" w:cs="맑은 고딕" w:eastAsia="맑은 고딕" w:hAnsi="맑은 고딕"/>
+                <w:sz w:val="18"/>
+                <w:szCs w:val="18"/>
+              </w:rPr>
+              <w:t xml:space="preserve">FLAT WIRE CORNER RADIUS 수치 확인 → 공유 (거래처 직접 요청)</w:t>
             </w:r>
           </w:p>
         </w:tc>
@@ -1282,7 +1777,7 @@
       <w:tr>
         <w:tc>
           <w:tcPr>
-            <w:tcW w:type="dxa" w:w="800"/>
+            <w:tcW w:type="dxa" w:w="500"/>
             <w:tcBorders>
               <w:top w:val="single" w:color="AAAAAA" w:sz="1"/>
               <w:left w:val="single" w:color="AAAAAA" w:sz="1"/>
@@ -1310,55 +1805,55 @@
         </w:tc>
         <w:tc>
           <w:tcPr>
-            <w:tcW w:type="dxa" w:w="2400"/>
-            <w:tcBorders>
-              <w:top w:val="single" w:color="AAAAAA" w:sz="1"/>
-              <w:left w:val="single" w:color="AAAAAA" w:sz="1"/>
-              <w:bottom w:val="single" w:color="AAAAAA" w:sz="1"/>
-              <w:right w:val="single" w:color="AAAAAA" w:sz="1"/>
-            </w:tcBorders>
-            <w:tcMar>
-              <w:top w:type="dxa" w:w="60"/>
-              <w:left w:type="dxa" w:w="100"/>
-              <w:bottom w:type="dxa" w:w="60"/>
-              <w:right w:type="dxa" w:w="100"/>
-            </w:tcMar>
-          </w:tcPr>
-          <w:p>
-            <w:r>
-              <w:rPr>
-                <w:rFonts w:ascii="맑은 고딕" w:cs="맑은 고딕" w:eastAsia="맑은 고딕" w:hAnsi="맑은 고딕"/>
-                <w:sz w:val="18"/>
-                <w:szCs w:val="18"/>
-              </w:rPr>
-              <w:t xml:space="preserve">ADVANEX</w:t>
-            </w:r>
-          </w:p>
-        </w:tc>
-        <w:tc>
-          <w:tcPr>
-            <w:tcW w:type="dxa" w:w="6160"/>
-            <w:tcBorders>
-              <w:top w:val="single" w:color="AAAAAA" w:sz="1"/>
-              <w:left w:val="single" w:color="AAAAAA" w:sz="1"/>
-              <w:bottom w:val="single" w:color="AAAAAA" w:sz="1"/>
-              <w:right w:val="single" w:color="AAAAAA" w:sz="1"/>
-            </w:tcBorders>
-            <w:tcMar>
-              <w:top w:type="dxa" w:w="60"/>
-              <w:left w:type="dxa" w:w="100"/>
-              <w:bottom w:type="dxa" w:w="60"/>
-              <w:right w:type="dxa" w:w="100"/>
-            </w:tcMar>
-          </w:tcPr>
-          <w:p>
-            <w:r>
-              <w:rPr>
-                <w:rFonts w:ascii="맑은 고딕" w:cs="맑은 고딕" w:eastAsia="맑은 고딕" w:hAnsi="맑은 고딕"/>
-                <w:sz w:val="18"/>
-                <w:szCs w:val="18"/>
-              </w:rPr>
-              <w:t xml:space="preserve">클레임 접수 시 SPRING 도면 수령 프로세스 수립</w:t>
+            <w:tcW w:type="dxa" w:w="1800"/>
+            <w:tcBorders>
+              <w:top w:val="single" w:color="AAAAAA" w:sz="1"/>
+              <w:left w:val="single" w:color="AAAAAA" w:sz="1"/>
+              <w:bottom w:val="single" w:color="AAAAAA" w:sz="1"/>
+              <w:right w:val="single" w:color="AAAAAA" w:sz="1"/>
+            </w:tcBorders>
+            <w:tcMar>
+              <w:top w:type="dxa" w:w="60"/>
+              <w:left w:type="dxa" w:w="100"/>
+              <w:bottom w:type="dxa" w:w="60"/>
+              <w:right w:type="dxa" w:w="100"/>
+            </w:tcMar>
+          </w:tcPr>
+          <w:p>
+            <w:r>
+              <w:rPr>
+                <w:rFonts w:ascii="맑은 고딕" w:cs="맑은 고딕" w:eastAsia="맑은 고딕" w:hAnsi="맑은 고딕"/>
+                <w:sz w:val="18"/>
+                <w:szCs w:val="18"/>
+              </w:rPr>
+              <w:t xml:space="preserve">GOKO SPRING</w:t>
+            </w:r>
+          </w:p>
+        </w:tc>
+        <w:tc>
+          <w:tcPr>
+            <w:tcW w:type="dxa" w:w="7060"/>
+            <w:tcBorders>
+              <w:top w:val="single" w:color="AAAAAA" w:sz="1"/>
+              <w:left w:val="single" w:color="AAAAAA" w:sz="1"/>
+              <w:bottom w:val="single" w:color="AAAAAA" w:sz="1"/>
+              <w:right w:val="single" w:color="AAAAAA" w:sz="1"/>
+            </w:tcBorders>
+            <w:tcMar>
+              <w:top w:type="dxa" w:w="60"/>
+              <w:left w:type="dxa" w:w="100"/>
+              <w:bottom w:type="dxa" w:w="60"/>
+              <w:right w:type="dxa" w:w="100"/>
+            </w:tcMar>
+          </w:tcPr>
+          <w:p>
+            <w:r>
+              <w:rPr>
+                <w:rFonts w:ascii="맑은 고딕" w:cs="맑은 고딕" w:eastAsia="맑은 고딕" w:hAnsi="맑은 고딕"/>
+                <w:sz w:val="18"/>
+                <w:szCs w:val="18"/>
+              </w:rPr>
+              <w:t xml:space="preserve">VH1432P1 HW WIRE G. 1.20 불량 CAR(시정조치보고서) 즉시 발송</w:t>
             </w:r>
           </w:p>
         </w:tc>
@@ -1366,7 +1861,7 @@
       <w:tr>
         <w:tc>
           <w:tcPr>
-            <w:tcW w:type="dxa" w:w="800"/>
+            <w:tcW w:type="dxa" w:w="500"/>
             <w:tcBorders>
               <w:top w:val="single" w:color="AAAAAA" w:sz="1"/>
               <w:left w:val="single" w:color="AAAAAA" w:sz="1"/>
@@ -1394,7 +1889,7 @@
         </w:tc>
         <w:tc>
           <w:tcPr>
-            <w:tcW w:type="dxa" w:w="2400"/>
+            <w:tcW w:type="dxa" w:w="1800"/>
             <w:tcBorders>
               <w:top w:val="single" w:color="AAAAAA" w:sz="1"/>
               <w:left w:val="single" w:color="AAAAAA" w:sz="1"/>
@@ -1421,28 +1916,28 @@
         </w:tc>
         <w:tc>
           <w:tcPr>
-            <w:tcW w:type="dxa" w:w="6160"/>
-            <w:tcBorders>
-              <w:top w:val="single" w:color="AAAAAA" w:sz="1"/>
-              <w:left w:val="single" w:color="AAAAAA" w:sz="1"/>
-              <w:bottom w:val="single" w:color="AAAAAA" w:sz="1"/>
-              <w:right w:val="single" w:color="AAAAAA" w:sz="1"/>
-            </w:tcBorders>
-            <w:tcMar>
-              <w:top w:type="dxa" w:w="60"/>
-              <w:left w:type="dxa" w:w="100"/>
-              <w:bottom w:type="dxa" w:w="60"/>
-              <w:right w:type="dxa" w:w="100"/>
-            </w:tcMar>
-          </w:tcPr>
-          <w:p>
-            <w:r>
-              <w:rPr>
-                <w:rFonts w:ascii="맑은 고딕" w:cs="맑은 고딕" w:eastAsia="맑은 고딕" w:hAnsi="맑은 고딕"/>
-                <w:sz w:val="18"/>
-                <w:szCs w:val="18"/>
-              </w:rPr>
-              <w:t xml:space="preserve">VH1432P1 HW WIRE G. 1.20 불량 CAR(시정조치보고서) 신속 제출</w:t>
+            <w:tcW w:type="dxa" w:w="7060"/>
+            <w:tcBorders>
+              <w:top w:val="single" w:color="AAAAAA" w:sz="1"/>
+              <w:left w:val="single" w:color="AAAAAA" w:sz="1"/>
+              <w:bottom w:val="single" w:color="AAAAAA" w:sz="1"/>
+              <w:right w:val="single" w:color="AAAAAA" w:sz="1"/>
+            </w:tcBorders>
+            <w:tcMar>
+              <w:top w:type="dxa" w:w="60"/>
+              <w:left w:type="dxa" w:w="100"/>
+              <w:bottom w:type="dxa" w:w="60"/>
+              <w:right w:type="dxa" w:w="100"/>
+            </w:tcMar>
+          </w:tcPr>
+          <w:p>
+            <w:r>
+              <w:rPr>
+                <w:rFonts w:ascii="맑은 고딕" w:cs="맑은 고딕" w:eastAsia="맑은 고딕" w:hAnsi="맑은 고딕"/>
+                <w:sz w:val="18"/>
+                <w:szCs w:val="18"/>
+              </w:rPr>
+              <w:t xml:space="preserve">JINTU VIETNAM 베트남 직접 영업 → DSR 중국 담당자 통해 즉시 제약 요청</w:t>
             </w:r>
           </w:p>
         </w:tc>
@@ -1450,7 +1945,7 @@
       <w:tr>
         <w:tc>
           <w:tcPr>
-            <w:tcW w:type="dxa" w:w="800"/>
+            <w:tcW w:type="dxa" w:w="500"/>
             <w:tcBorders>
               <w:top w:val="single" w:color="AAAAAA" w:sz="1"/>
               <w:left w:val="single" w:color="AAAAAA" w:sz="1"/>
@@ -1478,55 +1973,55 @@
         </w:tc>
         <w:tc>
           <w:tcPr>
-            <w:tcW w:type="dxa" w:w="2400"/>
-            <w:tcBorders>
-              <w:top w:val="single" w:color="AAAAAA" w:sz="1"/>
-              <w:left w:val="single" w:color="AAAAAA" w:sz="1"/>
-              <w:bottom w:val="single" w:color="AAAAAA" w:sz="1"/>
-              <w:right w:val="single" w:color="AAAAAA" w:sz="1"/>
-            </w:tcBorders>
-            <w:tcMar>
-              <w:top w:type="dxa" w:w="60"/>
-              <w:left w:type="dxa" w:w="100"/>
-              <w:bottom w:type="dxa" w:w="60"/>
-              <w:right w:type="dxa" w:w="100"/>
-            </w:tcMar>
-          </w:tcPr>
-          <w:p>
-            <w:r>
-              <w:rPr>
-                <w:rFonts w:ascii="맑은 고딕" w:cs="맑은 고딕" w:eastAsia="맑은 고딕" w:hAnsi="맑은 고딕"/>
-                <w:sz w:val="18"/>
-                <w:szCs w:val="18"/>
-              </w:rPr>
-              <w:t xml:space="preserve">GOKO SPRING</w:t>
-            </w:r>
-          </w:p>
-        </w:tc>
-        <w:tc>
-          <w:tcPr>
-            <w:tcW w:type="dxa" w:w="6160"/>
-            <w:tcBorders>
-              <w:top w:val="single" w:color="AAAAAA" w:sz="1"/>
-              <w:left w:val="single" w:color="AAAAAA" w:sz="1"/>
-              <w:bottom w:val="single" w:color="AAAAAA" w:sz="1"/>
-              <w:right w:val="single" w:color="AAAAAA" w:sz="1"/>
-            </w:tcBorders>
-            <w:tcMar>
-              <w:top w:type="dxa" w:w="60"/>
-              <w:left w:type="dxa" w:w="100"/>
-              <w:bottom w:type="dxa" w:w="60"/>
-              <w:right w:type="dxa" w:w="100"/>
-            </w:tcMar>
-          </w:tcPr>
-          <w:p>
-            <w:r>
-              <w:rPr>
-                <w:rFonts w:ascii="맑은 고딕" w:cs="맑은 고딕" w:eastAsia="맑은 고딕" w:hAnsi="맑은 고딕"/>
-                <w:sz w:val="18"/>
-                <w:szCs w:val="18"/>
-              </w:rPr>
-              <w:t xml:space="preserve">JINTU VIETNAM 베트남 직접 영업 → DSR 중국 담당자 통해 즉시 제약 요청</w:t>
+            <w:tcW w:type="dxa" w:w="1800"/>
+            <w:tcBorders>
+              <w:top w:val="single" w:color="AAAAAA" w:sz="1"/>
+              <w:left w:val="single" w:color="AAAAAA" w:sz="1"/>
+              <w:bottom w:val="single" w:color="AAAAAA" w:sz="1"/>
+              <w:right w:val="single" w:color="AAAAAA" w:sz="1"/>
+            </w:tcBorders>
+            <w:tcMar>
+              <w:top w:type="dxa" w:w="60"/>
+              <w:left w:type="dxa" w:w="100"/>
+              <w:bottom w:type="dxa" w:w="60"/>
+              <w:right w:type="dxa" w:w="100"/>
+            </w:tcMar>
+          </w:tcPr>
+          <w:p>
+            <w:r>
+              <w:rPr>
+                <w:rFonts w:ascii="맑은 고딕" w:cs="맑은 고딕" w:eastAsia="맑은 고딕" w:hAnsi="맑은 고딕"/>
+                <w:sz w:val="18"/>
+                <w:szCs w:val="18"/>
+              </w:rPr>
+              <w:t xml:space="preserve">ADVANEX</w:t>
+            </w:r>
+          </w:p>
+        </w:tc>
+        <w:tc>
+          <w:tcPr>
+            <w:tcW w:type="dxa" w:w="7060"/>
+            <w:tcBorders>
+              <w:top w:val="single" w:color="AAAAAA" w:sz="1"/>
+              <w:left w:val="single" w:color="AAAAAA" w:sz="1"/>
+              <w:bottom w:val="single" w:color="AAAAAA" w:sz="1"/>
+              <w:right w:val="single" w:color="AAAAAA" w:sz="1"/>
+            </w:tcBorders>
+            <w:tcMar>
+              <w:top w:type="dxa" w:w="60"/>
+              <w:left w:type="dxa" w:w="100"/>
+              <w:bottom w:type="dxa" w:w="60"/>
+              <w:right w:type="dxa" w:w="100"/>
+            </w:tcMar>
+          </w:tcPr>
+          <w:p>
+            <w:r>
+              <w:rPr>
+                <w:rFonts w:ascii="맑은 고딕" w:cs="맑은 고딕" w:eastAsia="맑은 고딕" w:hAnsi="맑은 고딕"/>
+                <w:sz w:val="18"/>
+                <w:szCs w:val="18"/>
+              </w:rPr>
+              <w:t xml:space="preserve">클레임 접수 프로세스 수립 — SPRING 도면 동시 수령 체계</w:t>
             </w:r>
           </w:p>
         </w:tc>
@@ -1534,7 +2029,7 @@
       <w:tr>
         <w:tc>
           <w:tcPr>
-            <w:tcW w:type="dxa" w:w="800"/>
+            <w:tcW w:type="dxa" w:w="500"/>
             <w:tcBorders>
               <w:top w:val="single" w:color="AAAAAA" w:sz="1"/>
               <w:left w:val="single" w:color="AAAAAA" w:sz="1"/>
@@ -1562,7 +2057,7 @@
         </w:tc>
         <w:tc>
           <w:tcPr>
-            <w:tcW w:type="dxa" w:w="2400"/>
+            <w:tcW w:type="dxa" w:w="1800"/>
             <w:tcBorders>
               <w:top w:val="single" w:color="AAAAAA" w:sz="1"/>
               <w:left w:val="single" w:color="AAAAAA" w:sz="1"/>
@@ -1589,28 +2084,28 @@
         </w:tc>
         <w:tc>
           <w:tcPr>
-            <w:tcW w:type="dxa" w:w="6160"/>
-            <w:tcBorders>
-              <w:top w:val="single" w:color="AAAAAA" w:sz="1"/>
-              <w:left w:val="single" w:color="AAAAAA" w:sz="1"/>
-              <w:bottom w:val="single" w:color="AAAAAA" w:sz="1"/>
-              <w:right w:val="single" w:color="AAAAAA" w:sz="1"/>
-            </w:tcBorders>
-            <w:tcMar>
-              <w:top w:type="dxa" w:w="60"/>
-              <w:left w:type="dxa" w:w="100"/>
-              <w:bottom w:type="dxa" w:w="60"/>
-              <w:right w:type="dxa" w:w="100"/>
-            </w:tcMar>
-          </w:tcPr>
-          <w:p>
-            <w:r>
-              <w:rPr>
-                <w:rFonts w:ascii="맑은 고딕" w:cs="맑은 고딕" w:eastAsia="맑은 고딕" w:hAnsi="맑은 고딕"/>
-                <w:sz w:val="18"/>
-                <w:szCs w:val="18"/>
-              </w:rPr>
-              <w:t xml:space="preserve">SUS304CU Ø3.00/4.50MM 고객사 304CU ACCEPT 여부 확인 후 견적 제출</w:t>
+            <w:tcW w:type="dxa" w:w="7060"/>
+            <w:tcBorders>
+              <w:top w:val="single" w:color="AAAAAA" w:sz="1"/>
+              <w:left w:val="single" w:color="AAAAAA" w:sz="1"/>
+              <w:bottom w:val="single" w:color="AAAAAA" w:sz="1"/>
+              <w:right w:val="single" w:color="AAAAAA" w:sz="1"/>
+            </w:tcBorders>
+            <w:tcMar>
+              <w:top w:type="dxa" w:w="60"/>
+              <w:left w:type="dxa" w:w="100"/>
+              <w:bottom w:type="dxa" w:w="60"/>
+              <w:right w:type="dxa" w:w="100"/>
+            </w:tcMar>
+          </w:tcPr>
+          <w:p>
+            <w:r>
+              <w:rPr>
+                <w:rFonts w:ascii="맑은 고딕" w:cs="맑은 고딕" w:eastAsia="맑은 고딕" w:hAnsi="맑은 고딕"/>
+                <w:sz w:val="18"/>
+                <w:szCs w:val="18"/>
+              </w:rPr>
+              <w:t xml:space="preserve">SUS304CU Ø3.00/4.50MM 견적 제출 (고객사 CU ACCEPT 확인 후)</w:t>
             </w:r>
           </w:p>
         </w:tc>
@@ -1618,7 +2113,7 @@
       <w:tr>
         <w:tc>
           <w:tcPr>
-            <w:tcW w:type="dxa" w:w="800"/>
+            <w:tcW w:type="dxa" w:w="500"/>
             <w:tcBorders>
               <w:top w:val="single" w:color="AAAAAA" w:sz="1"/>
               <w:left w:val="single" w:color="AAAAAA" w:sz="1"/>
@@ -1646,7 +2141,7 @@
         </w:tc>
         <w:tc>
           <w:tcPr>
-            <w:tcW w:type="dxa" w:w="2400"/>
+            <w:tcW w:type="dxa" w:w="1800"/>
             <w:tcBorders>
               <w:top w:val="single" w:color="AAAAAA" w:sz="1"/>
               <w:left w:val="single" w:color="AAAAAA" w:sz="1"/>
@@ -1673,28 +2168,28 @@
         </w:tc>
         <w:tc>
           <w:tcPr>
-            <w:tcW w:type="dxa" w:w="6160"/>
-            <w:tcBorders>
-              <w:top w:val="single" w:color="AAAAAA" w:sz="1"/>
-              <w:left w:val="single" w:color="AAAAAA" w:sz="1"/>
-              <w:bottom w:val="single" w:color="AAAAAA" w:sz="1"/>
-              <w:right w:val="single" w:color="AAAAAA" w:sz="1"/>
-            </w:tcBorders>
-            <w:tcMar>
-              <w:top w:type="dxa" w:w="60"/>
-              <w:left w:type="dxa" w:w="100"/>
-              <w:bottom w:type="dxa" w:w="60"/>
-              <w:right w:type="dxa" w:w="100"/>
-            </w:tcMar>
-          </w:tcPr>
-          <w:p>
-            <w:r>
-              <w:rPr>
-                <w:rFonts w:ascii="맑은 고딕" w:cs="맑은 고딕" w:eastAsia="맑은 고딕" w:hAnsi="맑은 고딕"/>
-                <w:sz w:val="18"/>
-                <w:szCs w:val="18"/>
-              </w:rPr>
-              <w:t xml:space="preserve">STS304 2.00/2.60MM 견적 신속 제출 (일본산 교체 의향 있음)</w:t>
+            <w:tcW w:type="dxa" w:w="7060"/>
+            <w:tcBorders>
+              <w:top w:val="single" w:color="AAAAAA" w:sz="1"/>
+              <w:left w:val="single" w:color="AAAAAA" w:sz="1"/>
+              <w:bottom w:val="single" w:color="AAAAAA" w:sz="1"/>
+              <w:right w:val="single" w:color="AAAAAA" w:sz="1"/>
+            </w:tcBorders>
+            <w:tcMar>
+              <w:top w:type="dxa" w:w="60"/>
+              <w:left w:type="dxa" w:w="100"/>
+              <w:bottom w:type="dxa" w:w="60"/>
+              <w:right w:type="dxa" w:w="100"/>
+            </w:tcMar>
+          </w:tcPr>
+          <w:p>
+            <w:r>
+              <w:rPr>
+                <w:rFonts w:ascii="맑은 고딕" w:cs="맑은 고딕" w:eastAsia="맑은 고딕" w:hAnsi="맑은 고딕"/>
+                <w:sz w:val="18"/>
+                <w:szCs w:val="18"/>
+              </w:rPr>
+              <w:t xml:space="preserve">STS304 2.00/2.60MM 견적 제출 — 일본산 교체 의향 확인됨</w:t>
             </w:r>
           </w:p>
         </w:tc>
@@ -1702,7 +2197,7 @@
       <w:tr>
         <w:tc>
           <w:tcPr>
-            <w:tcW w:type="dxa" w:w="800"/>
+            <w:tcW w:type="dxa" w:w="500"/>
             <w:tcBorders>
               <w:top w:val="single" w:color="AAAAAA" w:sz="1"/>
               <w:left w:val="single" w:color="AAAAAA" w:sz="1"/>
@@ -1730,7 +2225,7 @@
         </w:tc>
         <w:tc>
           <w:tcPr>
-            <w:tcW w:type="dxa" w:w="2400"/>
+            <w:tcW w:type="dxa" w:w="1800"/>
             <w:tcBorders>
               <w:top w:val="single" w:color="AAAAAA" w:sz="1"/>
               <w:left w:val="single" w:color="AAAAAA" w:sz="1"/>
@@ -1757,28 +2252,28 @@
         </w:tc>
         <w:tc>
           <w:tcPr>
-            <w:tcW w:type="dxa" w:w="6160"/>
-            <w:tcBorders>
-              <w:top w:val="single" w:color="AAAAAA" w:sz="1"/>
-              <w:left w:val="single" w:color="AAAAAA" w:sz="1"/>
-              <w:bottom w:val="single" w:color="AAAAAA" w:sz="1"/>
-              <w:right w:val="single" w:color="AAAAAA" w:sz="1"/>
-            </w:tcBorders>
-            <w:tcMar>
-              <w:top w:type="dxa" w:w="60"/>
-              <w:left w:type="dxa" w:w="100"/>
-              <w:bottom w:type="dxa" w:w="60"/>
-              <w:right w:type="dxa" w:w="100"/>
-            </w:tcMar>
-          </w:tcPr>
-          <w:p>
-            <w:r>
-              <w:rPr>
-                <w:rFonts w:ascii="맑은 고딕" w:cs="맑은 고딕" w:eastAsia="맑은 고딕" w:hAnsi="맑은 고딕"/>
-                <w:sz w:val="18"/>
-                <w:szCs w:val="18"/>
-              </w:rPr>
-              <w:t xml:space="preserve">SWP-A 0.16MM 최소 생산 규격 확인 → MEIKO 대체 규격 제안</w:t>
+            <w:tcW w:type="dxa" w:w="7060"/>
+            <w:tcBorders>
+              <w:top w:val="single" w:color="AAAAAA" w:sz="1"/>
+              <w:left w:val="single" w:color="AAAAAA" w:sz="1"/>
+              <w:bottom w:val="single" w:color="AAAAAA" w:sz="1"/>
+              <w:right w:val="single" w:color="AAAAAA" w:sz="1"/>
+            </w:tcBorders>
+            <w:tcMar>
+              <w:top w:type="dxa" w:w="60"/>
+              <w:left w:type="dxa" w:w="100"/>
+              <w:bottom w:type="dxa" w:w="60"/>
+              <w:right w:type="dxa" w:w="100"/>
+            </w:tcMar>
+          </w:tcPr>
+          <w:p>
+            <w:r>
+              <w:rPr>
+                <w:rFonts w:ascii="맑은 고딕" w:cs="맑은 고딕" w:eastAsia="맑은 고딕" w:hAnsi="맑은 고딕"/>
+                <w:sz w:val="18"/>
+                <w:szCs w:val="18"/>
+              </w:rPr>
+              <w:t xml:space="preserve">SWP-A 0.16MM 생산 가능 여부 확인 → MEIKO에 대체 규격 제안</w:t>
             </w:r>
           </w:p>
         </w:tc>
@@ -1815,14 +2310,14 @@
         </w:tblBorders>
       </w:tblPr>
       <w:tblGrid>
-        <w:gridCol w:w="2000"/>
-        <w:gridCol w:w="1400"/>
+        <w:gridCol w:w="2100"/>
+        <w:gridCol w:w="1300"/>
         <w:gridCol w:w="5960"/>
       </w:tblGrid>
       <w:tr>
         <w:tc>
           <w:tcPr>
-            <w:tcW w:type="dxa" w:w="2000"/>
+            <w:tcW w:type="dxa" w:w="2100"/>
             <w:tcBorders>
               <w:top w:val="single" w:color="AAAAAA" w:sz="1"/>
               <w:left w:val="single" w:color="AAAAAA" w:sz="1"/>
@@ -1852,7 +2347,7 @@
         </w:tc>
         <w:tc>
           <w:tcPr>
-            <w:tcW w:type="dxa" w:w="1400"/>
+            <w:tcW w:type="dxa" w:w="1300"/>
             <w:tcBorders>
               <w:top w:val="single" w:color="AAAAAA" w:sz="1"/>
               <w:left w:val="single" w:color="AAAAAA" w:sz="1"/>
@@ -1906,7 +2401,7 @@
                 <w:sz w:val="18"/>
                 <w:szCs w:val="18"/>
               </w:rPr>
-              <w:t xml:space="preserve">진입 포인트</w:t>
+              <w:t xml:space="preserve">진입 조건</w:t>
             </w:r>
           </w:p>
         </w:tc>
@@ -1914,7 +2409,7 @@
       <w:tr>
         <w:tc>
           <w:tcPr>
-            <w:tcW w:type="dxa" w:w="2000"/>
+            <w:tcW w:type="dxa" w:w="2100"/>
             <w:tcBorders>
               <w:top w:val="single" w:color="AAAAAA" w:sz="1"/>
               <w:left w:val="single" w:color="AAAAAA" w:sz="1"/>
@@ -1936,34 +2431,34 @@
                 <w:sz w:val="18"/>
                 <w:szCs w:val="18"/>
               </w:rPr>
-              <w:t xml:space="preserve">AIKO SPRING VIETNAM</w:t>
-            </w:r>
-          </w:p>
-        </w:tc>
-        <w:tc>
-          <w:tcPr>
-            <w:tcW w:type="dxa" w:w="1400"/>
-            <w:tcBorders>
-              <w:top w:val="single" w:color="AAAAAA" w:sz="1"/>
-              <w:left w:val="single" w:color="AAAAAA" w:sz="1"/>
-              <w:bottom w:val="single" w:color="AAAAAA" w:sz="1"/>
-              <w:right w:val="single" w:color="AAAAAA" w:sz="1"/>
-            </w:tcBorders>
-            <w:tcMar>
-              <w:top w:type="dxa" w:w="60"/>
-              <w:left w:type="dxa" w:w="100"/>
-              <w:bottom w:type="dxa" w:w="60"/>
-              <w:right w:type="dxa" w:w="100"/>
-            </w:tcMar>
-          </w:tcPr>
-          <w:p>
-            <w:r>
-              <w:rPr>
-                <w:rFonts w:ascii="맑은 고딕" w:cs="맑은 고딕" w:eastAsia="맑은 고딕" w:hAnsi="맑은 고딕"/>
-                <w:sz w:val="18"/>
-                <w:szCs w:val="18"/>
-              </w:rPr>
-              <w:t xml:space="preserve">연 100톤+</w:t>
+              <w:t xml:space="preserve">LONGTECH PRECISION</w:t>
+            </w:r>
+          </w:p>
+        </w:tc>
+        <w:tc>
+          <w:tcPr>
+            <w:tcW w:type="dxa" w:w="1300"/>
+            <w:tcBorders>
+              <w:top w:val="single" w:color="AAAAAA" w:sz="1"/>
+              <w:left w:val="single" w:color="AAAAAA" w:sz="1"/>
+              <w:bottom w:val="single" w:color="AAAAAA" w:sz="1"/>
+              <w:right w:val="single" w:color="AAAAAA" w:sz="1"/>
+            </w:tcBorders>
+            <w:tcMar>
+              <w:top w:type="dxa" w:w="60"/>
+              <w:left w:type="dxa" w:w="100"/>
+              <w:bottom w:type="dxa" w:w="60"/>
+              <w:right w:type="dxa" w:w="100"/>
+            </w:tcMar>
+          </w:tcPr>
+          <w:p>
+            <w:r>
+              <w:rPr>
+                <w:rFonts w:ascii="맑은 고딕" w:cs="맑은 고딕" w:eastAsia="맑은 고딕" w:hAnsi="맑은 고딕"/>
+                <w:sz w:val="18"/>
+                <w:szCs w:val="18"/>
+              </w:rPr>
+              <w:t xml:space="preserve">연 300톤</w:t>
             </w:r>
           </w:p>
         </w:tc>
@@ -1990,7 +2485,7 @@
                 <w:sz w:val="18"/>
                 <w:szCs w:val="18"/>
               </w:rPr>
-              <w:t xml:space="preserve">SUS304 WPB S-CO 0.20-0.45MM. 가격 조건 조율 + 4M 승인 지원 필요</w:t>
+              <w:t xml:space="preserve">PIANO WIRE 150톤 우선 공략. SWC는 중국산 전환으로 단기 진입 어려움</w:t>
             </w:r>
           </w:p>
         </w:tc>
@@ -1998,7 +2493,7 @@
       <w:tr>
         <w:tc>
           <w:tcPr>
-            <w:tcW w:type="dxa" w:w="2000"/>
+            <w:tcW w:type="dxa" w:w="2100"/>
             <w:tcBorders>
               <w:top w:val="single" w:color="AAAAAA" w:sz="1"/>
               <w:left w:val="single" w:color="AAAAAA" w:sz="1"/>
@@ -2020,34 +2515,34 @@
                 <w:sz w:val="18"/>
                 <w:szCs w:val="18"/>
               </w:rPr>
-              <w:t xml:space="preserve">EAST STAR PRINTING</w:t>
-            </w:r>
-          </w:p>
-        </w:tc>
-        <w:tc>
-          <w:tcPr>
-            <w:tcW w:type="dxa" w:w="1400"/>
-            <w:tcBorders>
-              <w:top w:val="single" w:color="AAAAAA" w:sz="1"/>
-              <w:left w:val="single" w:color="AAAAAA" w:sz="1"/>
-              <w:bottom w:val="single" w:color="AAAAAA" w:sz="1"/>
-              <w:right w:val="single" w:color="AAAAAA" w:sz="1"/>
-            </w:tcBorders>
-            <w:tcMar>
-              <w:top w:type="dxa" w:w="60"/>
-              <w:left w:type="dxa" w:w="100"/>
-              <w:bottom w:type="dxa" w:w="60"/>
-              <w:right w:type="dxa" w:w="100"/>
-            </w:tcMar>
-          </w:tcPr>
-          <w:p>
-            <w:r>
-              <w:rPr>
-                <w:rFonts w:ascii="맑은 고딕" w:cs="맑은 고딕" w:eastAsia="맑은 고딕" w:hAnsi="맑은 고딕"/>
-                <w:sz w:val="18"/>
-                <w:szCs w:val="18"/>
-              </w:rPr>
-              <w:t xml:space="preserve">연 90톤</w:t>
+              <w:t xml:space="preserve">AIKO SPRING VN</w:t>
+            </w:r>
+          </w:p>
+        </w:tc>
+        <w:tc>
+          <w:tcPr>
+            <w:tcW w:type="dxa" w:w="1300"/>
+            <w:tcBorders>
+              <w:top w:val="single" w:color="AAAAAA" w:sz="1"/>
+              <w:left w:val="single" w:color="AAAAAA" w:sz="1"/>
+              <w:bottom w:val="single" w:color="AAAAAA" w:sz="1"/>
+              <w:right w:val="single" w:color="AAAAAA" w:sz="1"/>
+            </w:tcBorders>
+            <w:tcMar>
+              <w:top w:type="dxa" w:w="60"/>
+              <w:left w:type="dxa" w:w="100"/>
+              <w:bottom w:type="dxa" w:w="60"/>
+              <w:right w:type="dxa" w:w="100"/>
+            </w:tcMar>
+          </w:tcPr>
+          <w:p>
+            <w:r>
+              <w:rPr>
+                <w:rFonts w:ascii="맑은 고딕" w:cs="맑은 고딕" w:eastAsia="맑은 고딕" w:hAnsi="맑은 고딕"/>
+                <w:sz w:val="18"/>
+                <w:szCs w:val="18"/>
+              </w:rPr>
+              <w:t xml:space="preserve">연 100톤+</w:t>
             </w:r>
           </w:p>
         </w:tc>
@@ -2074,7 +2569,7 @@
                 <w:sz w:val="18"/>
                 <w:szCs w:val="18"/>
               </w:rPr>
-              <w:t xml:space="preserve">SWP-B 60톤 + STS 30톤. 샘플 + 4M 지원</w:t>
+              <w:t xml:space="preserve">SUS304 WPB S-CO 0.20-0.45MM. 가격 경쟁력 + 4M 승인 지원 필요</w:t>
             </w:r>
           </w:p>
         </w:tc>
@@ -2082,7 +2577,7 @@
       <w:tr>
         <w:tc>
           <w:tcPr>
-            <w:tcW w:type="dxa" w:w="2000"/>
+            <w:tcW w:type="dxa" w:w="2100"/>
             <w:tcBorders>
               <w:top w:val="single" w:color="AAAAAA" w:sz="1"/>
               <w:left w:val="single" w:color="AAAAAA" w:sz="1"/>
@@ -2104,34 +2599,34 @@
                 <w:sz w:val="18"/>
                 <w:szCs w:val="18"/>
               </w:rPr>
-              <w:t xml:space="preserve">LONGTECH PRECISION</w:t>
-            </w:r>
-          </w:p>
-        </w:tc>
-        <w:tc>
-          <w:tcPr>
-            <w:tcW w:type="dxa" w:w="1400"/>
-            <w:tcBorders>
-              <w:top w:val="single" w:color="AAAAAA" w:sz="1"/>
-              <w:left w:val="single" w:color="AAAAAA" w:sz="1"/>
-              <w:bottom w:val="single" w:color="AAAAAA" w:sz="1"/>
-              <w:right w:val="single" w:color="AAAAAA" w:sz="1"/>
-            </w:tcBorders>
-            <w:tcMar>
-              <w:top w:type="dxa" w:w="60"/>
-              <w:left w:type="dxa" w:w="100"/>
-              <w:bottom w:type="dxa" w:w="60"/>
-              <w:right w:type="dxa" w:w="100"/>
-            </w:tcMar>
-          </w:tcPr>
-          <w:p>
-            <w:r>
-              <w:rPr>
-                <w:rFonts w:ascii="맑은 고딕" w:cs="맑은 고딕" w:eastAsia="맑은 고딕" w:hAnsi="맑은 고딕"/>
-                <w:sz w:val="18"/>
-                <w:szCs w:val="18"/>
-              </w:rPr>
-              <w:t xml:space="preserve">연 300톤</w:t>
+              <w:t xml:space="preserve">EAST STAR PRINTING</w:t>
+            </w:r>
+          </w:p>
+        </w:tc>
+        <w:tc>
+          <w:tcPr>
+            <w:tcW w:type="dxa" w:w="1300"/>
+            <w:tcBorders>
+              <w:top w:val="single" w:color="AAAAAA" w:sz="1"/>
+              <w:left w:val="single" w:color="AAAAAA" w:sz="1"/>
+              <w:bottom w:val="single" w:color="AAAAAA" w:sz="1"/>
+              <w:right w:val="single" w:color="AAAAAA" w:sz="1"/>
+            </w:tcBorders>
+            <w:tcMar>
+              <w:top w:type="dxa" w:w="60"/>
+              <w:left w:type="dxa" w:w="100"/>
+              <w:bottom w:type="dxa" w:w="60"/>
+              <w:right w:type="dxa" w:w="100"/>
+            </w:tcMar>
+          </w:tcPr>
+          <w:p>
+            <w:r>
+              <w:rPr>
+                <w:rFonts w:ascii="맑은 고딕" w:cs="맑은 고딕" w:eastAsia="맑은 고딕" w:hAnsi="맑은 고딕"/>
+                <w:sz w:val="18"/>
+                <w:szCs w:val="18"/>
+              </w:rPr>
+              <w:t xml:space="preserve">연 90톤</w:t>
             </w:r>
           </w:p>
         </w:tc>
@@ -2158,7 +2653,7 @@
                 <w:sz w:val="18"/>
                 <w:szCs w:val="18"/>
               </w:rPr>
-              <w:t xml:space="preserve">PIANO WIRE 150톤 공략. SWC는 중국산 전환으로 단기 어려움</w:t>
+              <w:t xml:space="preserve">SWP-B 60톤 + STS 30톤. 샘플 제공 후 4M 승인</w:t>
             </w:r>
           </w:p>
         </w:tc>
@@ -2166,7 +2661,7 @@
       <w:tr>
         <w:tc>
           <w:tcPr>
-            <w:tcW w:type="dxa" w:w="2000"/>
+            <w:tcW w:type="dxa" w:w="2100"/>
             <w:tcBorders>
               <w:top w:val="single" w:color="AAAAAA" w:sz="1"/>
               <w:left w:val="single" w:color="AAAAAA" w:sz="1"/>
@@ -2188,13 +2683,13 @@
                 <w:sz w:val="18"/>
                 <w:szCs w:val="18"/>
               </w:rPr>
-              <w:t xml:space="preserve">JYOHOKU SPRINGS SAIGON</w:t>
-            </w:r>
-          </w:p>
-        </w:tc>
-        <w:tc>
-          <w:tcPr>
-            <w:tcW w:type="dxa" w:w="1400"/>
+              <w:t xml:space="preserve">JYOHOKU SPRINGS</w:t>
+            </w:r>
+          </w:p>
+        </w:tc>
+        <w:tc>
+          <w:tcPr>
+            <w:tcW w:type="dxa" w:w="1300"/>
             <w:tcBorders>
               <w:top w:val="single" w:color="AAAAAA" w:sz="1"/>
               <w:left w:val="single" w:color="AAAAAA" w:sz="1"/>
@@ -2242,7 +2737,7 @@
                 <w:sz w:val="18"/>
                 <w:szCs w:val="18"/>
               </w:rPr>
-              <w:t xml:space="preserve">한국산 WIRE B/L 확인됨. ORISTAR 검증 피드백 후 방문</w:t>
+              <w:t xml:space="preserve">한국산 WIRE B/L 수입 확인. ORISTAR 검증 완료 후 방문</w:t>
             </w:r>
           </w:p>
         </w:tc>
@@ -2250,7 +2745,7 @@
       <w:tr>
         <w:tc>
           <w:tcPr>
-            <w:tcW w:type="dxa" w:w="2000"/>
+            <w:tcW w:type="dxa" w:w="2100"/>
             <w:tcBorders>
               <w:top w:val="single" w:color="AAAAAA" w:sz="1"/>
               <w:left w:val="single" w:color="AAAAAA" w:sz="1"/>
@@ -2278,7 +2773,7 @@
         </w:tc>
         <w:tc>
           <w:tcPr>
-            <w:tcW w:type="dxa" w:w="1400"/>
+            <w:tcW w:type="dxa" w:w="1300"/>
             <w:tcBorders>
               <w:top w:val="single" w:color="AAAAAA" w:sz="1"/>
               <w:left w:val="single" w:color="AAAAAA" w:sz="1"/>
@@ -2326,7 +2821,7 @@
                 <w:sz w:val="18"/>
                 <w:szCs w:val="18"/>
               </w:rPr>
-              <w:t xml:space="preserve">HYUNDAI/KIA TIER-1. ORISTAR 검증 피드백 후 방문</w:t>
+              <w:t xml:space="preserve">HYUNDAI/KIA TIER-1. ORISTAR 검증 완료 후 방문</w:t>
             </w:r>
           </w:p>
         </w:tc>
@@ -2347,69 +2842,259 @@
           <w:sz w:val="22"/>
           <w:szCs w:val="22"/>
         </w:rPr>
-        <w:t xml:space="preserve">5. ORISTAR 대리점 리스크</w:t>
+        <w:t xml:space="preserve">5. ORISTAR 대리점 관리 리스크</w:t>
       </w:r>
     </w:p>
-    <w:p>
-      <w:pPr>
-        <w:pStyle w:val="ListParagraph"/>
-        <w:numPr>
-          <w:ilvl w:val="0"/>
-          <w:numId w:val="1"/>
-        </w:numPr>
-        <w:spacing w:after="0" w:before="0"/>
-      </w:pPr>
-      <w:r>
-        <w:rPr>
-          <w:rFonts w:ascii="맑은 고딕" w:cs="맑은 고딕" w:eastAsia="맑은 고딕" w:hAnsi="맑은 고딕"/>
-          <w:b/>
-          <w:bCs/>
-          <w:sz w:val="19"/>
-          <w:szCs w:val="19"/>
-        </w:rPr>
-        <w:t xml:space="preserve">MR. VU TRI TOAN (15년 근속 구매 담당) 퇴사 예정 → 후임 조기 파악·관계 구축 필요</w:t>
-      </w:r>
-    </w:p>
-    <w:p>
-      <w:pPr>
-        <w:pStyle w:val="ListParagraph"/>
-        <w:numPr>
-          <w:ilvl w:val="0"/>
-          <w:numId w:val="1"/>
-        </w:numPr>
-        <w:spacing w:after="0" w:before="0"/>
-      </w:pPr>
-      <w:r>
-        <w:rPr>
-          <w:rFonts w:ascii="맑은 고딕" w:cs="맑은 고딕" w:eastAsia="맑은 고딕" w:hAnsi="맑은 고딕"/>
-          <w:b w:val="false"/>
-          <w:bCs w:val="false"/>
-          <w:sz w:val="19"/>
-          <w:szCs w:val="19"/>
-        </w:rPr>
-        <w:t xml:space="preserve">WIRE 매출이 ORISTAR 전체의 5% 미만 → DSR이 먼저 거래처 개발 지원하여 동기 부여 필요</w:t>
-      </w:r>
-    </w:p>
-    <w:p>
-      <w:pPr>
-        <w:pStyle w:val="ListParagraph"/>
-        <w:numPr>
-          <w:ilvl w:val="0"/>
-          <w:numId w:val="1"/>
-        </w:numPr>
-        <w:spacing w:after="0" w:before="0"/>
-      </w:pPr>
-      <w:r>
-        <w:rPr>
-          <w:rFonts w:ascii="맑은 고딕" w:cs="맑은 고딕" w:eastAsia="맑은 고딕" w:hAnsi="맑은 고딕"/>
-          <w:b w:val="false"/>
-          <w:bCs w:val="false"/>
-          <w:sz w:val="19"/>
-          <w:szCs w:val="19"/>
-        </w:rPr>
-        <w:t xml:space="preserve">DAICHI(KIS/고려제강), BEKAERT(중국산) ORISTAR 직접 공략 중 → 관계 강화 필요</w:t>
-      </w:r>
-    </w:p>
+    <w:tbl>
+      <w:tblPr>
+        <w:tblW w:type="dxa" w:w="9360"/>
+        <w:tblBorders>
+          <w:top w:val="single" w:color="auto" w:sz="4"/>
+          <w:left w:val="single" w:color="auto" w:sz="4"/>
+          <w:bottom w:val="single" w:color="auto" w:sz="4"/>
+          <w:right w:val="single" w:color="auto" w:sz="4"/>
+          <w:insideH w:val="single" w:color="auto" w:sz="4"/>
+          <w:insideV w:val="single" w:color="auto" w:sz="4"/>
+        </w:tblBorders>
+      </w:tblPr>
+      <w:tblGrid>
+        <w:gridCol w:w="3000"/>
+        <w:gridCol w:w="6360"/>
+      </w:tblGrid>
+      <w:tr>
+        <w:tc>
+          <w:tcPr>
+            <w:tcW w:type="dxa" w:w="3000"/>
+            <w:tcBorders>
+              <w:top w:val="single" w:color="AAAAAA" w:sz="1"/>
+              <w:left w:val="single" w:color="AAAAAA" w:sz="1"/>
+              <w:bottom w:val="single" w:color="AAAAAA" w:sz="1"/>
+              <w:right w:val="single" w:color="AAAAAA" w:sz="1"/>
+            </w:tcBorders>
+            <w:shd w:fill="DEDEDE" w:val="clear"/>
+            <w:tcMar>
+              <w:top w:type="dxa" w:w="60"/>
+              <w:left w:type="dxa" w:w="100"/>
+              <w:bottom w:type="dxa" w:w="60"/>
+              <w:right w:type="dxa" w:w="100"/>
+            </w:tcMar>
+          </w:tcPr>
+          <w:p>
+            <w:r>
+              <w:rPr>
+                <w:rFonts w:ascii="맑은 고딕" w:cs="맑은 고딕" w:eastAsia="맑은 고딕" w:hAnsi="맑은 고딕"/>
+                <w:b/>
+                <w:bCs/>
+                <w:sz w:val="18"/>
+                <w:szCs w:val="18"/>
+              </w:rPr>
+              <w:t xml:space="preserve">리스크</w:t>
+            </w:r>
+          </w:p>
+        </w:tc>
+        <w:tc>
+          <w:tcPr>
+            <w:tcW w:type="dxa" w:w="6360"/>
+            <w:tcBorders>
+              <w:top w:val="single" w:color="AAAAAA" w:sz="1"/>
+              <w:left w:val="single" w:color="AAAAAA" w:sz="1"/>
+              <w:bottom w:val="single" w:color="AAAAAA" w:sz="1"/>
+              <w:right w:val="single" w:color="AAAAAA" w:sz="1"/>
+            </w:tcBorders>
+            <w:shd w:fill="DEDEDE" w:val="clear"/>
+            <w:tcMar>
+              <w:top w:type="dxa" w:w="60"/>
+              <w:left w:type="dxa" w:w="100"/>
+              <w:bottom w:type="dxa" w:w="60"/>
+              <w:right w:type="dxa" w:w="100"/>
+            </w:tcMar>
+          </w:tcPr>
+          <w:p>
+            <w:r>
+              <w:rPr>
+                <w:rFonts w:ascii="맑은 고딕" w:cs="맑은 고딕" w:eastAsia="맑은 고딕" w:hAnsi="맑은 고딕"/>
+                <w:b/>
+                <w:bCs/>
+                <w:sz w:val="18"/>
+                <w:szCs w:val="18"/>
+              </w:rPr>
+              <w:t xml:space="preserve">대응 방향</w:t>
+            </w:r>
+          </w:p>
+        </w:tc>
+      </w:tr>
+      <w:tr>
+        <w:tc>
+          <w:tcPr>
+            <w:tcW w:type="dxa" w:w="3000"/>
+            <w:tcBorders>
+              <w:top w:val="single" w:color="AAAAAA" w:sz="1"/>
+              <w:left w:val="single" w:color="AAAAAA" w:sz="1"/>
+              <w:bottom w:val="single" w:color="AAAAAA" w:sz="1"/>
+              <w:right w:val="single" w:color="AAAAAA" w:sz="1"/>
+            </w:tcBorders>
+            <w:shd w:fill="F2F2F2" w:val="clear"/>
+            <w:tcMar>
+              <w:top w:type="dxa" w:w="60"/>
+              <w:left w:type="dxa" w:w="100"/>
+              <w:bottom w:type="dxa" w:w="60"/>
+              <w:right w:type="dxa" w:w="100"/>
+            </w:tcMar>
+          </w:tcPr>
+          <w:p>
+            <w:r>
+              <w:rPr>
+                <w:rFonts w:ascii="맑은 고딕" w:cs="맑은 고딕" w:eastAsia="맑은 고딕" w:hAnsi="맑은 고딕"/>
+                <w:sz w:val="18"/>
+                <w:szCs w:val="18"/>
+              </w:rPr>
+              <w:t xml:space="preserve">MR. VU TRI TOAN 퇴사 예정 (15년 근속 구매 담당)</w:t>
+            </w:r>
+          </w:p>
+        </w:tc>
+        <w:tc>
+          <w:tcPr>
+            <w:tcW w:type="dxa" w:w="6360"/>
+            <w:tcBorders>
+              <w:top w:val="single" w:color="AAAAAA" w:sz="1"/>
+              <w:left w:val="single" w:color="AAAAAA" w:sz="1"/>
+              <w:bottom w:val="single" w:color="AAAAAA" w:sz="1"/>
+              <w:right w:val="single" w:color="AAAAAA" w:sz="1"/>
+            </w:tcBorders>
+            <w:tcMar>
+              <w:top w:type="dxa" w:w="60"/>
+              <w:left w:type="dxa" w:w="100"/>
+              <w:bottom w:type="dxa" w:w="60"/>
+              <w:right w:type="dxa" w:w="100"/>
+            </w:tcMar>
+          </w:tcPr>
+          <w:p>
+            <w:r>
+              <w:rPr>
+                <w:rFonts w:ascii="맑은 고딕" w:cs="맑은 고딕" w:eastAsia="맑은 고딕" w:hAnsi="맑은 고딕"/>
+                <w:sz w:val="18"/>
+                <w:szCs w:val="18"/>
+              </w:rPr>
+              <w:t xml:space="preserve">후임 담당자 조기 파악 및 관계 구축. 복수 담당자 확보</w:t>
+            </w:r>
+          </w:p>
+        </w:tc>
+      </w:tr>
+      <w:tr>
+        <w:tc>
+          <w:tcPr>
+            <w:tcW w:type="dxa" w:w="3000"/>
+            <w:tcBorders>
+              <w:top w:val="single" w:color="AAAAAA" w:sz="1"/>
+              <w:left w:val="single" w:color="AAAAAA" w:sz="1"/>
+              <w:bottom w:val="single" w:color="AAAAAA" w:sz="1"/>
+              <w:right w:val="single" w:color="AAAAAA" w:sz="1"/>
+            </w:tcBorders>
+            <w:shd w:fill="F2F2F2" w:val="clear"/>
+            <w:tcMar>
+              <w:top w:type="dxa" w:w="60"/>
+              <w:left w:type="dxa" w:w="100"/>
+              <w:bottom w:type="dxa" w:w="60"/>
+              <w:right w:type="dxa" w:w="100"/>
+            </w:tcMar>
+          </w:tcPr>
+          <w:p>
+            <w:r>
+              <w:rPr>
+                <w:rFonts w:ascii="맑은 고딕" w:cs="맑은 고딕" w:eastAsia="맑은 고딕" w:hAnsi="맑은 고딕"/>
+                <w:sz w:val="18"/>
+                <w:szCs w:val="18"/>
+              </w:rPr>
+              <w:t xml:space="preserve">WIRE 매출 ORISTAR 전체의 5% 미만 — 우선순위 낮음</w:t>
+            </w:r>
+          </w:p>
+        </w:tc>
+        <w:tc>
+          <w:tcPr>
+            <w:tcW w:type="dxa" w:w="6360"/>
+            <w:tcBorders>
+              <w:top w:val="single" w:color="AAAAAA" w:sz="1"/>
+              <w:left w:val="single" w:color="AAAAAA" w:sz="1"/>
+              <w:bottom w:val="single" w:color="AAAAAA" w:sz="1"/>
+              <w:right w:val="single" w:color="AAAAAA" w:sz="1"/>
+            </w:tcBorders>
+            <w:tcMar>
+              <w:top w:type="dxa" w:w="60"/>
+              <w:left w:type="dxa" w:w="100"/>
+              <w:bottom w:type="dxa" w:w="60"/>
+              <w:right w:type="dxa" w:w="100"/>
+            </w:tcMar>
+          </w:tcPr>
+          <w:p>
+            <w:r>
+              <w:rPr>
+                <w:rFonts w:ascii="맑은 고딕" w:cs="맑은 고딕" w:eastAsia="맑은 고딕" w:hAnsi="맑은 고딕"/>
+                <w:sz w:val="18"/>
+                <w:szCs w:val="18"/>
+              </w:rPr>
+              <w:t xml:space="preserve">DSR이 먼저 거래처 개발 지원하여 ORISTAR 동기 부여</w:t>
+            </w:r>
+          </w:p>
+        </w:tc>
+      </w:tr>
+      <w:tr>
+        <w:tc>
+          <w:tcPr>
+            <w:tcW w:type="dxa" w:w="3000"/>
+            <w:tcBorders>
+              <w:top w:val="single" w:color="AAAAAA" w:sz="1"/>
+              <w:left w:val="single" w:color="AAAAAA" w:sz="1"/>
+              <w:bottom w:val="single" w:color="AAAAAA" w:sz="1"/>
+              <w:right w:val="single" w:color="AAAAAA" w:sz="1"/>
+            </w:tcBorders>
+            <w:shd w:fill="F2F2F2" w:val="clear"/>
+            <w:tcMar>
+              <w:top w:type="dxa" w:w="60"/>
+              <w:left w:type="dxa" w:w="100"/>
+              <w:bottom w:type="dxa" w:w="60"/>
+              <w:right w:type="dxa" w:w="100"/>
+            </w:tcMar>
+          </w:tcPr>
+          <w:p>
+            <w:r>
+              <w:rPr>
+                <w:rFonts w:ascii="맑은 고딕" w:cs="맑은 고딕" w:eastAsia="맑은 고딕" w:hAnsi="맑은 고딕"/>
+                <w:sz w:val="18"/>
+                <w:szCs w:val="18"/>
+              </w:rPr>
+              <w:t xml:space="preserve">DAICHI(KIS), BEKAERT(중국산) ORISTAR 직접 공략 중</w:t>
+            </w:r>
+          </w:p>
+        </w:tc>
+        <w:tc>
+          <w:tcPr>
+            <w:tcW w:type="dxa" w:w="6360"/>
+            <w:tcBorders>
+              <w:top w:val="single" w:color="AAAAAA" w:sz="1"/>
+              <w:left w:val="single" w:color="AAAAAA" w:sz="1"/>
+              <w:bottom w:val="single" w:color="AAAAAA" w:sz="1"/>
+              <w:right w:val="single" w:color="AAAAAA" w:sz="1"/>
+            </w:tcBorders>
+            <w:tcMar>
+              <w:top w:type="dxa" w:w="60"/>
+              <w:left w:type="dxa" w:w="100"/>
+              <w:bottom w:type="dxa" w:w="60"/>
+              <w:right w:type="dxa" w:w="100"/>
+            </w:tcMar>
+          </w:tcPr>
+          <w:p>
+            <w:r>
+              <w:rPr>
+                <w:rFonts w:ascii="맑은 고딕" w:cs="맑은 고딕" w:eastAsia="맑은 고딕" w:hAnsi="맑은 고딕"/>
+                <w:sz w:val="18"/>
+                <w:szCs w:val="18"/>
+              </w:rPr>
+              <w:t xml:space="preserve">주요 거래처 정기 공유 체계 수립으로 관계 강화</w:t>
+            </w:r>
+          </w:p>
+        </w:tc>
+      </w:tr>
+    </w:tbl>
     <w:sectPr>
       <w:footerReference w:type="default" r:id="rId7"/>
       <w:pgSz w:w="11906" w:h="16838" w:orient="portrait"/>

</xml_diff>

<commit_message>
Revise summary: add interpretation text, improve account section, plain text for risks
</commit_message>
<xml_diff>
--- a/2026-06-14_Oristar_Vietnam_Sales_Analysis_SUMMARY.docx
+++ b/2026-06-14_Oristar_Vietnam_Sales_Analysis_SUMMARY.docx
@@ -564,7 +564,7 @@
                 <w:sz w:val="18"/>
                 <w:szCs w:val="18"/>
               </w:rPr>
-              <w:t xml:space="preserve">2025 연간(137톤) 이미 초과. YANGMIN 대경 WIRE 대량 발주가 주도 — 연환산 400톤 페이스</w:t>
+              <w:t xml:space="preserve">2025 연간(137톤) 이미 초과. YANGMIN 대경 WIRE 대량 발주 주도</w:t>
             </w:r>
           </w:p>
         </w:tc>
@@ -648,7 +648,7 @@
                 <w:sz w:val="18"/>
                 <w:szCs w:val="18"/>
               </w:rPr>
-              <w:t xml:space="preserve">2025 회복 후 소폭 둔화. YANGMIN 4.20MM 수요 동향 확인 필요</w:t>
+              <w:t xml:space="preserve">2025 회복 후 소폭 둔화. 수요 동향 지속 모니터링 필요</w:t>
             </w:r>
           </w:p>
         </w:tc>
@@ -732,12 +732,42 @@
                 <w:sz w:val="18"/>
                 <w:szCs w:val="18"/>
               </w:rPr>
-              <w:t xml:space="preserve">구조적 감소 지속. 고객 이탈 원인 파악 필요</w:t>
+              <w:t xml:space="preserve">구조적 감소 지속</w:t>
             </w:r>
           </w:p>
         </w:tc>
       </w:tr>
     </w:tbl>
+    <w:p>
+      <w:pPr>
+        <w:spacing w:after="0" w:before="0"/>
+      </w:pPr>
+      <w:r>
+        <w:rPr>
+          <w:rFonts w:ascii="맑은 고딕" w:cs="맑은 고딕" w:eastAsia="맑은 고딕" w:hAnsi="맑은 고딕"/>
+          <w:b w:val="false"/>
+          <w:bCs w:val="false"/>
+          <w:sz w:val="19"/>
+          <w:szCs w:val="19"/>
+        </w:rPr>
+        <w:t xml:space="preserve"/>
+      </w:r>
+    </w:p>
+    <w:p>
+      <w:pPr>
+        <w:spacing w:after="0" w:before="0"/>
+      </w:pPr>
+      <w:r>
+        <w:rPr>
+          <w:rFonts w:ascii="맑은 고딕" w:cs="맑은 고딕" w:eastAsia="맑은 고딕" w:hAnsi="맑은 고딕"/>
+          <w:b w:val="false"/>
+          <w:bCs w:val="false"/>
+          <w:sz w:val="19"/>
+          <w:szCs w:val="19"/>
+        </w:rPr>
+        <w:t xml:space="preserve">2024-2025년 연속 성장에 이어 2026년은 PIANO WIRE의 급격한 수요 확대로 연간 최고치 달성이 유력함. 특히 YANGMIN이 기존 OT WIRE 중심 거래 구조에서 벗어나 대경 PIANO WIRE(3.00-3.50MM)를 대량 발주하기 시작한 것이 핵심 변수로, 이 흐름이 하반기에도 지속되는지 여부가 2026년 전체 실적을 좌우할 것으로 판단됨.</w:t>
+      </w:r>
+    </w:p>
     <w:p>
       <w:pPr>
         <w:pBdr>
@@ -770,9 +800,8 @@
       </w:tblPr>
       <w:tblGrid>
         <w:gridCol w:w="1700"/>
-        <w:gridCol w:w="900"/>
-        <w:gridCol w:w="2200"/>
-        <w:gridCol w:w="4560"/>
+        <w:gridCol w:w="1000"/>
+        <w:gridCol w:w="6660"/>
       </w:tblGrid>
       <w:tr>
         <w:tc>
@@ -807,7 +836,7 @@
         </w:tc>
         <w:tc>
           <w:tcPr>
-            <w:tcW w:type="dxa" w:w="900"/>
+            <w:tcW w:type="dxa" w:w="1000"/>
             <w:tcBorders>
               <w:top w:val="single" w:color="AAAAAA" w:sz="1"/>
               <w:left w:val="single" w:color="AAAAAA" w:sz="1"/>
@@ -837,7 +866,7 @@
         </w:tc>
         <w:tc>
           <w:tcPr>
-            <w:tcW w:type="dxa" w:w="2200"/>
+            <w:tcW w:type="dxa" w:w="6660"/>
             <w:tcBorders>
               <w:top w:val="single" w:color="AAAAAA" w:sz="1"/>
               <w:left w:val="single" w:color="AAAAAA" w:sz="1"/>
@@ -861,37 +890,7 @@
                 <w:sz w:val="18"/>
                 <w:szCs w:val="18"/>
               </w:rPr>
-              <w:t xml:space="preserve">상태</w:t>
-            </w:r>
-          </w:p>
-        </w:tc>
-        <w:tc>
-          <w:tcPr>
-            <w:tcW w:type="dxa" w:w="4560"/>
-            <w:tcBorders>
-              <w:top w:val="single" w:color="AAAAAA" w:sz="1"/>
-              <w:left w:val="single" w:color="AAAAAA" w:sz="1"/>
-              <w:bottom w:val="single" w:color="AAAAAA" w:sz="1"/>
-              <w:right w:val="single" w:color="AAAAAA" w:sz="1"/>
-            </w:tcBorders>
-            <w:shd w:fill="DEDEDE" w:val="clear"/>
-            <w:tcMar>
-              <w:top w:type="dxa" w:w="60"/>
-              <w:left w:type="dxa" w:w="100"/>
-              <w:bottom w:type="dxa" w:w="60"/>
-              <w:right w:type="dxa" w:w="100"/>
-            </w:tcMar>
-          </w:tcPr>
-          <w:p>
-            <w:r>
-              <w:rPr>
-                <w:rFonts w:ascii="맑은 고딕" w:cs="맑은 고딕" w:eastAsia="맑은 고딕" w:hAnsi="맑은 고딕"/>
-                <w:b/>
-                <w:bCs/>
-                <w:sz w:val="18"/>
-                <w:szCs w:val="18"/>
-              </w:rPr>
-              <w:t xml:space="preserve">핵심 이슈 / 기회</w:t>
+              <w:t xml:space="preserve">현황 및 주요 이슈</w:t>
             </w:r>
           </w:p>
         </w:tc>
@@ -927,7 +926,7 @@
         </w:tc>
         <w:tc>
           <w:tcPr>
-            <w:tcW w:type="dxa" w:w="900"/>
+            <w:tcW w:type="dxa" w:w="1000"/>
             <w:tcBorders>
               <w:top w:val="single" w:color="AAAAAA" w:sz="1"/>
               <w:left w:val="single" w:color="AAAAAA" w:sz="1"/>
@@ -954,55 +953,28 @@
         </w:tc>
         <w:tc>
           <w:tcPr>
-            <w:tcW w:type="dxa" w:w="2200"/>
-            <w:tcBorders>
-              <w:top w:val="single" w:color="AAAAAA" w:sz="1"/>
-              <w:left w:val="single" w:color="AAAAAA" w:sz="1"/>
-              <w:bottom w:val="single" w:color="AAAAAA" w:sz="1"/>
-              <w:right w:val="single" w:color="AAAAAA" w:sz="1"/>
-            </w:tcBorders>
-            <w:tcMar>
-              <w:top w:type="dxa" w:w="60"/>
-              <w:left w:type="dxa" w:w="100"/>
-              <w:bottom w:type="dxa" w:w="60"/>
-              <w:right w:type="dxa" w:w="100"/>
-            </w:tcMar>
-          </w:tcPr>
-          <w:p>
-            <w:r>
-              <w:rPr>
-                <w:rFonts w:ascii="맑은 고딕" w:cs="맑은 고딕" w:eastAsia="맑은 고딕" w:hAnsi="맑은 고딕"/>
-                <w:sz w:val="18"/>
-                <w:szCs w:val="18"/>
-              </w:rPr>
-              <w:t xml:space="preserve">최우선 관리</w:t>
-            </w:r>
-          </w:p>
-        </w:tc>
-        <w:tc>
-          <w:tcPr>
-            <w:tcW w:type="dxa" w:w="4560"/>
-            <w:tcBorders>
-              <w:top w:val="single" w:color="AAAAAA" w:sz="1"/>
-              <w:left w:val="single" w:color="AAAAAA" w:sz="1"/>
-              <w:bottom w:val="single" w:color="AAAAAA" w:sz="1"/>
-              <w:right w:val="single" w:color="AAAAAA" w:sz="1"/>
-            </w:tcBorders>
-            <w:tcMar>
-              <w:top w:type="dxa" w:w="60"/>
-              <w:left w:type="dxa" w:w="100"/>
-              <w:bottom w:type="dxa" w:w="60"/>
-              <w:right w:type="dxa" w:w="100"/>
-            </w:tcMar>
-          </w:tcPr>
-          <w:p>
-            <w:r>
-              <w:rPr>
-                <w:rFonts w:ascii="맑은 고딕" w:cs="맑은 고딕" w:eastAsia="맑은 고딕" w:hAnsi="맑은 고딕"/>
-                <w:sz w:val="18"/>
-                <w:szCs w:val="18"/>
-              </w:rPr>
-              <w:t xml:space="preserve">SWOSC-B 192톤 + PIANO WIRE 400톤 (연환산). TH1524 품질 이슈 해소 여부 미확인</w:t>
+            <w:tcW w:type="dxa" w:w="6660"/>
+            <w:tcBorders>
+              <w:top w:val="single" w:color="AAAAAA" w:sz="1"/>
+              <w:left w:val="single" w:color="AAAAAA" w:sz="1"/>
+              <w:bottom w:val="single" w:color="AAAAAA" w:sz="1"/>
+              <w:right w:val="single" w:color="AAAAAA" w:sz="1"/>
+            </w:tcBorders>
+            <w:tcMar>
+              <w:top w:type="dxa" w:w="60"/>
+              <w:left w:type="dxa" w:w="100"/>
+              <w:bottom w:type="dxa" w:w="60"/>
+              <w:right w:type="dxa" w:w="100"/>
+            </w:tcMar>
+          </w:tcPr>
+          <w:p>
+            <w:r>
+              <w:rPr>
+                <w:rFonts w:ascii="맑은 고딕" w:cs="맑은 고딕" w:eastAsia="맑은 고딕" w:hAnsi="맑은 고딕"/>
+                <w:sz w:val="18"/>
+                <w:szCs w:val="18"/>
+              </w:rPr>
+              <w:t xml:space="preserve">SWOSC-B 4.20MM(연환산 192톤) + PIANO WIRE(연환산 400톤)으로 DSR 베트남 최대 거래처 지위 더욱 강화. 단, 2024년 발생한 TH1524 SPRING FORMING 품질 이슈의 해소 여부가 아직 미확인 상태로, 차기 방문 시 반드시 확인이 필요함. KIS·SAMHWA와도 병행 거래 중이어서 경쟁 관계 유지.</w:t>
             </w:r>
           </w:p>
         </w:tc>
@@ -1038,7 +1010,7 @@
         </w:tc>
         <w:tc>
           <w:tcPr>
-            <w:tcW w:type="dxa" w:w="900"/>
+            <w:tcW w:type="dxa" w:w="1000"/>
             <w:tcBorders>
               <w:top w:val="single" w:color="AAAAAA" w:sz="1"/>
               <w:left w:val="single" w:color="AAAAAA" w:sz="1"/>
@@ -1065,55 +1037,28 @@
         </w:tc>
         <w:tc>
           <w:tcPr>
-            <w:tcW w:type="dxa" w:w="2200"/>
-            <w:tcBorders>
-              <w:top w:val="single" w:color="AAAAAA" w:sz="1"/>
-              <w:left w:val="single" w:color="AAAAAA" w:sz="1"/>
-              <w:bottom w:val="single" w:color="AAAAAA" w:sz="1"/>
-              <w:right w:val="single" w:color="AAAAAA" w:sz="1"/>
-            </w:tcBorders>
-            <w:tcMar>
-              <w:top w:type="dxa" w:w="60"/>
-              <w:left w:type="dxa" w:w="100"/>
-              <w:bottom w:type="dxa" w:w="60"/>
-              <w:right w:type="dxa" w:w="100"/>
-            </w:tcMar>
-          </w:tcPr>
-          <w:p>
-            <w:r>
-              <w:rPr>
-                <w:rFonts w:ascii="맑은 고딕" w:cs="맑은 고딕" w:eastAsia="맑은 고딕" w:hAnsi="맑은 고딕"/>
-                <w:sz w:val="18"/>
-                <w:szCs w:val="18"/>
-              </w:rPr>
-              <w:t xml:space="preserve">관계 회복</w:t>
-            </w:r>
-          </w:p>
-        </w:tc>
-        <w:tc>
-          <w:tcPr>
-            <w:tcW w:type="dxa" w:w="4560"/>
-            <w:tcBorders>
-              <w:top w:val="single" w:color="AAAAAA" w:sz="1"/>
-              <w:left w:val="single" w:color="AAAAAA" w:sz="1"/>
-              <w:bottom w:val="single" w:color="AAAAAA" w:sz="1"/>
-              <w:right w:val="single" w:color="AAAAAA" w:sz="1"/>
-            </w:tcBorders>
-            <w:tcMar>
-              <w:top w:type="dxa" w:w="60"/>
-              <w:left w:type="dxa" w:w="100"/>
-              <w:bottom w:type="dxa" w:w="60"/>
-              <w:right w:type="dxa" w:w="100"/>
-            </w:tcMar>
-          </w:tcPr>
-          <w:p>
-            <w:r>
-              <w:rPr>
-                <w:rFonts w:ascii="맑은 고딕" w:cs="맑은 고딕" w:eastAsia="맑은 고딕" w:hAnsi="맑은 고딕"/>
-                <w:sz w:val="18"/>
-                <w:szCs w:val="18"/>
-              </w:rPr>
-              <w:t xml:space="preserve">SWC 2.30MM 증량 중. MEDICAL 30%+ 급성장. FLAT WIRE C.R. 수치 공유 [즉시]</w:t>
+            <w:tcW w:type="dxa" w:w="6660"/>
+            <w:tcBorders>
+              <w:top w:val="single" w:color="AAAAAA" w:sz="1"/>
+              <w:left w:val="single" w:color="AAAAAA" w:sz="1"/>
+              <w:bottom w:val="single" w:color="AAAAAA" w:sz="1"/>
+              <w:right w:val="single" w:color="AAAAAA" w:sz="1"/>
+            </w:tcBorders>
+            <w:tcMar>
+              <w:top w:type="dxa" w:w="60"/>
+              <w:left w:type="dxa" w:w="100"/>
+              <w:bottom w:type="dxa" w:w="60"/>
+              <w:right w:type="dxa" w:w="100"/>
+            </w:tcMar>
+          </w:tcPr>
+          <w:p>
+            <w:r>
+              <w:rPr>
+                <w:rFonts w:ascii="맑은 고딕" w:cs="맑은 고딕" w:eastAsia="맑은 고딕" w:hAnsi="맑은 고딕"/>
+                <w:sz w:val="18"/>
+                <w:szCs w:val="18"/>
+              </w:rPr>
+              <w:t xml:space="preserve">GENERAL DIRECTOR(NAGUMO) 포함 전체 미팅으로 관계 회복 국면. SWC 2.30MM 오더 재증량 확인. MEDICAL 부문이 전체 포트폴리오의 30% 이상을 차지하며 급성장 중으로 고품질 STS WIRE 수요 확대 기대. 다만 FLAT WIRE CORNER RADIUS 수치 공유 및 클레임 도면 수령 프로세스 수립 등 팔로업 미완료 사항이 남아 있음.</w:t>
             </w:r>
           </w:p>
         </w:tc>
@@ -1149,7 +1094,7 @@
         </w:tc>
         <w:tc>
           <w:tcPr>
-            <w:tcW w:type="dxa" w:w="900"/>
+            <w:tcW w:type="dxa" w:w="1000"/>
             <w:tcBorders>
               <w:top w:val="single" w:color="AAAAAA" w:sz="1"/>
               <w:left w:val="single" w:color="AAAAAA" w:sz="1"/>
@@ -1176,55 +1121,28 @@
         </w:tc>
         <w:tc>
           <w:tcPr>
-            <w:tcW w:type="dxa" w:w="2200"/>
-            <w:tcBorders>
-              <w:top w:val="single" w:color="AAAAAA" w:sz="1"/>
-              <w:left w:val="single" w:color="AAAAAA" w:sz="1"/>
-              <w:bottom w:val="single" w:color="AAAAAA" w:sz="1"/>
-              <w:right w:val="single" w:color="AAAAAA" w:sz="1"/>
-            </w:tcBorders>
-            <w:tcMar>
-              <w:top w:type="dxa" w:w="60"/>
-              <w:left w:type="dxa" w:w="100"/>
-              <w:bottom w:type="dxa" w:w="60"/>
-              <w:right w:type="dxa" w:w="100"/>
-            </w:tcMar>
-          </w:tcPr>
-          <w:p>
-            <w:r>
-              <w:rPr>
-                <w:rFonts w:ascii="맑은 고딕" w:cs="맑은 고딕" w:eastAsia="맑은 고딕" w:hAnsi="맑은 고딕"/>
-                <w:sz w:val="18"/>
-                <w:szCs w:val="18"/>
-              </w:rPr>
-              <w:t xml:space="preserve">확대 추진</w:t>
-            </w:r>
-          </w:p>
-        </w:tc>
-        <w:tc>
-          <w:tcPr>
-            <w:tcW w:type="dxa" w:w="4560"/>
-            <w:tcBorders>
-              <w:top w:val="single" w:color="AAAAAA" w:sz="1"/>
-              <w:left w:val="single" w:color="AAAAAA" w:sz="1"/>
-              <w:bottom w:val="single" w:color="AAAAAA" w:sz="1"/>
-              <w:right w:val="single" w:color="AAAAAA" w:sz="1"/>
-            </w:tcBorders>
-            <w:tcMar>
-              <w:top w:type="dxa" w:w="60"/>
-              <w:left w:type="dxa" w:w="100"/>
-              <w:bottom w:type="dxa" w:w="60"/>
-              <w:right w:type="dxa" w:w="100"/>
-            </w:tcMar>
-          </w:tcPr>
-          <w:p>
-            <w:r>
-              <w:rPr>
-                <w:rFonts w:ascii="맑은 고딕" w:cs="맑은 고딕" w:eastAsia="맑은 고딕" w:hAnsi="맑은 고딕"/>
-                <w:sz w:val="18"/>
-                <w:szCs w:val="18"/>
-              </w:rPr>
-              <w:t xml:space="preserve">SUS304 BRIGHT WIRE 월 20톤 신규 INQUIRY. TRIAL ORDER 진행 중</w:t>
+            <w:tcW w:type="dxa" w:w="6660"/>
+            <w:tcBorders>
+              <w:top w:val="single" w:color="AAAAAA" w:sz="1"/>
+              <w:left w:val="single" w:color="AAAAAA" w:sz="1"/>
+              <w:bottom w:val="single" w:color="AAAAAA" w:sz="1"/>
+              <w:right w:val="single" w:color="AAAAAA" w:sz="1"/>
+            </w:tcBorders>
+            <w:tcMar>
+              <w:top w:type="dxa" w:w="60"/>
+              <w:left w:type="dxa" w:w="100"/>
+              <w:bottom w:type="dxa" w:w="60"/>
+              <w:right w:type="dxa" w:w="100"/>
+            </w:tcMar>
+          </w:tcPr>
+          <w:p>
+            <w:r>
+              <w:rPr>
+                <w:rFonts w:ascii="맑은 고딕" w:cs="맑은 고딕" w:eastAsia="맑은 고딕" w:hAnsi="맑은 고딕"/>
+                <w:sz w:val="18"/>
+                <w:szCs w:val="18"/>
+              </w:rPr>
+              <w:t xml:space="preserve">베트남 대형 SPRING 메이커. 현재 DSR 공급은 월 2-3톤으로 진입 초기 단계이나 SUS304 BRIGHT WIRE 월 20톤 신규 INQUIRY 접수로 확대 기회 발생. FORECAST 미제공으로 재고 운용 구조 수립이 선결 과제임.</w:t>
             </w:r>
           </w:p>
         </w:tc>
@@ -1260,7 +1178,7 @@
         </w:tc>
         <w:tc>
           <w:tcPr>
-            <w:tcW w:type="dxa" w:w="900"/>
+            <w:tcW w:type="dxa" w:w="1000"/>
             <w:tcBorders>
               <w:top w:val="single" w:color="AAAAAA" w:sz="1"/>
               <w:left w:val="single" w:color="AAAAAA" w:sz="1"/>
@@ -1287,55 +1205,28 @@
         </w:tc>
         <w:tc>
           <w:tcPr>
-            <w:tcW w:type="dxa" w:w="2200"/>
-            <w:tcBorders>
-              <w:top w:val="single" w:color="AAAAAA" w:sz="1"/>
-              <w:left w:val="single" w:color="AAAAAA" w:sz="1"/>
-              <w:bottom w:val="single" w:color="AAAAAA" w:sz="1"/>
-              <w:right w:val="single" w:color="AAAAAA" w:sz="1"/>
-            </w:tcBorders>
-            <w:tcMar>
-              <w:top w:type="dxa" w:w="60"/>
-              <w:left w:type="dxa" w:w="100"/>
-              <w:bottom w:type="dxa" w:w="60"/>
-              <w:right w:type="dxa" w:w="100"/>
-            </w:tcMar>
-          </w:tcPr>
-          <w:p>
-            <w:r>
-              <w:rPr>
-                <w:rFonts w:ascii="맑은 고딕" w:cs="맑은 고딕" w:eastAsia="맑은 고딕" w:hAnsi="맑은 고딕"/>
-                <w:sz w:val="18"/>
-                <w:szCs w:val="18"/>
-              </w:rPr>
-              <w:t xml:space="preserve">안정</w:t>
-            </w:r>
-          </w:p>
-        </w:tc>
-        <w:tc>
-          <w:tcPr>
-            <w:tcW w:type="dxa" w:w="4560"/>
-            <w:tcBorders>
-              <w:top w:val="single" w:color="AAAAAA" w:sz="1"/>
-              <w:left w:val="single" w:color="AAAAAA" w:sz="1"/>
-              <w:bottom w:val="single" w:color="AAAAAA" w:sz="1"/>
-              <w:right w:val="single" w:color="AAAAAA" w:sz="1"/>
-            </w:tcBorders>
-            <w:tcMar>
-              <w:top w:type="dxa" w:w="60"/>
-              <w:left w:type="dxa" w:w="100"/>
-              <w:bottom w:type="dxa" w:w="60"/>
-              <w:right w:type="dxa" w:w="100"/>
-            </w:tcMar>
-          </w:tcPr>
-          <w:p>
-            <w:r>
-              <w:rPr>
-                <w:rFonts w:ascii="맑은 고딕" w:cs="맑은 고딕" w:eastAsia="맑은 고딕" w:hAnsi="맑은 고딕"/>
-                <w:sz w:val="18"/>
-                <w:szCs w:val="18"/>
-              </w:rPr>
-              <w:t xml:space="preserve">DSR 100% 전환·4M 등록 완료. 신규 INQUIRY 4건. 경쟁사 진입 차단</w:t>
+            <w:tcW w:type="dxa" w:w="6660"/>
+            <w:tcBorders>
+              <w:top w:val="single" w:color="AAAAAA" w:sz="1"/>
+              <w:left w:val="single" w:color="AAAAAA" w:sz="1"/>
+              <w:bottom w:val="single" w:color="AAAAAA" w:sz="1"/>
+              <w:right w:val="single" w:color="AAAAAA" w:sz="1"/>
+            </w:tcBorders>
+            <w:tcMar>
+              <w:top w:type="dxa" w:w="60"/>
+              <w:left w:type="dxa" w:w="100"/>
+              <w:bottom w:type="dxa" w:w="60"/>
+              <w:right w:type="dxa" w:w="100"/>
+            </w:tcMar>
+          </w:tcPr>
+          <w:p>
+            <w:r>
+              <w:rPr>
+                <w:rFonts w:ascii="맑은 고딕" w:cs="맑은 고딕" w:eastAsia="맑은 고딕" w:hAnsi="맑은 고딕"/>
+                <w:sz w:val="18"/>
+                <w:szCs w:val="18"/>
+              </w:rPr>
+              <w:t xml:space="preserve">DSR 100% 전환 및 4M 등록 완료로 경쟁사 진입이 실질적으로 차단된 안정 거래처. 이번 방문에서 신규 INQUIRY 4건 추가 접수. 태국 공장 연계 수요 확장 가능성도 있음.</w:t>
             </w:r>
           </w:p>
         </w:tc>
@@ -1371,7 +1262,7 @@
         </w:tc>
         <w:tc>
           <w:tcPr>
-            <w:tcW w:type="dxa" w:w="900"/>
+            <w:tcW w:type="dxa" w:w="1000"/>
             <w:tcBorders>
               <w:top w:val="single" w:color="AAAAAA" w:sz="1"/>
               <w:left w:val="single" w:color="AAAAAA" w:sz="1"/>
@@ -1398,55 +1289,28 @@
         </w:tc>
         <w:tc>
           <w:tcPr>
-            <w:tcW w:type="dxa" w:w="2200"/>
-            <w:tcBorders>
-              <w:top w:val="single" w:color="AAAAAA" w:sz="1"/>
-              <w:left w:val="single" w:color="AAAAAA" w:sz="1"/>
-              <w:bottom w:val="single" w:color="AAAAAA" w:sz="1"/>
-              <w:right w:val="single" w:color="AAAAAA" w:sz="1"/>
-            </w:tcBorders>
-            <w:tcMar>
-              <w:top w:type="dxa" w:w="60"/>
-              <w:left w:type="dxa" w:w="100"/>
-              <w:bottom w:type="dxa" w:w="60"/>
-              <w:right w:type="dxa" w:w="100"/>
-            </w:tcMar>
-          </w:tcPr>
-          <w:p>
-            <w:r>
-              <w:rPr>
-                <w:rFonts w:ascii="맑은 고딕" w:cs="맑은 고딕" w:eastAsia="맑은 고딕" w:hAnsi="맑은 고딕"/>
-                <w:sz w:val="18"/>
-                <w:szCs w:val="18"/>
-              </w:rPr>
-              <w:t xml:space="preserve">신규 개척</w:t>
-            </w:r>
-          </w:p>
-        </w:tc>
-        <w:tc>
-          <w:tcPr>
-            <w:tcW w:type="dxa" w:w="4560"/>
-            <w:tcBorders>
-              <w:top w:val="single" w:color="AAAAAA" w:sz="1"/>
-              <w:left w:val="single" w:color="AAAAAA" w:sz="1"/>
-              <w:bottom w:val="single" w:color="AAAAAA" w:sz="1"/>
-              <w:right w:val="single" w:color="AAAAAA" w:sz="1"/>
-            </w:tcBorders>
-            <w:tcMar>
-              <w:top w:type="dxa" w:w="60"/>
-              <w:left w:type="dxa" w:w="100"/>
-              <w:bottom w:type="dxa" w:w="60"/>
-              <w:right w:type="dxa" w:w="100"/>
-            </w:tcMar>
-          </w:tcPr>
-          <w:p>
-            <w:r>
-              <w:rPr>
-                <w:rFonts w:ascii="맑은 고딕" w:cs="맑은 고딕" w:eastAsia="맑은 고딕" w:hAnsi="맑은 고딕"/>
-                <w:sz w:val="18"/>
-                <w:szCs w:val="18"/>
-              </w:rPr>
-              <w:t xml:space="preserve">JINTU(중국계) 직접 영업 침투 — DSR 중국 담당자 통해 즉시 제약 필요</w:t>
+            <w:tcW w:type="dxa" w:w="6660"/>
+            <w:tcBorders>
+              <w:top w:val="single" w:color="AAAAAA" w:sz="1"/>
+              <w:left w:val="single" w:color="AAAAAA" w:sz="1"/>
+              <w:bottom w:val="single" w:color="AAAAAA" w:sz="1"/>
+              <w:right w:val="single" w:color="AAAAAA" w:sz="1"/>
+            </w:tcBorders>
+            <w:tcMar>
+              <w:top w:type="dxa" w:w="60"/>
+              <w:left w:type="dxa" w:w="100"/>
+              <w:bottom w:type="dxa" w:w="60"/>
+              <w:right w:type="dxa" w:w="100"/>
+            </w:tcMar>
+          </w:tcPr>
+          <w:p>
+            <w:r>
+              <w:rPr>
+                <w:rFonts w:ascii="맑은 고딕" w:cs="맑은 고딕" w:eastAsia="맑은 고딕" w:hAnsi="맑은 고딕"/>
+                <w:sz w:val="18"/>
+                <w:szCs w:val="18"/>
+              </w:rPr>
+              <w:t xml:space="preserve">이번 출장에서 신규로 접촉한 잠재 거래처. CANON향 정밀 SPRING 생산으로 일본계 품질 기준이 요구되어 DSR 진입에 유리한 환경. 단, 중국계 JINTU VIETNAM이 동일 품목으로 직접 PRICE LIST를 발송하는 등 시장 침투를 시도 중으로 긴급 대응이 필요함.</w:t>
             </w:r>
           </w:p>
         </w:tc>
@@ -1482,7 +1346,7 @@
         </w:tc>
         <w:tc>
           <w:tcPr>
-            <w:tcW w:type="dxa" w:w="900"/>
+            <w:tcW w:type="dxa" w:w="1000"/>
             <w:tcBorders>
               <w:top w:val="single" w:color="AAAAAA" w:sz="1"/>
               <w:left w:val="single" w:color="AAAAAA" w:sz="1"/>
@@ -1509,60 +1373,63 @@
         </w:tc>
         <w:tc>
           <w:tcPr>
-            <w:tcW w:type="dxa" w:w="2200"/>
-            <w:tcBorders>
-              <w:top w:val="single" w:color="AAAAAA" w:sz="1"/>
-              <w:left w:val="single" w:color="AAAAAA" w:sz="1"/>
-              <w:bottom w:val="single" w:color="AAAAAA" w:sz="1"/>
-              <w:right w:val="single" w:color="AAAAAA" w:sz="1"/>
-            </w:tcBorders>
-            <w:tcMar>
-              <w:top w:type="dxa" w:w="60"/>
-              <w:left w:type="dxa" w:w="100"/>
-              <w:bottom w:type="dxa" w:w="60"/>
-              <w:right w:type="dxa" w:w="100"/>
-            </w:tcMar>
-          </w:tcPr>
-          <w:p>
-            <w:r>
-              <w:rPr>
-                <w:rFonts w:ascii="맑은 고딕" w:cs="맑은 고딕" w:eastAsia="맑은 고딕" w:hAnsi="맑은 고딕"/>
-                <w:sz w:val="18"/>
-                <w:szCs w:val="18"/>
-              </w:rPr>
-              <w:t xml:space="preserve">공급 중</w:t>
-            </w:r>
-          </w:p>
-        </w:tc>
-        <w:tc>
-          <w:tcPr>
-            <w:tcW w:type="dxa" w:w="4560"/>
-            <w:tcBorders>
-              <w:top w:val="single" w:color="AAAAAA" w:sz="1"/>
-              <w:left w:val="single" w:color="AAAAAA" w:sz="1"/>
-              <w:bottom w:val="single" w:color="AAAAAA" w:sz="1"/>
-              <w:right w:val="single" w:color="AAAAAA" w:sz="1"/>
-            </w:tcBorders>
-            <w:tcMar>
-              <w:top w:type="dxa" w:w="60"/>
-              <w:left w:type="dxa" w:w="100"/>
-              <w:bottom w:type="dxa" w:w="60"/>
-              <w:right w:type="dxa" w:w="100"/>
-            </w:tcMar>
-          </w:tcPr>
-          <w:p>
-            <w:r>
-              <w:rPr>
-                <w:rFonts w:ascii="맑은 고딕" w:cs="맑은 고딕" w:eastAsia="맑은 고딕" w:hAnsi="맑은 고딕"/>
-                <w:sz w:val="18"/>
-                <w:szCs w:val="18"/>
-              </w:rPr>
-              <w:t xml:space="preserve">품질 안정화. 필리핀 INATEC(코일링 98대) 별도 공략 가능</w:t>
+            <w:tcW w:type="dxa" w:w="6660"/>
+            <w:tcBorders>
+              <w:top w:val="single" w:color="AAAAAA" w:sz="1"/>
+              <w:left w:val="single" w:color="AAAAAA" w:sz="1"/>
+              <w:bottom w:val="single" w:color="AAAAAA" w:sz="1"/>
+              <w:right w:val="single" w:color="AAAAAA" w:sz="1"/>
+            </w:tcBorders>
+            <w:tcMar>
+              <w:top w:type="dxa" w:w="60"/>
+              <w:left w:type="dxa" w:w="100"/>
+              <w:bottom w:type="dxa" w:w="60"/>
+              <w:right w:type="dxa" w:w="100"/>
+            </w:tcMar>
+          </w:tcPr>
+          <w:p>
+            <w:r>
+              <w:rPr>
+                <w:rFonts w:ascii="맑은 고딕" w:cs="맑은 고딕" w:eastAsia="맑은 고딕" w:hAnsi="맑은 고딕"/>
+                <w:sz w:val="18"/>
+                <w:szCs w:val="18"/>
+              </w:rPr>
+              <w:t xml:space="preserve">SWC G. 품질 이슈 해소 후 DSR 공급 안정화. 그룹 계열사인 필리핀 INATEC CORPORATION(코일링 98대)이 별도 WIRE 조달 채널을 운영 중으로 독립적인 신규 공략 채널로 활용 가능성이 있음.</w:t>
             </w:r>
           </w:p>
         </w:tc>
       </w:tr>
     </w:tbl>
+    <w:p>
+      <w:pPr>
+        <w:spacing w:after="0" w:before="0"/>
+      </w:pPr>
+      <w:r>
+        <w:rPr>
+          <w:rFonts w:ascii="맑은 고딕" w:cs="맑은 고딕" w:eastAsia="맑은 고딕" w:hAnsi="맑은 고딕"/>
+          <w:b w:val="false"/>
+          <w:bCs w:val="false"/>
+          <w:sz w:val="19"/>
+          <w:szCs w:val="19"/>
+        </w:rPr>
+        <w:t xml:space="preserve"/>
+      </w:r>
+    </w:p>
+    <w:p>
+      <w:pPr>
+        <w:spacing w:after="0" w:before="0"/>
+      </w:pPr>
+      <w:r>
+        <w:rPr>
+          <w:rFonts w:ascii="맑은 고딕" w:cs="맑은 고딕" w:eastAsia="맑은 고딕" w:hAnsi="맑은 고딕"/>
+          <w:b w:val="false"/>
+          <w:bCs w:val="false"/>
+          <w:sz w:val="19"/>
+          <w:szCs w:val="19"/>
+        </w:rPr>
+        <w:t xml:space="preserve">YANGMIN과 ADVANEX는 이미 DSR의 핵심 매출 기반으로 자리잡고 있으며, CAMEX와 GOKO SPRING은 단기 확대 가능성이 높은 거래처임. 특히 CAMEX는 규모 대비 현재 공급량이 매우 낮아 진입 여지가 크고, GOKO SPRING은 경쟁사 대응 속도가 실적을 결정할 것으로 판단됨.</w:t>
+      </w:r>
+    </w:p>
     <w:p>
       <w:pPr>
         <w:pBdr>
@@ -1578,723 +1445,7 @@
           <w:sz w:val="22"/>
           <w:szCs w:val="22"/>
         </w:rPr>
-        <w:t xml:space="preserve">3. 귀국 후 즉시 조치 (우선순위 순)</w:t>
-      </w:r>
-    </w:p>
-    <w:tbl>
-      <w:tblPr>
-        <w:tblW w:type="dxa" w:w="9360"/>
-        <w:tblBorders>
-          <w:top w:val="single" w:color="auto" w:sz="4"/>
-          <w:left w:val="single" w:color="auto" w:sz="4"/>
-          <w:bottom w:val="single" w:color="auto" w:sz="4"/>
-          <w:right w:val="single" w:color="auto" w:sz="4"/>
-          <w:insideH w:val="single" w:color="auto" w:sz="4"/>
-          <w:insideV w:val="single" w:color="auto" w:sz="4"/>
-        </w:tblBorders>
-      </w:tblPr>
-      <w:tblGrid>
-        <w:gridCol w:w="500"/>
-        <w:gridCol w:w="1800"/>
-        <w:gridCol w:w="7060"/>
-      </w:tblGrid>
-      <w:tr>
-        <w:tc>
-          <w:tcPr>
-            <w:tcW w:type="dxa" w:w="500"/>
-            <w:tcBorders>
-              <w:top w:val="single" w:color="AAAAAA" w:sz="1"/>
-              <w:left w:val="single" w:color="AAAAAA" w:sz="1"/>
-              <w:bottom w:val="single" w:color="AAAAAA" w:sz="1"/>
-              <w:right w:val="single" w:color="AAAAAA" w:sz="1"/>
-            </w:tcBorders>
-            <w:shd w:fill="DEDEDE" w:val="clear"/>
-            <w:tcMar>
-              <w:top w:type="dxa" w:w="60"/>
-              <w:left w:type="dxa" w:w="100"/>
-              <w:bottom w:type="dxa" w:w="60"/>
-              <w:right w:type="dxa" w:w="100"/>
-            </w:tcMar>
-          </w:tcPr>
-          <w:p>
-            <w:r>
-              <w:rPr>
-                <w:rFonts w:ascii="맑은 고딕" w:cs="맑은 고딕" w:eastAsia="맑은 고딕" w:hAnsi="맑은 고딕"/>
-                <w:b/>
-                <w:bCs/>
-                <w:sz w:val="18"/>
-                <w:szCs w:val="18"/>
-              </w:rPr>
-              <w:t xml:space="preserve">#</w:t>
-            </w:r>
-          </w:p>
-        </w:tc>
-        <w:tc>
-          <w:tcPr>
-            <w:tcW w:type="dxa" w:w="1800"/>
-            <w:tcBorders>
-              <w:top w:val="single" w:color="AAAAAA" w:sz="1"/>
-              <w:left w:val="single" w:color="AAAAAA" w:sz="1"/>
-              <w:bottom w:val="single" w:color="AAAAAA" w:sz="1"/>
-              <w:right w:val="single" w:color="AAAAAA" w:sz="1"/>
-            </w:tcBorders>
-            <w:shd w:fill="DEDEDE" w:val="clear"/>
-            <w:tcMar>
-              <w:top w:type="dxa" w:w="60"/>
-              <w:left w:type="dxa" w:w="100"/>
-              <w:bottom w:type="dxa" w:w="60"/>
-              <w:right w:type="dxa" w:w="100"/>
-            </w:tcMar>
-          </w:tcPr>
-          <w:p>
-            <w:r>
-              <w:rPr>
-                <w:rFonts w:ascii="맑은 고딕" w:cs="맑은 고딕" w:eastAsia="맑은 고딕" w:hAnsi="맑은 고딕"/>
-                <w:b/>
-                <w:bCs/>
-                <w:sz w:val="18"/>
-                <w:szCs w:val="18"/>
-              </w:rPr>
-              <w:t xml:space="preserve">대상</w:t>
-            </w:r>
-          </w:p>
-        </w:tc>
-        <w:tc>
-          <w:tcPr>
-            <w:tcW w:type="dxa" w:w="7060"/>
-            <w:tcBorders>
-              <w:top w:val="single" w:color="AAAAAA" w:sz="1"/>
-              <w:left w:val="single" w:color="AAAAAA" w:sz="1"/>
-              <w:bottom w:val="single" w:color="AAAAAA" w:sz="1"/>
-              <w:right w:val="single" w:color="AAAAAA" w:sz="1"/>
-            </w:tcBorders>
-            <w:shd w:fill="DEDEDE" w:val="clear"/>
-            <w:tcMar>
-              <w:top w:type="dxa" w:w="60"/>
-              <w:left w:type="dxa" w:w="100"/>
-              <w:bottom w:type="dxa" w:w="60"/>
-              <w:right w:type="dxa" w:w="100"/>
-            </w:tcMar>
-          </w:tcPr>
-          <w:p>
-            <w:r>
-              <w:rPr>
-                <w:rFonts w:ascii="맑은 고딕" w:cs="맑은 고딕" w:eastAsia="맑은 고딕" w:hAnsi="맑은 고딕"/>
-                <w:b/>
-                <w:bCs/>
-                <w:sz w:val="18"/>
-                <w:szCs w:val="18"/>
-              </w:rPr>
-              <w:t xml:space="preserve">조치 내용</w:t>
-            </w:r>
-          </w:p>
-        </w:tc>
-      </w:tr>
-      <w:tr>
-        <w:tc>
-          <w:tcPr>
-            <w:tcW w:type="dxa" w:w="500"/>
-            <w:tcBorders>
-              <w:top w:val="single" w:color="AAAAAA" w:sz="1"/>
-              <w:left w:val="single" w:color="AAAAAA" w:sz="1"/>
-              <w:bottom w:val="single" w:color="AAAAAA" w:sz="1"/>
-              <w:right w:val="single" w:color="AAAAAA" w:sz="1"/>
-            </w:tcBorders>
-            <w:shd w:fill="F2F2F2" w:val="clear"/>
-            <w:tcMar>
-              <w:top w:type="dxa" w:w="60"/>
-              <w:left w:type="dxa" w:w="100"/>
-              <w:bottom w:type="dxa" w:w="60"/>
-              <w:right w:type="dxa" w:w="100"/>
-            </w:tcMar>
-          </w:tcPr>
-          <w:p>
-            <w:r>
-              <w:rPr>
-                <w:rFonts w:ascii="맑은 고딕" w:cs="맑은 고딕" w:eastAsia="맑은 고딕" w:hAnsi="맑은 고딕"/>
-                <w:sz w:val="18"/>
-                <w:szCs w:val="18"/>
-              </w:rPr>
-              <w:t xml:space="preserve">1</w:t>
-            </w:r>
-          </w:p>
-        </w:tc>
-        <w:tc>
-          <w:tcPr>
-            <w:tcW w:type="dxa" w:w="1800"/>
-            <w:tcBorders>
-              <w:top w:val="single" w:color="AAAAAA" w:sz="1"/>
-              <w:left w:val="single" w:color="AAAAAA" w:sz="1"/>
-              <w:bottom w:val="single" w:color="AAAAAA" w:sz="1"/>
-              <w:right w:val="single" w:color="AAAAAA" w:sz="1"/>
-            </w:tcBorders>
-            <w:tcMar>
-              <w:top w:type="dxa" w:w="60"/>
-              <w:left w:type="dxa" w:w="100"/>
-              <w:bottom w:type="dxa" w:w="60"/>
-              <w:right w:type="dxa" w:w="100"/>
-            </w:tcMar>
-          </w:tcPr>
-          <w:p>
-            <w:r>
-              <w:rPr>
-                <w:rFonts w:ascii="맑은 고딕" w:cs="맑은 고딕" w:eastAsia="맑은 고딕" w:hAnsi="맑은 고딕"/>
-                <w:sz w:val="18"/>
-                <w:szCs w:val="18"/>
-              </w:rPr>
-              <w:t xml:space="preserve">ADVANEX</w:t>
-            </w:r>
-          </w:p>
-        </w:tc>
-        <w:tc>
-          <w:tcPr>
-            <w:tcW w:type="dxa" w:w="7060"/>
-            <w:tcBorders>
-              <w:top w:val="single" w:color="AAAAAA" w:sz="1"/>
-              <w:left w:val="single" w:color="AAAAAA" w:sz="1"/>
-              <w:bottom w:val="single" w:color="AAAAAA" w:sz="1"/>
-              <w:right w:val="single" w:color="AAAAAA" w:sz="1"/>
-            </w:tcBorders>
-            <w:tcMar>
-              <w:top w:type="dxa" w:w="60"/>
-              <w:left w:type="dxa" w:w="100"/>
-              <w:bottom w:type="dxa" w:w="60"/>
-              <w:right w:type="dxa" w:w="100"/>
-            </w:tcMar>
-          </w:tcPr>
-          <w:p>
-            <w:r>
-              <w:rPr>
-                <w:rFonts w:ascii="맑은 고딕" w:cs="맑은 고딕" w:eastAsia="맑은 고딕" w:hAnsi="맑은 고딕"/>
-                <w:sz w:val="18"/>
-                <w:szCs w:val="18"/>
-              </w:rPr>
-              <w:t xml:space="preserve">FLAT WIRE CORNER RADIUS 수치 확인 → 공유 (거래처 직접 요청)</w:t>
-            </w:r>
-          </w:p>
-        </w:tc>
-      </w:tr>
-      <w:tr>
-        <w:tc>
-          <w:tcPr>
-            <w:tcW w:type="dxa" w:w="500"/>
-            <w:tcBorders>
-              <w:top w:val="single" w:color="AAAAAA" w:sz="1"/>
-              <w:left w:val="single" w:color="AAAAAA" w:sz="1"/>
-              <w:bottom w:val="single" w:color="AAAAAA" w:sz="1"/>
-              <w:right w:val="single" w:color="AAAAAA" w:sz="1"/>
-            </w:tcBorders>
-            <w:shd w:fill="F2F2F2" w:val="clear"/>
-            <w:tcMar>
-              <w:top w:type="dxa" w:w="60"/>
-              <w:left w:type="dxa" w:w="100"/>
-              <w:bottom w:type="dxa" w:w="60"/>
-              <w:right w:type="dxa" w:w="100"/>
-            </w:tcMar>
-          </w:tcPr>
-          <w:p>
-            <w:r>
-              <w:rPr>
-                <w:rFonts w:ascii="맑은 고딕" w:cs="맑은 고딕" w:eastAsia="맑은 고딕" w:hAnsi="맑은 고딕"/>
-                <w:sz w:val="18"/>
-                <w:szCs w:val="18"/>
-              </w:rPr>
-              <w:t xml:space="preserve">2</w:t>
-            </w:r>
-          </w:p>
-        </w:tc>
-        <w:tc>
-          <w:tcPr>
-            <w:tcW w:type="dxa" w:w="1800"/>
-            <w:tcBorders>
-              <w:top w:val="single" w:color="AAAAAA" w:sz="1"/>
-              <w:left w:val="single" w:color="AAAAAA" w:sz="1"/>
-              <w:bottom w:val="single" w:color="AAAAAA" w:sz="1"/>
-              <w:right w:val="single" w:color="AAAAAA" w:sz="1"/>
-            </w:tcBorders>
-            <w:tcMar>
-              <w:top w:type="dxa" w:w="60"/>
-              <w:left w:type="dxa" w:w="100"/>
-              <w:bottom w:type="dxa" w:w="60"/>
-              <w:right w:type="dxa" w:w="100"/>
-            </w:tcMar>
-          </w:tcPr>
-          <w:p>
-            <w:r>
-              <w:rPr>
-                <w:rFonts w:ascii="맑은 고딕" w:cs="맑은 고딕" w:eastAsia="맑은 고딕" w:hAnsi="맑은 고딕"/>
-                <w:sz w:val="18"/>
-                <w:szCs w:val="18"/>
-              </w:rPr>
-              <w:t xml:space="preserve">GOKO SPRING</w:t>
-            </w:r>
-          </w:p>
-        </w:tc>
-        <w:tc>
-          <w:tcPr>
-            <w:tcW w:type="dxa" w:w="7060"/>
-            <w:tcBorders>
-              <w:top w:val="single" w:color="AAAAAA" w:sz="1"/>
-              <w:left w:val="single" w:color="AAAAAA" w:sz="1"/>
-              <w:bottom w:val="single" w:color="AAAAAA" w:sz="1"/>
-              <w:right w:val="single" w:color="AAAAAA" w:sz="1"/>
-            </w:tcBorders>
-            <w:tcMar>
-              <w:top w:type="dxa" w:w="60"/>
-              <w:left w:type="dxa" w:w="100"/>
-              <w:bottom w:type="dxa" w:w="60"/>
-              <w:right w:type="dxa" w:w="100"/>
-            </w:tcMar>
-          </w:tcPr>
-          <w:p>
-            <w:r>
-              <w:rPr>
-                <w:rFonts w:ascii="맑은 고딕" w:cs="맑은 고딕" w:eastAsia="맑은 고딕" w:hAnsi="맑은 고딕"/>
-                <w:sz w:val="18"/>
-                <w:szCs w:val="18"/>
-              </w:rPr>
-              <w:t xml:space="preserve">VH1432P1 HW WIRE G. 1.20 불량 CAR(시정조치보고서) 즉시 발송</w:t>
-            </w:r>
-          </w:p>
-        </w:tc>
-      </w:tr>
-      <w:tr>
-        <w:tc>
-          <w:tcPr>
-            <w:tcW w:type="dxa" w:w="500"/>
-            <w:tcBorders>
-              <w:top w:val="single" w:color="AAAAAA" w:sz="1"/>
-              <w:left w:val="single" w:color="AAAAAA" w:sz="1"/>
-              <w:bottom w:val="single" w:color="AAAAAA" w:sz="1"/>
-              <w:right w:val="single" w:color="AAAAAA" w:sz="1"/>
-            </w:tcBorders>
-            <w:shd w:fill="F2F2F2" w:val="clear"/>
-            <w:tcMar>
-              <w:top w:type="dxa" w:w="60"/>
-              <w:left w:type="dxa" w:w="100"/>
-              <w:bottom w:type="dxa" w:w="60"/>
-              <w:right w:type="dxa" w:w="100"/>
-            </w:tcMar>
-          </w:tcPr>
-          <w:p>
-            <w:r>
-              <w:rPr>
-                <w:rFonts w:ascii="맑은 고딕" w:cs="맑은 고딕" w:eastAsia="맑은 고딕" w:hAnsi="맑은 고딕"/>
-                <w:sz w:val="18"/>
-                <w:szCs w:val="18"/>
-              </w:rPr>
-              <w:t xml:space="preserve">3</w:t>
-            </w:r>
-          </w:p>
-        </w:tc>
-        <w:tc>
-          <w:tcPr>
-            <w:tcW w:type="dxa" w:w="1800"/>
-            <w:tcBorders>
-              <w:top w:val="single" w:color="AAAAAA" w:sz="1"/>
-              <w:left w:val="single" w:color="AAAAAA" w:sz="1"/>
-              <w:bottom w:val="single" w:color="AAAAAA" w:sz="1"/>
-              <w:right w:val="single" w:color="AAAAAA" w:sz="1"/>
-            </w:tcBorders>
-            <w:tcMar>
-              <w:top w:type="dxa" w:w="60"/>
-              <w:left w:type="dxa" w:w="100"/>
-              <w:bottom w:type="dxa" w:w="60"/>
-              <w:right w:type="dxa" w:w="100"/>
-            </w:tcMar>
-          </w:tcPr>
-          <w:p>
-            <w:r>
-              <w:rPr>
-                <w:rFonts w:ascii="맑은 고딕" w:cs="맑은 고딕" w:eastAsia="맑은 고딕" w:hAnsi="맑은 고딕"/>
-                <w:sz w:val="18"/>
-                <w:szCs w:val="18"/>
-              </w:rPr>
-              <w:t xml:space="preserve">GOKO SPRING</w:t>
-            </w:r>
-          </w:p>
-        </w:tc>
-        <w:tc>
-          <w:tcPr>
-            <w:tcW w:type="dxa" w:w="7060"/>
-            <w:tcBorders>
-              <w:top w:val="single" w:color="AAAAAA" w:sz="1"/>
-              <w:left w:val="single" w:color="AAAAAA" w:sz="1"/>
-              <w:bottom w:val="single" w:color="AAAAAA" w:sz="1"/>
-              <w:right w:val="single" w:color="AAAAAA" w:sz="1"/>
-            </w:tcBorders>
-            <w:tcMar>
-              <w:top w:type="dxa" w:w="60"/>
-              <w:left w:type="dxa" w:w="100"/>
-              <w:bottom w:type="dxa" w:w="60"/>
-              <w:right w:type="dxa" w:w="100"/>
-            </w:tcMar>
-          </w:tcPr>
-          <w:p>
-            <w:r>
-              <w:rPr>
-                <w:rFonts w:ascii="맑은 고딕" w:cs="맑은 고딕" w:eastAsia="맑은 고딕" w:hAnsi="맑은 고딕"/>
-                <w:sz w:val="18"/>
-                <w:szCs w:val="18"/>
-              </w:rPr>
-              <w:t xml:space="preserve">JINTU VIETNAM 베트남 직접 영업 → DSR 중국 담당자 통해 즉시 제약 요청</w:t>
-            </w:r>
-          </w:p>
-        </w:tc>
-      </w:tr>
-      <w:tr>
-        <w:tc>
-          <w:tcPr>
-            <w:tcW w:type="dxa" w:w="500"/>
-            <w:tcBorders>
-              <w:top w:val="single" w:color="AAAAAA" w:sz="1"/>
-              <w:left w:val="single" w:color="AAAAAA" w:sz="1"/>
-              <w:bottom w:val="single" w:color="AAAAAA" w:sz="1"/>
-              <w:right w:val="single" w:color="AAAAAA" w:sz="1"/>
-            </w:tcBorders>
-            <w:shd w:fill="F2F2F2" w:val="clear"/>
-            <w:tcMar>
-              <w:top w:type="dxa" w:w="60"/>
-              <w:left w:type="dxa" w:w="100"/>
-              <w:bottom w:type="dxa" w:w="60"/>
-              <w:right w:type="dxa" w:w="100"/>
-            </w:tcMar>
-          </w:tcPr>
-          <w:p>
-            <w:r>
-              <w:rPr>
-                <w:rFonts w:ascii="맑은 고딕" w:cs="맑은 고딕" w:eastAsia="맑은 고딕" w:hAnsi="맑은 고딕"/>
-                <w:sz w:val="18"/>
-                <w:szCs w:val="18"/>
-              </w:rPr>
-              <w:t xml:space="preserve">4</w:t>
-            </w:r>
-          </w:p>
-        </w:tc>
-        <w:tc>
-          <w:tcPr>
-            <w:tcW w:type="dxa" w:w="1800"/>
-            <w:tcBorders>
-              <w:top w:val="single" w:color="AAAAAA" w:sz="1"/>
-              <w:left w:val="single" w:color="AAAAAA" w:sz="1"/>
-              <w:bottom w:val="single" w:color="AAAAAA" w:sz="1"/>
-              <w:right w:val="single" w:color="AAAAAA" w:sz="1"/>
-            </w:tcBorders>
-            <w:tcMar>
-              <w:top w:type="dxa" w:w="60"/>
-              <w:left w:type="dxa" w:w="100"/>
-              <w:bottom w:type="dxa" w:w="60"/>
-              <w:right w:type="dxa" w:w="100"/>
-            </w:tcMar>
-          </w:tcPr>
-          <w:p>
-            <w:r>
-              <w:rPr>
-                <w:rFonts w:ascii="맑은 고딕" w:cs="맑은 고딕" w:eastAsia="맑은 고딕" w:hAnsi="맑은 고딕"/>
-                <w:sz w:val="18"/>
-                <w:szCs w:val="18"/>
-              </w:rPr>
-              <w:t xml:space="preserve">ADVANEX</w:t>
-            </w:r>
-          </w:p>
-        </w:tc>
-        <w:tc>
-          <w:tcPr>
-            <w:tcW w:type="dxa" w:w="7060"/>
-            <w:tcBorders>
-              <w:top w:val="single" w:color="AAAAAA" w:sz="1"/>
-              <w:left w:val="single" w:color="AAAAAA" w:sz="1"/>
-              <w:bottom w:val="single" w:color="AAAAAA" w:sz="1"/>
-              <w:right w:val="single" w:color="AAAAAA" w:sz="1"/>
-            </w:tcBorders>
-            <w:tcMar>
-              <w:top w:type="dxa" w:w="60"/>
-              <w:left w:type="dxa" w:w="100"/>
-              <w:bottom w:type="dxa" w:w="60"/>
-              <w:right w:type="dxa" w:w="100"/>
-            </w:tcMar>
-          </w:tcPr>
-          <w:p>
-            <w:r>
-              <w:rPr>
-                <w:rFonts w:ascii="맑은 고딕" w:cs="맑은 고딕" w:eastAsia="맑은 고딕" w:hAnsi="맑은 고딕"/>
-                <w:sz w:val="18"/>
-                <w:szCs w:val="18"/>
-              </w:rPr>
-              <w:t xml:space="preserve">클레임 접수 프로세스 수립 — SPRING 도면 동시 수령 체계</w:t>
-            </w:r>
-          </w:p>
-        </w:tc>
-      </w:tr>
-      <w:tr>
-        <w:tc>
-          <w:tcPr>
-            <w:tcW w:type="dxa" w:w="500"/>
-            <w:tcBorders>
-              <w:top w:val="single" w:color="AAAAAA" w:sz="1"/>
-              <w:left w:val="single" w:color="AAAAAA" w:sz="1"/>
-              <w:bottom w:val="single" w:color="AAAAAA" w:sz="1"/>
-              <w:right w:val="single" w:color="AAAAAA" w:sz="1"/>
-            </w:tcBorders>
-            <w:shd w:fill="F2F2F2" w:val="clear"/>
-            <w:tcMar>
-              <w:top w:type="dxa" w:w="60"/>
-              <w:left w:type="dxa" w:w="100"/>
-              <w:bottom w:type="dxa" w:w="60"/>
-              <w:right w:type="dxa" w:w="100"/>
-            </w:tcMar>
-          </w:tcPr>
-          <w:p>
-            <w:r>
-              <w:rPr>
-                <w:rFonts w:ascii="맑은 고딕" w:cs="맑은 고딕" w:eastAsia="맑은 고딕" w:hAnsi="맑은 고딕"/>
-                <w:sz w:val="18"/>
-                <w:szCs w:val="18"/>
-              </w:rPr>
-              <w:t xml:space="preserve">5</w:t>
-            </w:r>
-          </w:p>
-        </w:tc>
-        <w:tc>
-          <w:tcPr>
-            <w:tcW w:type="dxa" w:w="1800"/>
-            <w:tcBorders>
-              <w:top w:val="single" w:color="AAAAAA" w:sz="1"/>
-              <w:left w:val="single" w:color="AAAAAA" w:sz="1"/>
-              <w:bottom w:val="single" w:color="AAAAAA" w:sz="1"/>
-              <w:right w:val="single" w:color="AAAAAA" w:sz="1"/>
-            </w:tcBorders>
-            <w:tcMar>
-              <w:top w:type="dxa" w:w="60"/>
-              <w:left w:type="dxa" w:w="100"/>
-              <w:bottom w:type="dxa" w:w="60"/>
-              <w:right w:type="dxa" w:w="100"/>
-            </w:tcMar>
-          </w:tcPr>
-          <w:p>
-            <w:r>
-              <w:rPr>
-                <w:rFonts w:ascii="맑은 고딕" w:cs="맑은 고딕" w:eastAsia="맑은 고딕" w:hAnsi="맑은 고딕"/>
-                <w:sz w:val="18"/>
-                <w:szCs w:val="18"/>
-              </w:rPr>
-              <w:t xml:space="preserve">CAMEX</w:t>
-            </w:r>
-          </w:p>
-        </w:tc>
-        <w:tc>
-          <w:tcPr>
-            <w:tcW w:type="dxa" w:w="7060"/>
-            <w:tcBorders>
-              <w:top w:val="single" w:color="AAAAAA" w:sz="1"/>
-              <w:left w:val="single" w:color="AAAAAA" w:sz="1"/>
-              <w:bottom w:val="single" w:color="AAAAAA" w:sz="1"/>
-              <w:right w:val="single" w:color="AAAAAA" w:sz="1"/>
-            </w:tcBorders>
-            <w:tcMar>
-              <w:top w:type="dxa" w:w="60"/>
-              <w:left w:type="dxa" w:w="100"/>
-              <w:bottom w:type="dxa" w:w="60"/>
-              <w:right w:type="dxa" w:w="100"/>
-            </w:tcMar>
-          </w:tcPr>
-          <w:p>
-            <w:r>
-              <w:rPr>
-                <w:rFonts w:ascii="맑은 고딕" w:cs="맑은 고딕" w:eastAsia="맑은 고딕" w:hAnsi="맑은 고딕"/>
-                <w:sz w:val="18"/>
-                <w:szCs w:val="18"/>
-              </w:rPr>
-              <w:t xml:space="preserve">SUS304CU Ø3.00/4.50MM 견적 제출 (고객사 CU ACCEPT 확인 후)</w:t>
-            </w:r>
-          </w:p>
-        </w:tc>
-      </w:tr>
-      <w:tr>
-        <w:tc>
-          <w:tcPr>
-            <w:tcW w:type="dxa" w:w="500"/>
-            <w:tcBorders>
-              <w:top w:val="single" w:color="AAAAAA" w:sz="1"/>
-              <w:left w:val="single" w:color="AAAAAA" w:sz="1"/>
-              <w:bottom w:val="single" w:color="AAAAAA" w:sz="1"/>
-              <w:right w:val="single" w:color="AAAAAA" w:sz="1"/>
-            </w:tcBorders>
-            <w:shd w:fill="F2F2F2" w:val="clear"/>
-            <w:tcMar>
-              <w:top w:type="dxa" w:w="60"/>
-              <w:left w:type="dxa" w:w="100"/>
-              <w:bottom w:type="dxa" w:w="60"/>
-              <w:right w:type="dxa" w:w="100"/>
-            </w:tcMar>
-          </w:tcPr>
-          <w:p>
-            <w:r>
-              <w:rPr>
-                <w:rFonts w:ascii="맑은 고딕" w:cs="맑은 고딕" w:eastAsia="맑은 고딕" w:hAnsi="맑은 고딕"/>
-                <w:sz w:val="18"/>
-                <w:szCs w:val="18"/>
-              </w:rPr>
-              <w:t xml:space="preserve">6</w:t>
-            </w:r>
-          </w:p>
-        </w:tc>
-        <w:tc>
-          <w:tcPr>
-            <w:tcW w:type="dxa" w:w="1800"/>
-            <w:tcBorders>
-              <w:top w:val="single" w:color="AAAAAA" w:sz="1"/>
-              <w:left w:val="single" w:color="AAAAAA" w:sz="1"/>
-              <w:bottom w:val="single" w:color="AAAAAA" w:sz="1"/>
-              <w:right w:val="single" w:color="AAAAAA" w:sz="1"/>
-            </w:tcBorders>
-            <w:tcMar>
-              <w:top w:type="dxa" w:w="60"/>
-              <w:left w:type="dxa" w:w="100"/>
-              <w:bottom w:type="dxa" w:w="60"/>
-              <w:right w:type="dxa" w:w="100"/>
-            </w:tcMar>
-          </w:tcPr>
-          <w:p>
-            <w:r>
-              <w:rPr>
-                <w:rFonts w:ascii="맑은 고딕" w:cs="맑은 고딕" w:eastAsia="맑은 고딕" w:hAnsi="맑은 고딕"/>
-                <w:sz w:val="18"/>
-                <w:szCs w:val="18"/>
-              </w:rPr>
-              <w:t xml:space="preserve">NEW TECH CNC</w:t>
-            </w:r>
-          </w:p>
-        </w:tc>
-        <w:tc>
-          <w:tcPr>
-            <w:tcW w:type="dxa" w:w="7060"/>
-            <w:tcBorders>
-              <w:top w:val="single" w:color="AAAAAA" w:sz="1"/>
-              <w:left w:val="single" w:color="AAAAAA" w:sz="1"/>
-              <w:bottom w:val="single" w:color="AAAAAA" w:sz="1"/>
-              <w:right w:val="single" w:color="AAAAAA" w:sz="1"/>
-            </w:tcBorders>
-            <w:tcMar>
-              <w:top w:type="dxa" w:w="60"/>
-              <w:left w:type="dxa" w:w="100"/>
-              <w:bottom w:type="dxa" w:w="60"/>
-              <w:right w:type="dxa" w:w="100"/>
-            </w:tcMar>
-          </w:tcPr>
-          <w:p>
-            <w:r>
-              <w:rPr>
-                <w:rFonts w:ascii="맑은 고딕" w:cs="맑은 고딕" w:eastAsia="맑은 고딕" w:hAnsi="맑은 고딕"/>
-                <w:sz w:val="18"/>
-                <w:szCs w:val="18"/>
-              </w:rPr>
-              <w:t xml:space="preserve">STS304 2.00/2.60MM 견적 제출 — 일본산 교체 의향 확인됨</w:t>
-            </w:r>
-          </w:p>
-        </w:tc>
-      </w:tr>
-      <w:tr>
-        <w:tc>
-          <w:tcPr>
-            <w:tcW w:type="dxa" w:w="500"/>
-            <w:tcBorders>
-              <w:top w:val="single" w:color="AAAAAA" w:sz="1"/>
-              <w:left w:val="single" w:color="AAAAAA" w:sz="1"/>
-              <w:bottom w:val="single" w:color="AAAAAA" w:sz="1"/>
-              <w:right w:val="single" w:color="AAAAAA" w:sz="1"/>
-            </w:tcBorders>
-            <w:shd w:fill="F2F2F2" w:val="clear"/>
-            <w:tcMar>
-              <w:top w:type="dxa" w:w="60"/>
-              <w:left w:type="dxa" w:w="100"/>
-              <w:bottom w:type="dxa" w:w="60"/>
-              <w:right w:type="dxa" w:w="100"/>
-            </w:tcMar>
-          </w:tcPr>
-          <w:p>
-            <w:r>
-              <w:rPr>
-                <w:rFonts w:ascii="맑은 고딕" w:cs="맑은 고딕" w:eastAsia="맑은 고딕" w:hAnsi="맑은 고딕"/>
-                <w:sz w:val="18"/>
-                <w:szCs w:val="18"/>
-              </w:rPr>
-              <w:t xml:space="preserve">7</w:t>
-            </w:r>
-          </w:p>
-        </w:tc>
-        <w:tc>
-          <w:tcPr>
-            <w:tcW w:type="dxa" w:w="1800"/>
-            <w:tcBorders>
-              <w:top w:val="single" w:color="AAAAAA" w:sz="1"/>
-              <w:left w:val="single" w:color="AAAAAA" w:sz="1"/>
-              <w:bottom w:val="single" w:color="AAAAAA" w:sz="1"/>
-              <w:right w:val="single" w:color="AAAAAA" w:sz="1"/>
-            </w:tcBorders>
-            <w:tcMar>
-              <w:top w:type="dxa" w:w="60"/>
-              <w:left w:type="dxa" w:w="100"/>
-              <w:bottom w:type="dxa" w:w="60"/>
-              <w:right w:type="dxa" w:w="100"/>
-            </w:tcMar>
-          </w:tcPr>
-          <w:p>
-            <w:r>
-              <w:rPr>
-                <w:rFonts w:ascii="맑은 고딕" w:cs="맑은 고딕" w:eastAsia="맑은 고딕" w:hAnsi="맑은 고딕"/>
-                <w:sz w:val="18"/>
-                <w:szCs w:val="18"/>
-              </w:rPr>
-              <w:t xml:space="preserve">VINA TAIYO</w:t>
-            </w:r>
-          </w:p>
-        </w:tc>
-        <w:tc>
-          <w:tcPr>
-            <w:tcW w:type="dxa" w:w="7060"/>
-            <w:tcBorders>
-              <w:top w:val="single" w:color="AAAAAA" w:sz="1"/>
-              <w:left w:val="single" w:color="AAAAAA" w:sz="1"/>
-              <w:bottom w:val="single" w:color="AAAAAA" w:sz="1"/>
-              <w:right w:val="single" w:color="AAAAAA" w:sz="1"/>
-            </w:tcBorders>
-            <w:tcMar>
-              <w:top w:type="dxa" w:w="60"/>
-              <w:left w:type="dxa" w:w="100"/>
-              <w:bottom w:type="dxa" w:w="60"/>
-              <w:right w:type="dxa" w:w="100"/>
-            </w:tcMar>
-          </w:tcPr>
-          <w:p>
-            <w:r>
-              <w:rPr>
-                <w:rFonts w:ascii="맑은 고딕" w:cs="맑은 고딕" w:eastAsia="맑은 고딕" w:hAnsi="맑은 고딕"/>
-                <w:sz w:val="18"/>
-                <w:szCs w:val="18"/>
-              </w:rPr>
-              <w:t xml:space="preserve">SWP-A 0.16MM 생산 가능 여부 확인 → MEIKO에 대체 규격 제안</w:t>
-            </w:r>
-          </w:p>
-        </w:tc>
-      </w:tr>
-    </w:tbl>
-    <w:p>
-      <w:pPr>
-        <w:pBdr>
-          <w:bottom w:val="single" w:color="333333" w:sz="2"/>
-        </w:pBdr>
-        <w:spacing w:after="60" w:before="160"/>
-      </w:pPr>
-      <w:r>
-        <w:rPr>
-          <w:rFonts w:ascii="맑은 고딕" w:cs="맑은 고딕" w:eastAsia="맑은 고딕" w:hAnsi="맑은 고딕"/>
-          <w:b/>
-          <w:bCs/>
-          <w:sz w:val="22"/>
-          <w:szCs w:val="22"/>
-        </w:rPr>
-        <w:t xml:space="preserve">4. 신규 개척 우선순위</w:t>
+        <w:t xml:space="preserve">3. 신규 개척 우선순위</w:t>
       </w:r>
     </w:p>
     <w:tbl>
@@ -2401,7 +1552,7 @@
                 <w:sz w:val="18"/>
                 <w:szCs w:val="18"/>
               </w:rPr>
-              <w:t xml:space="preserve">진입 조건</w:t>
+              <w:t xml:space="preserve">진입 조건 및 현황</w:t>
             </w:r>
           </w:p>
         </w:tc>
@@ -2485,7 +1636,7 @@
                 <w:sz w:val="18"/>
                 <w:szCs w:val="18"/>
               </w:rPr>
-              <w:t xml:space="preserve">PIANO WIRE 150톤 우선 공략. SWC는 중국산 전환으로 단기 진입 어려움</w:t>
+              <w:t xml:space="preserve">PIANO WIRE 150톤 우선 공략. SWC는 중국산 전환으로 단기 어려움</w:t>
             </w:r>
           </w:p>
         </w:tc>
@@ -2569,7 +1720,7 @@
                 <w:sz w:val="18"/>
                 <w:szCs w:val="18"/>
               </w:rPr>
-              <w:t xml:space="preserve">SUS304 WPB S-CO 0.20-0.45MM. 가격 경쟁력 + 4M 승인 지원 필요</w:t>
+              <w:t xml:space="preserve">SUS304 WPB S-CO 0.20-0.45MM 수요 확인. 가격 경쟁력 확보 + 4M 승인 지원 필요</w:t>
             </w:r>
           </w:p>
         </w:tc>
@@ -2653,7 +1804,7 @@
                 <w:sz w:val="18"/>
                 <w:szCs w:val="18"/>
               </w:rPr>
-              <w:t xml:space="preserve">SWP-B 60톤 + STS 30톤. 샘플 제공 후 4M 승인</w:t>
+              <w:t xml:space="preserve">SWP-B 60톤 + STS 30톤. 샘플 제공 및 4M 승인 지원으로 진입</w:t>
             </w:r>
           </w:p>
         </w:tc>
@@ -2683,7 +1834,7 @@
                 <w:sz w:val="18"/>
                 <w:szCs w:val="18"/>
               </w:rPr>
-              <w:t xml:space="preserve">JYOHOKU SPRINGS</w:t>
+              <w:t xml:space="preserve">JYOHOKU SPRINGS SAIGON</w:t>
             </w:r>
           </w:p>
         </w:tc>
@@ -2737,7 +1888,7 @@
                 <w:sz w:val="18"/>
                 <w:szCs w:val="18"/>
               </w:rPr>
-              <w:t xml:space="preserve">한국산 WIRE B/L 수입 확인. ORISTAR 검증 완료 후 방문</w:t>
+              <w:t xml:space="preserve">한국산 WIRE 수입 B/L 확인됨. ORISTAR 검증 피드백 수령 후 방문</w:t>
             </w:r>
           </w:p>
         </w:tc>
@@ -2821,12 +1972,42 @@
                 <w:sz w:val="18"/>
                 <w:szCs w:val="18"/>
               </w:rPr>
-              <w:t xml:space="preserve">HYUNDAI/KIA TIER-1. ORISTAR 검증 완료 후 방문</w:t>
+              <w:t xml:space="preserve">HYUNDAI/KIA TIER-1. ORISTAR 검증 피드백 수령 후 방문</w:t>
             </w:r>
           </w:p>
         </w:tc>
       </w:tr>
     </w:tbl>
+    <w:p>
+      <w:pPr>
+        <w:spacing w:after="0" w:before="0"/>
+      </w:pPr>
+      <w:r>
+        <w:rPr>
+          <w:rFonts w:ascii="맑은 고딕" w:cs="맑은 고딕" w:eastAsia="맑은 고딕" w:hAnsi="맑은 고딕"/>
+          <w:b w:val="false"/>
+          <w:bCs w:val="false"/>
+          <w:sz w:val="19"/>
+          <w:szCs w:val="19"/>
+        </w:rPr>
+        <w:t xml:space="preserve"/>
+      </w:r>
+    </w:p>
+    <w:p>
+      <w:pPr>
+        <w:spacing w:after="0" w:before="0"/>
+      </w:pPr>
+      <w:r>
+        <w:rPr>
+          <w:rFonts w:ascii="맑은 고딕" w:cs="맑은 고딕" w:eastAsia="맑은 고딕" w:hAnsi="맑은 고딕"/>
+          <w:b w:val="false"/>
+          <w:bCs w:val="false"/>
+          <w:sz w:val="19"/>
+          <w:szCs w:val="19"/>
+        </w:rPr>
+        <w:t xml:space="preserve">LONGTECH는 규모가 크나 중국산 전환이 이미 진행된 상태로 중장기 접근이 현실적임. AIKO SPRING과 EAST STAR는 이번 출장에서 신규 접촉한 업체로 샘플 및 4M 승인 지원을 통한 중장기 진입 전략이 필요함.</w:t>
+      </w:r>
+    </w:p>
     <w:p>
       <w:pPr>
         <w:pBdr>
@@ -2842,259 +2023,24 @@
           <w:sz w:val="22"/>
           <w:szCs w:val="22"/>
         </w:rPr>
-        <w:t xml:space="preserve">5. ORISTAR 대리점 관리 리스크</w:t>
+        <w:t xml:space="preserve">4. ORISTAR 대리점 관리 리스크</w:t>
       </w:r>
     </w:p>
-    <w:tbl>
-      <w:tblPr>
-        <w:tblW w:type="dxa" w:w="9360"/>
-        <w:tblBorders>
-          <w:top w:val="single" w:color="auto" w:sz="4"/>
-          <w:left w:val="single" w:color="auto" w:sz="4"/>
-          <w:bottom w:val="single" w:color="auto" w:sz="4"/>
-          <w:right w:val="single" w:color="auto" w:sz="4"/>
-          <w:insideH w:val="single" w:color="auto" w:sz="4"/>
-          <w:insideV w:val="single" w:color="auto" w:sz="4"/>
-        </w:tblBorders>
-      </w:tblPr>
-      <w:tblGrid>
-        <w:gridCol w:w="3000"/>
-        <w:gridCol w:w="6360"/>
-      </w:tblGrid>
-      <w:tr>
-        <w:tc>
-          <w:tcPr>
-            <w:tcW w:type="dxa" w:w="3000"/>
-            <w:tcBorders>
-              <w:top w:val="single" w:color="AAAAAA" w:sz="1"/>
-              <w:left w:val="single" w:color="AAAAAA" w:sz="1"/>
-              <w:bottom w:val="single" w:color="AAAAAA" w:sz="1"/>
-              <w:right w:val="single" w:color="AAAAAA" w:sz="1"/>
-            </w:tcBorders>
-            <w:shd w:fill="DEDEDE" w:val="clear"/>
-            <w:tcMar>
-              <w:top w:type="dxa" w:w="60"/>
-              <w:left w:type="dxa" w:w="100"/>
-              <w:bottom w:type="dxa" w:w="60"/>
-              <w:right w:type="dxa" w:w="100"/>
-            </w:tcMar>
-          </w:tcPr>
-          <w:p>
-            <w:r>
-              <w:rPr>
-                <w:rFonts w:ascii="맑은 고딕" w:cs="맑은 고딕" w:eastAsia="맑은 고딕" w:hAnsi="맑은 고딕"/>
-                <w:b/>
-                <w:bCs/>
-                <w:sz w:val="18"/>
-                <w:szCs w:val="18"/>
-              </w:rPr>
-              <w:t xml:space="preserve">리스크</w:t>
-            </w:r>
-          </w:p>
-        </w:tc>
-        <w:tc>
-          <w:tcPr>
-            <w:tcW w:type="dxa" w:w="6360"/>
-            <w:tcBorders>
-              <w:top w:val="single" w:color="AAAAAA" w:sz="1"/>
-              <w:left w:val="single" w:color="AAAAAA" w:sz="1"/>
-              <w:bottom w:val="single" w:color="AAAAAA" w:sz="1"/>
-              <w:right w:val="single" w:color="AAAAAA" w:sz="1"/>
-            </w:tcBorders>
-            <w:shd w:fill="DEDEDE" w:val="clear"/>
-            <w:tcMar>
-              <w:top w:type="dxa" w:w="60"/>
-              <w:left w:type="dxa" w:w="100"/>
-              <w:bottom w:type="dxa" w:w="60"/>
-              <w:right w:type="dxa" w:w="100"/>
-            </w:tcMar>
-          </w:tcPr>
-          <w:p>
-            <w:r>
-              <w:rPr>
-                <w:rFonts w:ascii="맑은 고딕" w:cs="맑은 고딕" w:eastAsia="맑은 고딕" w:hAnsi="맑은 고딕"/>
-                <w:b/>
-                <w:bCs/>
-                <w:sz w:val="18"/>
-                <w:szCs w:val="18"/>
-              </w:rPr>
-              <w:t xml:space="preserve">대응 방향</w:t>
-            </w:r>
-          </w:p>
-        </w:tc>
-      </w:tr>
-      <w:tr>
-        <w:tc>
-          <w:tcPr>
-            <w:tcW w:type="dxa" w:w="3000"/>
-            <w:tcBorders>
-              <w:top w:val="single" w:color="AAAAAA" w:sz="1"/>
-              <w:left w:val="single" w:color="AAAAAA" w:sz="1"/>
-              <w:bottom w:val="single" w:color="AAAAAA" w:sz="1"/>
-              <w:right w:val="single" w:color="AAAAAA" w:sz="1"/>
-            </w:tcBorders>
-            <w:shd w:fill="F2F2F2" w:val="clear"/>
-            <w:tcMar>
-              <w:top w:type="dxa" w:w="60"/>
-              <w:left w:type="dxa" w:w="100"/>
-              <w:bottom w:type="dxa" w:w="60"/>
-              <w:right w:type="dxa" w:w="100"/>
-            </w:tcMar>
-          </w:tcPr>
-          <w:p>
-            <w:r>
-              <w:rPr>
-                <w:rFonts w:ascii="맑은 고딕" w:cs="맑은 고딕" w:eastAsia="맑은 고딕" w:hAnsi="맑은 고딕"/>
-                <w:sz w:val="18"/>
-                <w:szCs w:val="18"/>
-              </w:rPr>
-              <w:t xml:space="preserve">MR. VU TRI TOAN 퇴사 예정 (15년 근속 구매 담당)</w:t>
-            </w:r>
-          </w:p>
-        </w:tc>
-        <w:tc>
-          <w:tcPr>
-            <w:tcW w:type="dxa" w:w="6360"/>
-            <w:tcBorders>
-              <w:top w:val="single" w:color="AAAAAA" w:sz="1"/>
-              <w:left w:val="single" w:color="AAAAAA" w:sz="1"/>
-              <w:bottom w:val="single" w:color="AAAAAA" w:sz="1"/>
-              <w:right w:val="single" w:color="AAAAAA" w:sz="1"/>
-            </w:tcBorders>
-            <w:tcMar>
-              <w:top w:type="dxa" w:w="60"/>
-              <w:left w:type="dxa" w:w="100"/>
-              <w:bottom w:type="dxa" w:w="60"/>
-              <w:right w:type="dxa" w:w="100"/>
-            </w:tcMar>
-          </w:tcPr>
-          <w:p>
-            <w:r>
-              <w:rPr>
-                <w:rFonts w:ascii="맑은 고딕" w:cs="맑은 고딕" w:eastAsia="맑은 고딕" w:hAnsi="맑은 고딕"/>
-                <w:sz w:val="18"/>
-                <w:szCs w:val="18"/>
-              </w:rPr>
-              <w:t xml:space="preserve">후임 담당자 조기 파악 및 관계 구축. 복수 담당자 확보</w:t>
-            </w:r>
-          </w:p>
-        </w:tc>
-      </w:tr>
-      <w:tr>
-        <w:tc>
-          <w:tcPr>
-            <w:tcW w:type="dxa" w:w="3000"/>
-            <w:tcBorders>
-              <w:top w:val="single" w:color="AAAAAA" w:sz="1"/>
-              <w:left w:val="single" w:color="AAAAAA" w:sz="1"/>
-              <w:bottom w:val="single" w:color="AAAAAA" w:sz="1"/>
-              <w:right w:val="single" w:color="AAAAAA" w:sz="1"/>
-            </w:tcBorders>
-            <w:shd w:fill="F2F2F2" w:val="clear"/>
-            <w:tcMar>
-              <w:top w:type="dxa" w:w="60"/>
-              <w:left w:type="dxa" w:w="100"/>
-              <w:bottom w:type="dxa" w:w="60"/>
-              <w:right w:type="dxa" w:w="100"/>
-            </w:tcMar>
-          </w:tcPr>
-          <w:p>
-            <w:r>
-              <w:rPr>
-                <w:rFonts w:ascii="맑은 고딕" w:cs="맑은 고딕" w:eastAsia="맑은 고딕" w:hAnsi="맑은 고딕"/>
-                <w:sz w:val="18"/>
-                <w:szCs w:val="18"/>
-              </w:rPr>
-              <w:t xml:space="preserve">WIRE 매출 ORISTAR 전체의 5% 미만 — 우선순위 낮음</w:t>
-            </w:r>
-          </w:p>
-        </w:tc>
-        <w:tc>
-          <w:tcPr>
-            <w:tcW w:type="dxa" w:w="6360"/>
-            <w:tcBorders>
-              <w:top w:val="single" w:color="AAAAAA" w:sz="1"/>
-              <w:left w:val="single" w:color="AAAAAA" w:sz="1"/>
-              <w:bottom w:val="single" w:color="AAAAAA" w:sz="1"/>
-              <w:right w:val="single" w:color="AAAAAA" w:sz="1"/>
-            </w:tcBorders>
-            <w:tcMar>
-              <w:top w:type="dxa" w:w="60"/>
-              <w:left w:type="dxa" w:w="100"/>
-              <w:bottom w:type="dxa" w:w="60"/>
-              <w:right w:type="dxa" w:w="100"/>
-            </w:tcMar>
-          </w:tcPr>
-          <w:p>
-            <w:r>
-              <w:rPr>
-                <w:rFonts w:ascii="맑은 고딕" w:cs="맑은 고딕" w:eastAsia="맑은 고딕" w:hAnsi="맑은 고딕"/>
-                <w:sz w:val="18"/>
-                <w:szCs w:val="18"/>
-              </w:rPr>
-              <w:t xml:space="preserve">DSR이 먼저 거래처 개발 지원하여 ORISTAR 동기 부여</w:t>
-            </w:r>
-          </w:p>
-        </w:tc>
-      </w:tr>
-      <w:tr>
-        <w:tc>
-          <w:tcPr>
-            <w:tcW w:type="dxa" w:w="3000"/>
-            <w:tcBorders>
-              <w:top w:val="single" w:color="AAAAAA" w:sz="1"/>
-              <w:left w:val="single" w:color="AAAAAA" w:sz="1"/>
-              <w:bottom w:val="single" w:color="AAAAAA" w:sz="1"/>
-              <w:right w:val="single" w:color="AAAAAA" w:sz="1"/>
-            </w:tcBorders>
-            <w:shd w:fill="F2F2F2" w:val="clear"/>
-            <w:tcMar>
-              <w:top w:type="dxa" w:w="60"/>
-              <w:left w:type="dxa" w:w="100"/>
-              <w:bottom w:type="dxa" w:w="60"/>
-              <w:right w:type="dxa" w:w="100"/>
-            </w:tcMar>
-          </w:tcPr>
-          <w:p>
-            <w:r>
-              <w:rPr>
-                <w:rFonts w:ascii="맑은 고딕" w:cs="맑은 고딕" w:eastAsia="맑은 고딕" w:hAnsi="맑은 고딕"/>
-                <w:sz w:val="18"/>
-                <w:szCs w:val="18"/>
-              </w:rPr>
-              <w:t xml:space="preserve">DAICHI(KIS), BEKAERT(중국산) ORISTAR 직접 공략 중</w:t>
-            </w:r>
-          </w:p>
-        </w:tc>
-        <w:tc>
-          <w:tcPr>
-            <w:tcW w:type="dxa" w:w="6360"/>
-            <w:tcBorders>
-              <w:top w:val="single" w:color="AAAAAA" w:sz="1"/>
-              <w:left w:val="single" w:color="AAAAAA" w:sz="1"/>
-              <w:bottom w:val="single" w:color="AAAAAA" w:sz="1"/>
-              <w:right w:val="single" w:color="AAAAAA" w:sz="1"/>
-            </w:tcBorders>
-            <w:tcMar>
-              <w:top w:type="dxa" w:w="60"/>
-              <w:left w:type="dxa" w:w="100"/>
-              <w:bottom w:type="dxa" w:w="60"/>
-              <w:right w:type="dxa" w:w="100"/>
-            </w:tcMar>
-          </w:tcPr>
-          <w:p>
-            <w:r>
-              <w:rPr>
-                <w:rFonts w:ascii="맑은 고딕" w:cs="맑은 고딕" w:eastAsia="맑은 고딕" w:hAnsi="맑은 고딕"/>
-                <w:sz w:val="18"/>
-                <w:szCs w:val="18"/>
-              </w:rPr>
-              <w:t xml:space="preserve">주요 거래처 정기 공유 체계 수립으로 관계 강화</w:t>
-            </w:r>
-          </w:p>
-        </w:tc>
-      </w:tr>
-    </w:tbl>
+    <w:p>
+      <w:pPr>
+        <w:spacing w:after="0" w:before="0"/>
+      </w:pPr>
+      <w:r>
+        <w:rPr>
+          <w:rFonts w:ascii="맑은 고딕" w:cs="맑은 고딕" w:eastAsia="맑은 고딕" w:hAnsi="맑은 고딕"/>
+          <w:b w:val="false"/>
+          <w:bCs w:val="false"/>
+          <w:sz w:val="19"/>
+          <w:szCs w:val="19"/>
+        </w:rPr>
+        <w:t xml:space="preserve">ORISTAR 내 가장 시급한 인사 리스크는 15년 근속의 구매 담당 MR. VU TRI TOAN의 퇴사 예정으로, 후임 담당자 조기 파악 및 관계 구축이 필요하다. 또한 WIRE 매출이 ORISTAR 전체의 5% 미만에 불과해 ORISTAR 내부 우선순위가 낮은 구조적 문제가 있으며, DSR이 먼저 거래처 개발을 지원하며 동기를 부여하는 접근이 필요하다. 한편 DAICHI(KIS/고려제강 대리점)와 BEKAERT(중국산)이 ORISTAR를 직접 공략 중으로 주요 거래처 정보 정기 공유를 통한 관계 강화가 요구된다.</w:t>
+      </w:r>
+    </w:p>
     <w:sectPr>
       <w:footerReference w:type="default" r:id="rId7"/>
       <w:pgSz w:w="11906" w:h="16838" w:orient="portrait"/>

</xml_diff>

<commit_message>
Fix writing style: ~하다/된다 -> ~함/됨 throughout summary
</commit_message>
<xml_diff>
--- a/2026-06-14_Oristar_Vietnam_Sales_Analysis_SUMMARY.docx
+++ b/2026-06-14_Oristar_Vietnam_Sales_Analysis_SUMMARY.docx
@@ -765,7 +765,7 @@
           <w:sz w:val="19"/>
           <w:szCs w:val="19"/>
         </w:rPr>
-        <w:t xml:space="preserve">2024-2025년 연속 성장에 이어 2026년은 PIANO WIRE의 급격한 수요 확대로 연간 최고치 달성이 유력함. 특히 YANGMIN이 기존 OT WIRE 중심 거래 구조에서 벗어나 대경 PIANO WIRE(3.00-3.50MM)를 대량 발주하기 시작한 것이 핵심 변수로, 이 흐름이 하반기에도 지속되는지 여부가 2026년 전체 실적을 좌우할 것으로 판단됨.</w:t>
+        <w:t xml:space="preserve">2024-2025년 연속 성장에 이어 2026년은 PIANO WIRE의 급격한 수요 확대로 연간 최고치 달성이 유력한 상황임. 특히 YANGMIN이 기존 OT WIRE 중심 거래 구조에서 벗어나 대경 PIANO WIRE(3.00-3.50MM)를 대량 발주하기 시작한 것이 핵심 변수로, 이 흐름이 하반기에도 지속되는지 여부가 2026년 전체 실적을 좌우할 것으로 판단됨.</w:t>
       </w:r>
     </w:p>
     <w:p>
@@ -1432,6 +1432,21 @@
     </w:p>
     <w:p>
       <w:pPr>
+        <w:spacing w:after="0" w:before="0"/>
+      </w:pPr>
+      <w:r>
+        <w:rPr>
+          <w:rFonts w:ascii="맑은 고딕" w:cs="맑은 고딕" w:eastAsia="맑은 고딕" w:hAnsi="맑은 고딕"/>
+          <w:b w:val="false"/>
+          <w:bCs w:val="false"/>
+          <w:sz w:val="19"/>
+          <w:szCs w:val="19"/>
+        </w:rPr>
+        <w:t xml:space="preserve"/>
+      </w:r>
+    </w:p>
+    <w:p>
+      <w:pPr>
         <w:pBdr>
           <w:bottom w:val="single" w:color="333333" w:sz="2"/>
         </w:pBdr>
@@ -2005,7 +2020,7 @@
           <w:sz w:val="19"/>
           <w:szCs w:val="19"/>
         </w:rPr>
-        <w:t xml:space="preserve">LONGTECH는 규모가 크나 중국산 전환이 이미 진행된 상태로 중장기 접근이 현실적임. AIKO SPRING과 EAST STAR는 이번 출장에서 신규 접촉한 업체로 샘플 및 4M 승인 지원을 통한 중장기 진입 전략이 필요함.</w:t>
+        <w:t xml:space="preserve">LONGTECH는 규모가 크나 중국산 전환이 이미 진행된 상태로 중장기 접근이 현실적임. AIKO SPRING과 EAST STAR는 이번 출장에서 신규 접촉한 업체로, 샘플 및 4M 승인 지원을 통한 중장기 진입 전략 수립이 필요함.</w:t>
       </w:r>
     </w:p>
     <w:p>
@@ -2038,7 +2053,7 @@
           <w:sz w:val="19"/>
           <w:szCs w:val="19"/>
         </w:rPr>
-        <w:t xml:space="preserve">ORISTAR 내 가장 시급한 인사 리스크는 15년 근속의 구매 담당 MR. VU TRI TOAN의 퇴사 예정으로, 후임 담당자 조기 파악 및 관계 구축이 필요하다. 또한 WIRE 매출이 ORISTAR 전체의 5% 미만에 불과해 ORISTAR 내부 우선순위가 낮은 구조적 문제가 있으며, DSR이 먼저 거래처 개발을 지원하며 동기를 부여하는 접근이 필요하다. 한편 DAICHI(KIS/고려제강 대리점)와 BEKAERT(중국산)이 ORISTAR를 직접 공략 중으로 주요 거래처 정보 정기 공유를 통한 관계 강화가 요구된다.</w:t>
+        <w:t xml:space="preserve">ORISTAR 내 가장 시급한 인사 리스크는 15년 근속의 구매 담당 MR. VU TRI TOAN의 퇴사 예정으로, 후임 담당자 조기 파악 및 관계 구축이 필요함. 또한 WIRE 매출이 ORISTAR 전체의 5% 미만에 불과해 ORISTAR 내부 우선순위가 낮은 구조적 문제가 있으며, DSR이 먼저 거래처 개발을 지원하며 동기를 부여하는 접근이 필요함. 한편 DAICHI(KIS/고려제강 대리점)와 BEKAERT(중국산)이 ORISTAR를 직접 공략 중으로 주요 거래처 정보 정기 공유를 통한 관계 강화가 요구됨.</w:t>
       </w:r>
     </w:p>
     <w:sectPr>

</xml_diff>